<commit_message>
figure revision according to ccr.
</commit_message>
<xml_diff>
--- a/Manuscript/manuscript_word.docx
+++ b/Manuscript/manuscript_word.docx
@@ -1775,7 +1775,17 @@
         <w:t xml:space="preserve">2. </w:t>
       </w:r>
       <w:r>
-        <w:t>B). The majority of entries fall under the “NA” category (n = 182), indicating a substantial portion of missing data for this variable. Among the recorded materials, plant fiber (n = 157) and wood (n = 63) are the most frequently documented, suggesting their prevalent use or better preservation in the archaeological record. In contrast, materials such as clay (n = 39), metal (n = 18), leather (n = 16), stone (n = 7), composite (n = 4), and bone (n = 2) appear far less frequently. This uneven distribution could be a mixed result shaped by raw material accessibility and processing difficulty, potential cultural preferences in material use, as well as observational biases. Moreover, the prominence of clothing and basket-making technologies, alongside the frequent use of plant fiber and wood—materials prone to poor preservation—suggests that significant aspects of past material culture are underrepresented in the archaeological record. This highlights the importance of integrating ethnographic data to reconstruct technological practices that are archaeologically invisible, offering a more comprehensive understanding of past human behavior (</w:t>
+        <w:t>B). The majority of entries fall under the “NA” category (n = 182), indicating a substantial portion of missing data for this variable. Among the recorded materials, plant fiber (n = 157) and wood (n = 63) are the most frequently documented, suggesting their prevalent use or better preservation in the archaeological record. In contrast, materials such as clay (n = 39), metal (n = 1</w:t>
+      </w:r>
+      <w:r>
+        <w:rPr>
+          <w:rFonts w:hint="eastAsia"/>
+          <w:lang w:eastAsia="zh-CN"/>
+        </w:rPr>
+        <w:t>7</w:t>
+      </w:r>
+      <w:r>
+        <w:t>), leather (n = 16), stone (n = 7), composite (n = 4), and bone (n = 2) appear far less frequently. This uneven distribution could be a mixed result shaped by raw material accessibility and processing difficulty, potential cultural preferences in material use, as well as observational biases. Moreover, the prominence of clothing and basket-making technologies, alongside the frequent use of plant fiber and wood—materials prone to poor preservation—suggests that significant aspects of past material culture are underrepresented in the archaeological record. This highlights the importance of integrating ethnographic data to reconstruct technological practices that are archaeologically invisible, offering a more comprehensive understanding of past human behavior (</w:t>
       </w:r>
       <w:hyperlink w:anchor="ref-desmond2022">
         <w:r>
@@ -1821,22 +1831,31 @@
         </w:rPr>
         <w:lastRenderedPageBreak/>
         <w:drawing>
-          <wp:inline distT="0" distB="0" distL="0" distR="0" wp14:anchorId="52F78C5F" wp14:editId="7DD10CF2">
-            <wp:extent cx="5334000" cy="2424498"/>
+          <wp:inline distT="0" distB="0" distL="0" distR="0" wp14:anchorId="2469BCD0" wp14:editId="21C68F20">
+            <wp:extent cx="5943600" cy="2701925"/>
             <wp:effectExtent l="0" t="0" r="0" b="0"/>
-            <wp:docPr id="32" name="Picture" descr="The frequency of toolmaking skills (A) as well as main raw materials involved (B) as documented in ethnographic texts."/>
-            <wp:cNvGraphicFramePr/>
+            <wp:docPr id="1254521632" name="Picture 1"/>
+            <wp:cNvGraphicFramePr>
+              <a:graphicFrameLocks xmlns:a="http://schemas.openxmlformats.org/drawingml/2006/main" noChangeAspect="1"/>
+            </wp:cNvGraphicFramePr>
             <a:graphic xmlns:a="http://schemas.openxmlformats.org/drawingml/2006/main">
               <a:graphicData uri="http://schemas.openxmlformats.org/drawingml/2006/picture">
                 <pic:pic xmlns:pic="http://schemas.openxmlformats.org/drawingml/2006/picture">
                   <pic:nvPicPr>
-                    <pic:cNvPr id="33" name="Picture" descr="../Figure/what.png"/>
+                    <pic:cNvPr id="0" name="Picture 1"/>
                     <pic:cNvPicPr>
                       <a:picLocks noChangeAspect="1" noChangeArrowheads="1"/>
                     </pic:cNvPicPr>
                   </pic:nvPicPr>
                   <pic:blipFill>
-                    <a:blip r:embed="rId10"/>
+                    <a:blip r:embed="rId10" cstate="print">
+                      <a:extLst>
+                        <a:ext uri="{28A0092B-C50C-407E-A947-70E740481C1C}">
+                          <a14:useLocalDpi xmlns:a14="http://schemas.microsoft.com/office/drawing/2010/main" val="0"/>
+                        </a:ext>
+                      </a:extLst>
+                    </a:blip>
+                    <a:srcRect/>
                     <a:stretch>
                       <a:fillRect/>
                     </a:stretch>
@@ -1844,16 +1863,14 @@
                   <pic:spPr bwMode="auto">
                     <a:xfrm>
                       <a:off x="0" y="0"/>
-                      <a:ext cx="5334000" cy="2424498"/>
+                      <a:ext cx="5943600" cy="2701925"/>
                     </a:xfrm>
                     <a:prstGeom prst="rect">
                       <a:avLst/>
                     </a:prstGeom>
                     <a:noFill/>
-                    <a:ln w="9525">
+                    <a:ln>
                       <a:noFill/>
-                      <a:headEnd/>
-                      <a:tailEnd/>
                     </a:ln>
                   </pic:spPr>
                 </pic:pic>
@@ -1970,15 +1987,18 @@
           <w:rPr>
             <w:rStyle w:val="Hyperlink"/>
           </w:rPr>
-          <w:t>Lew-Levy &amp; Amir, 2024</w:t>
-        </w:r>
-      </w:hyperlink>
-      <w:r>
-        <w:t xml:space="preserve">). It is possible that peer play activities or enculturation through </w:t>
-      </w:r>
-      <w:r>
-        <w:lastRenderedPageBreak/>
-        <w:t>interactions with older siblings falling into a similar age range are not that vital in the domain of toolmaking skills as compared with knowledge domains such as social and gender norms (</w:t>
+          <w:t>Lew-</w:t>
+        </w:r>
+        <w:r>
+          <w:rPr>
+            <w:rStyle w:val="Hyperlink"/>
+          </w:rPr>
+          <w:lastRenderedPageBreak/>
+          <w:t>Levy &amp; Amir, 2024</w:t>
+        </w:r>
+      </w:hyperlink>
+      <w:r>
+        <w:t>). It is possible that peer play activities or enculturation through interactions with older siblings falling into a similar age range are not that vital in the domain of toolmaking skills as compared with knowledge domains such as social and gender norms (</w:t>
       </w:r>
       <w:hyperlink w:anchor="ref-lew-levy2018">
         <w:r>
@@ -2122,22 +2142,31 @@
           <w:noProof/>
         </w:rPr>
         <w:drawing>
-          <wp:inline distT="0" distB="0" distL="0" distR="0" wp14:anchorId="57EAAA75" wp14:editId="609A1ECC">
-            <wp:extent cx="5334000" cy="2424498"/>
+          <wp:inline distT="0" distB="0" distL="0" distR="0" wp14:anchorId="25E0360C" wp14:editId="23EBA285">
+            <wp:extent cx="5943600" cy="2701925"/>
             <wp:effectExtent l="0" t="0" r="0" b="0"/>
-            <wp:docPr id="36" name="Picture" descr="Transmission modes of toolmaking skills documented in ethnographic texts."/>
-            <wp:cNvGraphicFramePr/>
+            <wp:docPr id="1991347353" name="Picture 2"/>
+            <wp:cNvGraphicFramePr>
+              <a:graphicFrameLocks xmlns:a="http://schemas.openxmlformats.org/drawingml/2006/main" noChangeAspect="1"/>
+            </wp:cNvGraphicFramePr>
             <a:graphic xmlns:a="http://schemas.openxmlformats.org/drawingml/2006/main">
               <a:graphicData uri="http://schemas.openxmlformats.org/drawingml/2006/picture">
                 <pic:pic xmlns:pic="http://schemas.openxmlformats.org/drawingml/2006/picture">
                   <pic:nvPicPr>
-                    <pic:cNvPr id="37" name="Picture" descr="../Figure/who.png"/>
+                    <pic:cNvPr id="0" name="Picture 3"/>
                     <pic:cNvPicPr>
                       <a:picLocks noChangeAspect="1" noChangeArrowheads="1"/>
                     </pic:cNvPicPr>
                   </pic:nvPicPr>
                   <pic:blipFill>
-                    <a:blip r:embed="rId11"/>
+                    <a:blip r:embed="rId11" cstate="print">
+                      <a:extLst>
+                        <a:ext uri="{28A0092B-C50C-407E-A947-70E740481C1C}">
+                          <a14:useLocalDpi xmlns:a14="http://schemas.microsoft.com/office/drawing/2010/main" val="0"/>
+                        </a:ext>
+                      </a:extLst>
+                    </a:blip>
+                    <a:srcRect/>
                     <a:stretch>
                       <a:fillRect/>
                     </a:stretch>
@@ -2145,16 +2174,14 @@
                   <pic:spPr bwMode="auto">
                     <a:xfrm>
                       <a:off x="0" y="0"/>
-                      <a:ext cx="5334000" cy="2424498"/>
+                      <a:ext cx="5943600" cy="2701925"/>
                     </a:xfrm>
                     <a:prstGeom prst="rect">
                       <a:avLst/>
                     </a:prstGeom>
                     <a:noFill/>
-                    <a:ln w="9525">
+                    <a:ln>
                       <a:noFill/>
-                      <a:headEnd/>
-                      <a:tailEnd/>
                     </a:ln>
                   </pic:spPr>
                 </pic:pic>
@@ -2231,11 +2258,8 @@
         <w:pStyle w:val="BodyText"/>
       </w:pPr>
       <w:r>
-        <w:t xml:space="preserve">This pattern suggests that the physical setting of skill transmission is potentially tied to the nature of the craft. Activities involving fine, detailed work or those requiring specialized tools and materials are more often learned indoors, whereas tasks demanding larger spaces or environmental resources, such as boat or trap making, are typically learned </w:t>
-      </w:r>
-      <w:r>
         <w:lastRenderedPageBreak/>
-        <w:t>outdoors. However, it is also possible that this distribution might simply reflect observers’ biases given the size of unreported cases.</w:t>
+        <w:t>This pattern suggests that the physical setting of skill transmission is potentially tied to the nature of the craft. Activities involving fine, detailed work or those requiring specialized tools and materials are more often learned indoors, whereas tasks demanding larger spaces or environmental resources, such as boat or trap making, are typically learned outdoors. However, it is also possible that this distribution might simply reflect observers’ biases given the size of unreported cases.</w:t>
       </w:r>
     </w:p>
     <w:p>
@@ -2247,22 +2271,31 @@
           <w:noProof/>
         </w:rPr>
         <w:drawing>
-          <wp:inline distT="0" distB="0" distL="0" distR="0" wp14:anchorId="139C5F37" wp14:editId="70FD720E">
-            <wp:extent cx="5334000" cy="2424498"/>
+          <wp:inline distT="0" distB="0" distL="0" distR="0" wp14:anchorId="570103C0" wp14:editId="530FE5B1">
+            <wp:extent cx="5943600" cy="2701925"/>
             <wp:effectExtent l="0" t="0" r="0" b="0"/>
-            <wp:docPr id="40" name="Picture" descr="Location of toolmaking skill acquisition documented in ethnographic texts. A displays the frequency of learning locations. B is a treemap demonstrating the connections between craft categories and location locations."/>
-            <wp:cNvGraphicFramePr/>
+            <wp:docPr id="798322432" name="Picture 3"/>
+            <wp:cNvGraphicFramePr>
+              <a:graphicFrameLocks xmlns:a="http://schemas.openxmlformats.org/drawingml/2006/main" noChangeAspect="1"/>
+            </wp:cNvGraphicFramePr>
             <a:graphic xmlns:a="http://schemas.openxmlformats.org/drawingml/2006/main">
               <a:graphicData uri="http://schemas.openxmlformats.org/drawingml/2006/picture">
                 <pic:pic xmlns:pic="http://schemas.openxmlformats.org/drawingml/2006/picture">
                   <pic:nvPicPr>
-                    <pic:cNvPr id="41" name="Picture" descr="../Figure/where.png"/>
+                    <pic:cNvPr id="0" name="Picture 5"/>
                     <pic:cNvPicPr>
                       <a:picLocks noChangeAspect="1" noChangeArrowheads="1"/>
                     </pic:cNvPicPr>
                   </pic:nvPicPr>
                   <pic:blipFill>
-                    <a:blip r:embed="rId12"/>
+                    <a:blip r:embed="rId12" cstate="print">
+                      <a:extLst>
+                        <a:ext uri="{28A0092B-C50C-407E-A947-70E740481C1C}">
+                          <a14:useLocalDpi xmlns:a14="http://schemas.microsoft.com/office/drawing/2010/main" val="0"/>
+                        </a:ext>
+                      </a:extLst>
+                    </a:blip>
+                    <a:srcRect/>
                     <a:stretch>
                       <a:fillRect/>
                     </a:stretch>
@@ -2270,16 +2303,14 @@
                   <pic:spPr bwMode="auto">
                     <a:xfrm>
                       <a:off x="0" y="0"/>
-                      <a:ext cx="5334000" cy="2424498"/>
+                      <a:ext cx="5943600" cy="2701925"/>
                     </a:xfrm>
                     <a:prstGeom prst="rect">
                       <a:avLst/>
                     </a:prstGeom>
                     <a:noFill/>
-                    <a:ln w="9525">
+                    <a:ln>
                       <a:noFill/>
-                      <a:headEnd/>
-                      <a:tailEnd/>
                     </a:ln>
                   </pic:spPr>
                 </pic:pic>
@@ -2389,7 +2420,11 @@
         </w:r>
       </w:hyperlink>
       <w:r>
-        <w:t>). Again, the substantial number of unspecified age cases (NA) indicates potential limitations in the ethnographic documentation of age-specific learning processes.</w:t>
+        <w:t xml:space="preserve">). Again, the </w:t>
+      </w:r>
+      <w:r>
+        <w:lastRenderedPageBreak/>
+        <w:t>substantial number of unspecified age cases (NA) indicates potential limitations in the ethnographic documentation of age-specific learning processes.</w:t>
       </w:r>
     </w:p>
     <w:p>
@@ -2400,24 +2435,32 @@
         <w:rPr>
           <w:noProof/>
         </w:rPr>
-        <w:lastRenderedPageBreak/>
         <w:drawing>
-          <wp:inline distT="0" distB="0" distL="0" distR="0" wp14:anchorId="460D8250" wp14:editId="0F4D2164">
-            <wp:extent cx="5334000" cy="2424498"/>
+          <wp:inline distT="0" distB="0" distL="0" distR="0" wp14:anchorId="01B8CF48" wp14:editId="00518960">
+            <wp:extent cx="5943600" cy="2701925"/>
             <wp:effectExtent l="0" t="0" r="0" b="0"/>
-            <wp:docPr id="44" name="Picture" descr="Developmental contexts of toolmaking skill acquisition documented in ethnographic texts."/>
-            <wp:cNvGraphicFramePr/>
+            <wp:docPr id="281514270" name="Picture 4"/>
+            <wp:cNvGraphicFramePr>
+              <a:graphicFrameLocks xmlns:a="http://schemas.openxmlformats.org/drawingml/2006/main" noChangeAspect="1"/>
+            </wp:cNvGraphicFramePr>
             <a:graphic xmlns:a="http://schemas.openxmlformats.org/drawingml/2006/main">
               <a:graphicData uri="http://schemas.openxmlformats.org/drawingml/2006/picture">
                 <pic:pic xmlns:pic="http://schemas.openxmlformats.org/drawingml/2006/picture">
                   <pic:nvPicPr>
-                    <pic:cNvPr id="45" name="Picture" descr="../Figure/when.png"/>
+                    <pic:cNvPr id="0" name="Picture 7"/>
                     <pic:cNvPicPr>
                       <a:picLocks noChangeAspect="1" noChangeArrowheads="1"/>
                     </pic:cNvPicPr>
                   </pic:nvPicPr>
                   <pic:blipFill>
-                    <a:blip r:embed="rId13"/>
+                    <a:blip r:embed="rId13" cstate="print">
+                      <a:extLst>
+                        <a:ext uri="{28A0092B-C50C-407E-A947-70E740481C1C}">
+                          <a14:useLocalDpi xmlns:a14="http://schemas.microsoft.com/office/drawing/2010/main" val="0"/>
+                        </a:ext>
+                      </a:extLst>
+                    </a:blip>
+                    <a:srcRect/>
                     <a:stretch>
                       <a:fillRect/>
                     </a:stretch>
@@ -2425,16 +2468,14 @@
                   <pic:spPr bwMode="auto">
                     <a:xfrm>
                       <a:off x="0" y="0"/>
-                      <a:ext cx="5334000" cy="2424498"/>
+                      <a:ext cx="5943600" cy="2701925"/>
                     </a:xfrm>
                     <a:prstGeom prst="rect">
                       <a:avLst/>
                     </a:prstGeom>
                     <a:noFill/>
-                    <a:ln w="9525">
+                    <a:ln>
                       <a:noFill/>
-                      <a:headEnd/>
-                      <a:tailEnd/>
                     </a:ln>
                   </pic:spPr>
                 </pic:pic>
@@ -2521,22 +2562,31 @@
         </w:rPr>
         <w:lastRenderedPageBreak/>
         <w:drawing>
-          <wp:inline distT="0" distB="0" distL="0" distR="0" wp14:anchorId="1D06A324" wp14:editId="22AD5D31">
-            <wp:extent cx="5334000" cy="2424498"/>
+          <wp:inline distT="0" distB="0" distL="0" distR="0" wp14:anchorId="3903985B" wp14:editId="0243DBBD">
+            <wp:extent cx="5943600" cy="2701925"/>
             <wp:effectExtent l="0" t="0" r="0" b="0"/>
-            <wp:docPr id="48" name="Picture" descr="Learning processes of toolmaking skill acquisition documented in ethnographic texts."/>
-            <wp:cNvGraphicFramePr/>
+            <wp:docPr id="996723407" name="Picture 5"/>
+            <wp:cNvGraphicFramePr>
+              <a:graphicFrameLocks xmlns:a="http://schemas.openxmlformats.org/drawingml/2006/main" noChangeAspect="1"/>
+            </wp:cNvGraphicFramePr>
             <a:graphic xmlns:a="http://schemas.openxmlformats.org/drawingml/2006/main">
               <a:graphicData uri="http://schemas.openxmlformats.org/drawingml/2006/picture">
                 <pic:pic xmlns:pic="http://schemas.openxmlformats.org/drawingml/2006/picture">
                   <pic:nvPicPr>
-                    <pic:cNvPr id="49" name="Picture" descr="../Figure/how.png"/>
+                    <pic:cNvPr id="0" name="Picture 9"/>
                     <pic:cNvPicPr>
                       <a:picLocks noChangeAspect="1" noChangeArrowheads="1"/>
                     </pic:cNvPicPr>
                   </pic:nvPicPr>
                   <pic:blipFill>
-                    <a:blip r:embed="rId14"/>
+                    <a:blip r:embed="rId14" cstate="print">
+                      <a:extLst>
+                        <a:ext uri="{28A0092B-C50C-407E-A947-70E740481C1C}">
+                          <a14:useLocalDpi xmlns:a14="http://schemas.microsoft.com/office/drawing/2010/main" val="0"/>
+                        </a:ext>
+                      </a:extLst>
+                    </a:blip>
+                    <a:srcRect/>
                     <a:stretch>
                       <a:fillRect/>
                     </a:stretch>
@@ -2544,16 +2594,14 @@
                   <pic:spPr bwMode="auto">
                     <a:xfrm>
                       <a:off x="0" y="0"/>
-                      <a:ext cx="5334000" cy="2424498"/>
+                      <a:ext cx="5943600" cy="2701925"/>
                     </a:xfrm>
                     <a:prstGeom prst="rect">
                       <a:avLst/>
                     </a:prstGeom>
                     <a:noFill/>
-                    <a:ln w="9525">
+                    <a:ln>
                       <a:noFill/>
-                      <a:headEnd/>
-                      <a:tailEnd/>
                     </a:ln>
                   </pic:spPr>
                 </pic:pic>
@@ -2751,11 +2799,11 @@
         </w:r>
       </w:hyperlink>
       <w:r>
-        <w:t xml:space="preserve">) may be more important in other cultural domains like the transmission of beliefs or ascetic preferences, while toolmaking usually is a long-term </w:t>
+        <w:t xml:space="preserve">) may be more important in other cultural domains like </w:t>
       </w:r>
       <w:r>
         <w:lastRenderedPageBreak/>
-        <w:t>learning process that featuring more intimate social relationship. This pattern, combined with the argument made by Henrich (</w:t>
+        <w:t>the transmission of beliefs or ascetic preferences, while toolmaking usually is a long-term learning process that featuring more intimate social relationship. This pattern, combined with the argument made by Henrich (</w:t>
       </w:r>
       <w:hyperlink w:anchor="ref-henrich2020">
         <w:r>
@@ -2778,22 +2826,31 @@
           <w:noProof/>
         </w:rPr>
         <w:drawing>
-          <wp:inline distT="0" distB="0" distL="0" distR="0" wp14:anchorId="6FDCF4B8" wp14:editId="0AA52178">
-            <wp:extent cx="5334000" cy="2424498"/>
+          <wp:inline distT="0" distB="0" distL="0" distR="0" wp14:anchorId="3C3F4BDD" wp14:editId="15AF545B">
+            <wp:extent cx="5943600" cy="2701925"/>
             <wp:effectExtent l="0" t="0" r="0" b="0"/>
-            <wp:docPr id="52" name="Picture" descr="Transmission biases of toolmaking skill acquisition documented in ethnographic texts."/>
-            <wp:cNvGraphicFramePr/>
+            <wp:docPr id="244542569" name="Picture 6"/>
+            <wp:cNvGraphicFramePr>
+              <a:graphicFrameLocks xmlns:a="http://schemas.openxmlformats.org/drawingml/2006/main" noChangeAspect="1"/>
+            </wp:cNvGraphicFramePr>
             <a:graphic xmlns:a="http://schemas.openxmlformats.org/drawingml/2006/main">
               <a:graphicData uri="http://schemas.openxmlformats.org/drawingml/2006/picture">
                 <pic:pic xmlns:pic="http://schemas.openxmlformats.org/drawingml/2006/picture">
                   <pic:nvPicPr>
-                    <pic:cNvPr id="53" name="Picture" descr="../Figure/why.png"/>
+                    <pic:cNvPr id="0" name="Picture 11"/>
                     <pic:cNvPicPr>
                       <a:picLocks noChangeAspect="1" noChangeArrowheads="1"/>
                     </pic:cNvPicPr>
                   </pic:nvPicPr>
                   <pic:blipFill>
-                    <a:blip r:embed="rId15"/>
+                    <a:blip r:embed="rId15" cstate="print">
+                      <a:extLst>
+                        <a:ext uri="{28A0092B-C50C-407E-A947-70E740481C1C}">
+                          <a14:useLocalDpi xmlns:a14="http://schemas.microsoft.com/office/drawing/2010/main" val="0"/>
+                        </a:ext>
+                      </a:extLst>
+                    </a:blip>
+                    <a:srcRect/>
                     <a:stretch>
                       <a:fillRect/>
                     </a:stretch>
@@ -2801,16 +2858,14 @@
                   <pic:spPr bwMode="auto">
                     <a:xfrm>
                       <a:off x="0" y="0"/>
-                      <a:ext cx="5334000" cy="2424498"/>
+                      <a:ext cx="5943600" cy="2701925"/>
                     </a:xfrm>
                     <a:prstGeom prst="rect">
                       <a:avLst/>
                     </a:prstGeom>
                     <a:noFill/>
-                    <a:ln w="9525">
+                    <a:ln>
                       <a:noFill/>
-                      <a:headEnd/>
-                      <a:tailEnd/>
                     </a:ln>
                   </pic:spPr>
                 </pic:pic>
@@ -2893,22 +2948,31 @@
         </w:rPr>
         <w:lastRenderedPageBreak/>
         <w:drawing>
-          <wp:inline distT="0" distB="0" distL="0" distR="0" wp14:anchorId="7C01BE59" wp14:editId="69F060A7">
-            <wp:extent cx="5334000" cy="4849464"/>
+          <wp:inline distT="0" distB="0" distL="0" distR="0" wp14:anchorId="79B874B1" wp14:editId="72DFFB0F">
+            <wp:extent cx="5943600" cy="5403850"/>
             <wp:effectExtent l="0" t="0" r="0" b="0"/>
-            <wp:docPr id="57" name="Picture" descr="Missing data heatmap. Darker segments represent missing data, while lighter segments indicate available data."/>
-            <wp:cNvGraphicFramePr/>
+            <wp:docPr id="800418583" name="Picture 7"/>
+            <wp:cNvGraphicFramePr>
+              <a:graphicFrameLocks xmlns:a="http://schemas.openxmlformats.org/drawingml/2006/main" noChangeAspect="1"/>
+            </wp:cNvGraphicFramePr>
             <a:graphic xmlns:a="http://schemas.openxmlformats.org/drawingml/2006/main">
               <a:graphicData uri="http://schemas.openxmlformats.org/drawingml/2006/picture">
                 <pic:pic xmlns:pic="http://schemas.openxmlformats.org/drawingml/2006/picture">
                   <pic:nvPicPr>
-                    <pic:cNvPr id="58" name="Picture" descr="../Figure/missing.png"/>
+                    <pic:cNvPr id="0" name="Picture 13"/>
                     <pic:cNvPicPr>
                       <a:picLocks noChangeAspect="1" noChangeArrowheads="1"/>
                     </pic:cNvPicPr>
                   </pic:nvPicPr>
                   <pic:blipFill>
-                    <a:blip r:embed="rId16"/>
+                    <a:blip r:embed="rId16" cstate="print">
+                      <a:extLst>
+                        <a:ext uri="{28A0092B-C50C-407E-A947-70E740481C1C}">
+                          <a14:useLocalDpi xmlns:a14="http://schemas.microsoft.com/office/drawing/2010/main" val="0"/>
+                        </a:ext>
+                      </a:extLst>
+                    </a:blip>
+                    <a:srcRect/>
                     <a:stretch>
                       <a:fillRect/>
                     </a:stretch>
@@ -2916,16 +2980,14 @@
                   <pic:spPr bwMode="auto">
                     <a:xfrm>
                       <a:off x="0" y="0"/>
-                      <a:ext cx="5334000" cy="4849464"/>
+                      <a:ext cx="5943600" cy="5403850"/>
                     </a:xfrm>
                     <a:prstGeom prst="rect">
                       <a:avLst/>
                     </a:prstGeom>
                     <a:noFill/>
-                    <a:ln w="9525">
+                    <a:ln>
                       <a:noFill/>
-                      <a:headEnd/>
-                      <a:tailEnd/>
                     </a:ln>
                   </pic:spPr>
                 </pic:pic>
@@ -2987,22 +3049,31 @@
         </w:rPr>
         <w:lastRenderedPageBreak/>
         <w:drawing>
-          <wp:inline distT="0" distB="0" distL="0" distR="0" wp14:anchorId="45B8DE7A" wp14:editId="603BD92B">
-            <wp:extent cx="5334000" cy="4445000"/>
+          <wp:inline distT="0" distB="0" distL="0" distR="0" wp14:anchorId="3FAE7C4E" wp14:editId="41303EA4">
+            <wp:extent cx="5486400" cy="4572000"/>
             <wp:effectExtent l="0" t="0" r="0" b="0"/>
-            <wp:docPr id="60" name="Picture" descr="The UpSet plot displaying the co-occurrence of missing variables across observations. Ten variables with the highest percentage of missing values are visualized here."/>
-            <wp:cNvGraphicFramePr/>
+            <wp:docPr id="1791643221" name="Picture 8"/>
+            <wp:cNvGraphicFramePr>
+              <a:graphicFrameLocks xmlns:a="http://schemas.openxmlformats.org/drawingml/2006/main" noChangeAspect="1"/>
+            </wp:cNvGraphicFramePr>
             <a:graphic xmlns:a="http://schemas.openxmlformats.org/drawingml/2006/main">
               <a:graphicData uri="http://schemas.openxmlformats.org/drawingml/2006/picture">
                 <pic:pic xmlns:pic="http://schemas.openxmlformats.org/drawingml/2006/picture">
                   <pic:nvPicPr>
-                    <pic:cNvPr id="61" name="Picture" descr="../Figure/upset.png"/>
+                    <pic:cNvPr id="0" name="Picture 15"/>
                     <pic:cNvPicPr>
                       <a:picLocks noChangeAspect="1" noChangeArrowheads="1"/>
                     </pic:cNvPicPr>
                   </pic:nvPicPr>
                   <pic:blipFill>
-                    <a:blip r:embed="rId17"/>
+                    <a:blip r:embed="rId17" cstate="print">
+                      <a:extLst>
+                        <a:ext uri="{28A0092B-C50C-407E-A947-70E740481C1C}">
+                          <a14:useLocalDpi xmlns:a14="http://schemas.microsoft.com/office/drawing/2010/main" val="0"/>
+                        </a:ext>
+                      </a:extLst>
+                    </a:blip>
+                    <a:srcRect/>
                     <a:stretch>
                       <a:fillRect/>
                     </a:stretch>
@@ -3010,16 +3081,14 @@
                   <pic:spPr bwMode="auto">
                     <a:xfrm>
                       <a:off x="0" y="0"/>
-                      <a:ext cx="5334000" cy="4445000"/>
+                      <a:ext cx="5486400" cy="4572000"/>
                     </a:xfrm>
                     <a:prstGeom prst="rect">
                       <a:avLst/>
                     </a:prstGeom>
                     <a:noFill/>
-                    <a:ln w="9525">
+                    <a:ln>
                       <a:noFill/>
-                      <a:headEnd/>
-                      <a:tailEnd/>
                     </a:ln>
                   </pic:spPr>
                 </pic:pic>
@@ -3069,6 +3138,7 @@
       </w:pPr>
       <w:bookmarkStart w:id="15" w:name="Xab680f2e3b59ca14e9c530f8702ac52ec5a027a"/>
       <w:r>
+        <w:lastRenderedPageBreak/>
         <w:t>Protracted and staged learning trajectories</w:t>
       </w:r>
     </w:p>
@@ -3088,161 +3158,161 @@
         </w:r>
       </w:hyperlink>
       <w:r>
-        <w:t xml:space="preserve">) sharp observation on the significant role of protracted learning in the formation of human culture, as several HRAF ethnographic </w:t>
+        <w:t>) sharp observation on the significant role of protracted learning in the formation of human culture, as several HRAF ethnographic sources suggested that the learning of toolmaking skills spans multiple developmental periods in an almost structural manner, where each period feature different approaches to learning and varied task priorities. This applies to scenarios where people learn different domains of technology at different ages as well as people acquiring one toolmaking skill learn various technological components in a developmentally scaffolding manner. For instance, in Lancy’s (</w:t>
+      </w:r>
+      <w:hyperlink w:anchor="ref-lancy1996">
+        <w:r>
+          <w:rPr>
+            <w:rStyle w:val="Hyperlink"/>
+          </w:rPr>
+          <w:t>1996</w:t>
+        </w:r>
+      </w:hyperlink>
+      <w:r>
+        <w:t>: 161-162) classical ethnography on Kpelle children’s development, he noted that:</w:t>
+      </w:r>
+    </w:p>
+    <w:p>
+      <w:pPr>
+        <w:pStyle w:val="BlockText"/>
+      </w:pPr>
+      <w:r>
+        <w:t>“Children learn three types of tasks at three different ages. They begin performing such rudimentary tasks of rice farming as cooking, pounding rice, and chasing away birds at a very early age, usually before they are 9. More difficult tasks, such as hoeing on the farm, net weaving, and trap making, are begun around age 9 and mastered by age 13. Rarer, more complex skills such as cloth weaving, bag weaving, blacksmithing, and medicine making are acquired in the late teens and may be learned after marriage.”</w:t>
+      </w:r>
+    </w:p>
+    <w:p>
+      <w:pPr>
+        <w:pStyle w:val="FirstParagraph"/>
+      </w:pPr>
+      <w:r>
+        <w:t>Canoe making, a skill that demands not only the acquiring of technical know-how but also the development of proper physical strength to handle heavy logs, best illustrates the case of a long training period required for a single toolmaking skill. For example, Wilbert (</w:t>
+      </w:r>
+      <w:hyperlink w:anchor="ref-wilbert1976">
+        <w:r>
+          <w:rPr>
+            <w:rStyle w:val="Hyperlink"/>
+          </w:rPr>
+          <w:t>1976</w:t>
+        </w:r>
+      </w:hyperlink>
+      <w:r>
+        <w:t>: 360) commented that among the Warao hunter-gatherers’ skill training for men lasted until 25 years old and he further (</w:t>
+      </w:r>
+      <w:hyperlink w:anchor="ref-wilbert1977">
+        <w:r>
+          <w:rPr>
+            <w:rStyle w:val="Hyperlink"/>
+          </w:rPr>
+          <w:t>Wilbert, 1977</w:t>
+        </w:r>
+      </w:hyperlink>
+      <w:r>
+        <w:t>: 23) wrote that:</w:t>
+      </w:r>
+    </w:p>
+    <w:p>
+      <w:pPr>
+        <w:pStyle w:val="BlockText"/>
+      </w:pPr>
+      <w:r>
+        <w:t>“A boy is associated with canoe-making from early childhood on, initially as spectator, when he accompanies his father and the other men of the family to the forest and watches the production process. Later, as an adolescent, he picks up the axe himself and participates in the process according to his increasing dexterity. By the time he gets married, a young man commands the basic skills and may even have a small canoe to call his own.”</w:t>
+      </w:r>
+    </w:p>
+    <w:p>
+      <w:pPr>
+        <w:pStyle w:val="FirstParagraph"/>
+      </w:pPr>
+      <w:r>
+        <w:t>This pattern of prolonged and staged learning [c.f. Ifugao weaving; Lambrecht (</w:t>
+      </w:r>
+      <w:hyperlink w:anchor="ref-lambrecht1958">
+        <w:r>
+          <w:rPr>
+            <w:rStyle w:val="Hyperlink"/>
+          </w:rPr>
+          <w:t>1958</w:t>
+        </w:r>
+      </w:hyperlink>
+      <w:r>
+        <w:t>): 1] has also recurrently occurred in other ethnographic observations on other indigenous communities such as Chuuk/Truk (</w:t>
+      </w:r>
+      <w:hyperlink w:anchor="ref-goodenough1951">
+        <w:r>
+          <w:rPr>
+            <w:rStyle w:val="Hyperlink"/>
+          </w:rPr>
+          <w:t>Goodenough, 1951</w:t>
+        </w:r>
+      </w:hyperlink>
+      <w:r>
+        <w:t>: 53-55) in Micronesia, as well as Kapauku (</w:t>
+      </w:r>
+      <w:hyperlink w:anchor="ref-pospisil1958">
+        <w:r>
+          <w:rPr>
+            <w:rStyle w:val="Hyperlink"/>
+          </w:rPr>
+          <w:t>Pospisil, 1958</w:t>
+        </w:r>
+      </w:hyperlink>
+      <w:r>
+        <w:t>: 40-41) and Trobriands(</w:t>
+      </w:r>
+      <w:hyperlink w:anchor="ref-austen1945">
+        <w:r>
+          <w:rPr>
+            <w:rStyle w:val="Hyperlink"/>
+          </w:rPr>
+          <w:t>Austen, 1945</w:t>
+        </w:r>
+      </w:hyperlink>
+      <w:r>
+        <w:t xml:space="preserve">: 194-195; </w:t>
+      </w:r>
+      <w:hyperlink w:anchor="ref-scoditti1989">
+        <w:r>
+          <w:rPr>
+            <w:rStyle w:val="Hyperlink"/>
+          </w:rPr>
+          <w:t>Scoditti, 1989</w:t>
+        </w:r>
+      </w:hyperlink>
+      <w:r>
+        <w:t>: 56) in Melanesia (e.g., “15-20 years of apprenticeship”). However, given the inherent constraint that most ethnographic sources used here only provided a fragmented narrative on craft learning, it is still unclear how common is this mode of protracted learning in the manufacturing of smaller-sized tools that does not necessarily require a high level of physical strength as debated in several empirical studies regarding humans’ unique life history pattern (</w:t>
+      </w:r>
+      <w:hyperlink w:anchor="ref-bliegebird2002">
+        <w:r>
+          <w:rPr>
+            <w:rStyle w:val="Hyperlink"/>
+          </w:rPr>
+          <w:t>Bliege Bird &amp; Bird, 2002</w:t>
+        </w:r>
+      </w:hyperlink>
+      <w:r>
+        <w:t xml:space="preserve">; </w:t>
+      </w:r>
+      <w:hyperlink w:anchor="ref-jones2002">
+        <w:r>
+          <w:rPr>
+            <w:rStyle w:val="Hyperlink"/>
+          </w:rPr>
+          <w:t>Jones &amp; Marlowe, 2002</w:t>
+        </w:r>
+      </w:hyperlink>
+      <w:r>
+        <w:t>).</w:t>
+      </w:r>
+    </w:p>
+    <w:p>
+      <w:pPr>
+        <w:pStyle w:val="BodyText"/>
+      </w:pPr>
+      <w:r>
+        <w:t xml:space="preserve">During this extended period of learning, the rate at which toolmaking skills are acquired is not constant but instead varies over time, where the initiation ceremony stands out as a period featuring intensive and focused training along with other motor and social skills required for adulthood. This is a recurring pattern that has been widely documented across </w:t>
       </w:r>
       <w:r>
         <w:lastRenderedPageBreak/>
-        <w:t>sources suggested that the learning of toolmaking skills spans multiple developmental periods in an almost structural manner, where each period feature different approaches to learning and varied task priorities. This applies to scenarios where people learn different domains of technology at different ages as well as people acquiring one toolmaking skill learn various technological components in a developmentally scaffolding manner. For instance, in Lancy’s (</w:t>
-      </w:r>
-      <w:hyperlink w:anchor="ref-lancy1996">
-        <w:r>
-          <w:rPr>
-            <w:rStyle w:val="Hyperlink"/>
-          </w:rPr>
-          <w:t>1996</w:t>
-        </w:r>
-      </w:hyperlink>
-      <w:r>
-        <w:t>: 161-162) classical ethnography on Kpelle children’s development, he noted that:</w:t>
-      </w:r>
-    </w:p>
-    <w:p>
-      <w:pPr>
-        <w:pStyle w:val="BlockText"/>
-      </w:pPr>
-      <w:r>
-        <w:t>“Children learn three types of tasks at three different ages. They begin performing such rudimentary tasks of rice farming as cooking, pounding rice, and chasing away birds at a very early age, usually before they are 9. More difficult tasks, such as hoeing on the farm, net weaving, and trap making, are begun around age 9 and mastered by age 13. Rarer, more complex skills such as cloth weaving, bag weaving, blacksmithing, and medicine making are acquired in the late teens and may be learned after marriage.”</w:t>
-      </w:r>
-    </w:p>
-    <w:p>
-      <w:pPr>
-        <w:pStyle w:val="FirstParagraph"/>
-      </w:pPr>
-      <w:r>
-        <w:t>Canoe making, a skill that demands not only the acquiring of technical know-how but also the development of proper physical strength to handle heavy logs, best illustrates the case of a long training period required for a single toolmaking skill. For example, Wilbert (</w:t>
-      </w:r>
-      <w:hyperlink w:anchor="ref-wilbert1976">
-        <w:r>
-          <w:rPr>
-            <w:rStyle w:val="Hyperlink"/>
-          </w:rPr>
-          <w:t>1976</w:t>
-        </w:r>
-      </w:hyperlink>
-      <w:r>
-        <w:t>: 360) commented that among the Warao hunter-gatherers’ skill training for men lasted until 25 years old and he further (</w:t>
-      </w:r>
-      <w:hyperlink w:anchor="ref-wilbert1977">
-        <w:r>
-          <w:rPr>
-            <w:rStyle w:val="Hyperlink"/>
-          </w:rPr>
-          <w:t>Wilbert, 1977</w:t>
-        </w:r>
-      </w:hyperlink>
-      <w:r>
-        <w:t>: 23) wrote that:</w:t>
-      </w:r>
-    </w:p>
-    <w:p>
-      <w:pPr>
-        <w:pStyle w:val="BlockText"/>
-      </w:pPr>
-      <w:r>
-        <w:t>“A boy is associated with canoe-making from early childhood on, initially as spectator, when he accompanies his father and the other men of the family to the forest and watches the production process. Later, as an adolescent, he picks up the axe himself and participates in the process according to his increasing dexterity. By the time he gets married, a young man commands the basic skills and may even have a small canoe to call his own.”</w:t>
-      </w:r>
-    </w:p>
-    <w:p>
-      <w:pPr>
-        <w:pStyle w:val="FirstParagraph"/>
-      </w:pPr>
-      <w:r>
-        <w:t>This pattern of prolonged and staged learning [c.f. Ifugao weaving; Lambrecht (</w:t>
-      </w:r>
-      <w:hyperlink w:anchor="ref-lambrecht1958">
-        <w:r>
-          <w:rPr>
-            <w:rStyle w:val="Hyperlink"/>
-          </w:rPr>
-          <w:t>1958</w:t>
-        </w:r>
-      </w:hyperlink>
-      <w:r>
-        <w:t>): 1] has also recurrently occurred in other ethnographic observations on other indigenous communities such as Chuuk/Truk (</w:t>
-      </w:r>
-      <w:hyperlink w:anchor="ref-goodenough1951">
-        <w:r>
-          <w:rPr>
-            <w:rStyle w:val="Hyperlink"/>
-          </w:rPr>
-          <w:t>Goodenough, 1951</w:t>
-        </w:r>
-      </w:hyperlink>
-      <w:r>
-        <w:t>: 53-55) in Micronesia, as well as Kapauku (</w:t>
-      </w:r>
-      <w:hyperlink w:anchor="ref-pospisil1958">
-        <w:r>
-          <w:rPr>
-            <w:rStyle w:val="Hyperlink"/>
-          </w:rPr>
-          <w:t>Pospisil, 1958</w:t>
-        </w:r>
-      </w:hyperlink>
-      <w:r>
-        <w:t>: 40-41) and Trobriands(</w:t>
-      </w:r>
-      <w:hyperlink w:anchor="ref-austen1945">
-        <w:r>
-          <w:rPr>
-            <w:rStyle w:val="Hyperlink"/>
-          </w:rPr>
-          <w:t>Austen, 1945</w:t>
-        </w:r>
-      </w:hyperlink>
-      <w:r>
-        <w:t xml:space="preserve">: 194-195; </w:t>
-      </w:r>
-      <w:hyperlink w:anchor="ref-scoditti1989">
-        <w:r>
-          <w:rPr>
-            <w:rStyle w:val="Hyperlink"/>
-          </w:rPr>
-          <w:t>Scoditti, 1989</w:t>
-        </w:r>
-      </w:hyperlink>
-      <w:r>
-        <w:t>: 56) in Melanesia (e.g., “15-20 years of apprenticeship”). However, given the inherent constraint that most ethnographic sources used here only provided a fragmented narrative on craft learning, it is still unclear how common is this mode of protracted learning in the manufacturing of smaller-sized tools that does not necessarily require a high level of physical strength as debated in several empirical studies regarding humans’ unique life history pattern (</w:t>
-      </w:r>
-      <w:hyperlink w:anchor="ref-bliegebird2002">
-        <w:r>
-          <w:rPr>
-            <w:rStyle w:val="Hyperlink"/>
-          </w:rPr>
-          <w:t>Bliege Bird &amp; Bird, 2002</w:t>
-        </w:r>
-      </w:hyperlink>
-      <w:r>
-        <w:t xml:space="preserve">; </w:t>
-      </w:r>
-      <w:hyperlink w:anchor="ref-jones2002">
-        <w:r>
-          <w:rPr>
-            <w:rStyle w:val="Hyperlink"/>
-          </w:rPr>
-          <w:t>Jones &amp; Marlowe, 2002</w:t>
-        </w:r>
-      </w:hyperlink>
-      <w:r>
-        <w:t>).</w:t>
-      </w:r>
-    </w:p>
-    <w:p>
-      <w:pPr>
-        <w:pStyle w:val="BodyText"/>
-      </w:pPr>
-      <w:r>
-        <w:t>During this extended period of learning, the rate at which toolmaking skills are acquired is not constant but instead varies over time, where the initiation ceremony stands out as a period featuring intensive and focused training along with other motor and social skills required for adulthood. This is a recurring pattern that has been widely documented across multiple societies with diverse subsistence strategies, including Laguru (</w:t>
+        <w:t>multiple societies with diverse subsistence strategies, including Laguru (</w:t>
       </w:r>
       <w:hyperlink w:anchor="ref-hamdani2001">
         <w:r>
@@ -3304,14 +3374,7 @@
           <w:rPr>
             <w:rStyle w:val="Hyperlink"/>
           </w:rPr>
-          <w:t xml:space="preserve">Deacon, </w:t>
-        </w:r>
-        <w:r>
-          <w:rPr>
-            <w:rStyle w:val="Hyperlink"/>
-          </w:rPr>
-          <w:lastRenderedPageBreak/>
-          <w:t>1934</w:t>
+          <w:t>Deacon, 1934</w:t>
         </w:r>
       </w:hyperlink>
       <w:r>
@@ -3450,7 +3513,11 @@
         </w:r>
       </w:hyperlink>
       <w:r>
-        <w:t xml:space="preserve">) and more refined production traces located in domestic settings (e.g., </w:t>
+        <w:t xml:space="preserve">) and more refined production traces located in domestic settings </w:t>
+      </w:r>
+      <w:r>
+        <w:lastRenderedPageBreak/>
+        <w:t xml:space="preserve">(e.g., </w:t>
       </w:r>
       <w:hyperlink w:anchor="ref-knight2017">
         <w:r>
@@ -3461,11 +3528,7 @@
         </w:r>
       </w:hyperlink>
       <w:r>
-        <w:t xml:space="preserve">). Archaeologists must therefore consider the spatial organization of artifact assemblages to identify stages of skill acquisition and social learning. Overlooking </w:t>
-      </w:r>
-      <w:r>
-        <w:lastRenderedPageBreak/>
-        <w:t>this spatial variability could lead to incomplete interpretations of how technical knowledge was transmitted.</w:t>
+        <w:t>). Archaeologists must therefore consider the spatial organization of artifact assemblages to identify stages of skill acquisition and social learning. Overlooking this spatial variability could lead to incomplete interpretations of how technical knowledge was transmitted.</w:t>
       </w:r>
     </w:p>
     <w:p>
@@ -3628,7 +3691,11 @@
         <w:pStyle w:val="BlockText"/>
       </w:pPr>
       <w:r>
-        <w:t>“Education. Most education for living is received by the child in the course of performing routine activities. Such education is unformalized and undirected… Sometimes generalized instructions are furnished to children who, in carrying these out, often become confused. Thus we observed one fourteen year old girl make tea by putting the leaves into cold water. Nobody referred to the muddy quality of the beverage. The same kind of teaching was used with the ethnographer. Activities were illustrated but never explained in detail, the exposition of principles being ignored.”</w:t>
+        <w:t xml:space="preserve">“Education. Most education for living is received by the child in the course of performing routine activities. Such education is unformalized and undirected… Sometimes generalized instructions are furnished to children who, in carrying these out, often become confused. Thus we observed one fourteen year old girl make tea by putting the leaves into cold water. Nobody referred to the muddy quality of the beverage. The same kind of teaching was used with the </w:t>
+      </w:r>
+      <w:r>
+        <w:lastRenderedPageBreak/>
+        <w:t>ethnographer. Activities were illustrated but never explained in detail, the exposition of principles being ignored.”</w:t>
       </w:r>
     </w:p>
     <w:p>
@@ -3636,7 +3703,6 @@
         <w:pStyle w:val="FirstParagraph"/>
       </w:pPr>
       <w:r>
-        <w:lastRenderedPageBreak/>
         <w:t>These materials provide interesting insights into the longstanding debates about the nature and prevalence of teaching across cultures. If teaching is narrowly defined as the deliberate and structured transmission of explicit causal knowledge, which is essentially a Euro-centric definition, then its scarcity supports earlier claims by scholars like Mead (</w:t>
       </w:r>
       <w:hyperlink w:anchor="ref-mead1964">
@@ -3792,11 +3858,8 @@
         <w:pStyle w:val="BlockText"/>
       </w:pPr>
       <w:r>
-        <w:t xml:space="preserve">“Wollokollie’s youngest wife, Goma was an expert at Bii paa or bag weaving… Now she is teaching a teenaged girl of 16 how to do it. The girl has prepared the strands of palm leaf and brought them to Goma to help her get started. The two alternate at weaving the bag. The girl makes a mistake and Goma unravels what </w:t>
-      </w:r>
-      <w:r>
         <w:lastRenderedPageBreak/>
-        <w:t>she has done, does it correctly for awhile, then lets the girl take over again. Goma can’t explain how to do it, either to me or the girl. She can only show and guide our hands as I, too, make an attempt to learn.”</w:t>
+        <w:t>“Wollokollie’s youngest wife, Goma was an expert at Bii paa or bag weaving… Now she is teaching a teenaged girl of 16 how to do it. The girl has prepared the strands of palm leaf and brought them to Goma to help her get started. The two alternate at weaving the bag. The girl makes a mistake and Goma unravels what she has done, does it correctly for awhile, then lets the girl take over again. Goma can’t explain how to do it, either to me or the girl. She can only show and guide our hands as I, too, make an attempt to learn.”</w:t>
       </w:r>
     </w:p>
     <w:p>
@@ -3971,7 +4034,11 @@
         </w:r>
       </w:hyperlink>
       <w:r>
-        <w:t>: 125-126), etc. In terms of their implication for material culture research, these miniature models possess interesting properties of serving both as toys and tools (</w:t>
+        <w:t xml:space="preserve">: 125-126), etc. In terms of their implication for material culture research, these miniature </w:t>
+      </w:r>
+      <w:r>
+        <w:lastRenderedPageBreak/>
+        <w:t>models possess interesting properties of serving both as toys and tools (</w:t>
       </w:r>
       <w:hyperlink w:anchor="ref-lew-levy2022">
         <w:r>
@@ -4003,7 +4070,6 @@
       <w:bookmarkStart w:id="19" w:name="skill-training-for-community-integration"/>
       <w:bookmarkEnd w:id="18"/>
       <w:r>
-        <w:lastRenderedPageBreak/>
         <w:t>Skill training for community integration</w:t>
       </w:r>
     </w:p>
@@ -4142,11 +4208,11 @@
         </w:r>
       </w:hyperlink>
       <w:r>
-        <w:t xml:space="preserve">: 305-306), where certain individuals are believed to possess natural abilities that set them apart in craftsmanship. On the contrary, those who do not show success in their initial attempts often are not </w:t>
+        <w:t xml:space="preserve">: 305-306), where certain </w:t>
       </w:r>
       <w:r>
         <w:lastRenderedPageBreak/>
-        <w:t>encouraged to continue the efforts. For example, in his field observation among Nuba people in Sudan, British anthropologist Fred Nadel (</w:t>
+        <w:t>individuals are believed to possess natural abilities that set them apart in craftsmanship. On the contrary, those who do not show success in their initial attempts often are not encouraged to continue the efforts. For example, in his field observation among Nuba people in Sudan, British anthropologist Fred Nadel (</w:t>
       </w:r>
       <w:hyperlink w:anchor="ref-nadel1947">
         <w:r>
@@ -4256,6 +4322,7 @@
           <w:b/>
           <w:bCs/>
         </w:rPr>
+        <w:lastRenderedPageBreak/>
         <w:t>When</w:t>
       </w:r>
       <w:r>
@@ -4271,7 +4338,6 @@
           <w:b/>
           <w:bCs/>
         </w:rPr>
-        <w:lastRenderedPageBreak/>
         <w:t>How</w:t>
       </w:r>
       <w:r>
@@ -4340,11 +4406,11 @@
         <w:pStyle w:val="BodyText"/>
       </w:pPr>
       <w:r>
-        <w:t xml:space="preserve">However, the presence of substantial and systematically patterned missing data introduces important limitations, which is not uncommon for cross-cultural datasets. The analysis indicates that missing values are not randomly distributed but are likely missing at random (MAR) or missing not at random (MNAR). This non-random missingness necessitates caution in conducting further statistical analyses, as it may bias results if not properly addressed. Careful application of imputation methods and sensitivity analyses will be essential to ensure the robustness and reliability of future findings derived from this dataset. In the end, the author sees it as a stepping stone instead of a definitive text for a </w:t>
+        <w:t xml:space="preserve">However, the presence of substantial and systematically patterned missing data introduces important limitations, which is not uncommon for cross-cultural datasets. The analysis indicates that missing values are not randomly distributed but are likely missing at random (MAR) or missing not at random (MNAR). This non-random missingness necessitates caution in conducting further statistical analyses, as it may bias results if not properly </w:t>
       </w:r>
       <w:r>
         <w:lastRenderedPageBreak/>
-        <w:t>better understanding of the subject matter, which merely serves as a starting point for an open dialogue and a project to be collaborated with future researchers like the “Play Object Play” database (</w:t>
+        <w:t>addressed. Careful application of imputation methods and sensitivity analyses will be essential to ensure the robustness and reliability of future findings derived from this dataset. In the end, the author sees it as a stepping stone instead of a definitive text for a better understanding of the subject matter, which merely serves as a starting point for an open dialogue and a project to be collaborated with future researchers like the “Play Object Play” database (</w:t>
       </w:r>
       <w:hyperlink w:anchor="ref-riede2023">
         <w:r>
@@ -4749,6 +4815,7 @@
       <w:bookmarkStart w:id="36" w:name="ref-blackman1982"/>
       <w:bookmarkEnd w:id="35"/>
       <w:r>
+        <w:lastRenderedPageBreak/>
         <w:t xml:space="preserve">Blackman, M. B., &amp; Davidson, F. E. (1982). </w:t>
       </w:r>
       <w:r>
@@ -4769,7 +4836,6 @@
       <w:bookmarkStart w:id="37" w:name="ref-bliegebird2002"/>
       <w:bookmarkEnd w:id="36"/>
       <w:r>
-        <w:lastRenderedPageBreak/>
         <w:t xml:space="preserve">Bliege Bird, R., &amp; Bird, D. W. (2002). Constraints of knowing or constraints of growing? : Fishing and collecting by the children of mer. </w:t>
       </w:r>
       <w:r>
@@ -5200,6 +5266,7 @@
       <w:bookmarkStart w:id="50" w:name="ref-deacon1934"/>
       <w:bookmarkEnd w:id="49"/>
       <w:r>
+        <w:lastRenderedPageBreak/>
         <w:t xml:space="preserve">Deacon, A. B. (1934). </w:t>
       </w:r>
       <w:r>
@@ -5228,7 +5295,6 @@
       <w:bookmarkStart w:id="51" w:name="ref-derex2019"/>
       <w:bookmarkEnd w:id="50"/>
       <w:r>
-        <w:lastRenderedPageBreak/>
         <w:t xml:space="preserve">Derex, M., Bonnefon, J.-F., Boyd, R., &amp; Mesoudi, A. (2019). Causal understanding is not necessary for the improvement of culturally evolving technology. </w:t>
       </w:r>
       <w:r>
@@ -5599,6 +5665,7 @@
       <w:bookmarkStart w:id="63" w:name="ref-greenfield2003"/>
       <w:bookmarkEnd w:id="62"/>
       <w:r>
+        <w:lastRenderedPageBreak/>
         <w:t xml:space="preserve">Greenfield, P. M., Maynard, A. E., &amp; Childs, C. P. (2003). Historical change, cultural learning, and cognitive representation in Zinacantec Maya children. </w:t>
       </w:r>
       <w:r>
@@ -5637,7 +5704,6 @@
       <w:bookmarkStart w:id="64" w:name="ref-gurven2006"/>
       <w:bookmarkEnd w:id="63"/>
       <w:r>
-        <w:lastRenderedPageBreak/>
         <w:t xml:space="preserve">Gurven, M., &amp; Kaplan, H. (2006). Determinants of time allocation across the lifespan. </w:t>
       </w:r>
       <w:r>
@@ -6040,7 +6106,11 @@
       <w:bookmarkStart w:id="76" w:name="ref-högberg2024"/>
       <w:bookmarkEnd w:id="75"/>
       <w:r>
-        <w:t xml:space="preserve">Högberg, A., Lombard, M., Högberg, A., Iliefski-Janols, E., Lindblad, G., Almér, A., Thompson, W. H., Rost, M., Andreasson, S., Wiig, A., &amp; Gärdenfors, P. (2024). Human socio-technical evolution through the lens of an abstracted-wheel experiment: A critical look at a micro-society laboratory study. </w:t>
+        <w:t xml:space="preserve">Högberg, A., Lombard, M., Högberg, A., Iliefski-Janols, E., Lindblad, G., Almér, A., Thompson, W. H., Rost, M., Andreasson, S., Wiig, A., &amp; Gärdenfors, P. (2024). Human socio-technical </w:t>
+      </w:r>
+      <w:r>
+        <w:lastRenderedPageBreak/>
+        <w:t xml:space="preserve">evolution through the lens of an abstracted-wheel experiment: A critical look at a micro-society laboratory study. </w:t>
       </w:r>
       <w:r>
         <w:rPr>
@@ -6078,7 +6148,6 @@
       <w:bookmarkStart w:id="77" w:name="ref-honigmann1949"/>
       <w:bookmarkEnd w:id="76"/>
       <w:r>
-        <w:lastRenderedPageBreak/>
         <w:t xml:space="preserve">Honigmann, J. J., &amp; Bennett, W. C. (1949). </w:t>
       </w:r>
       <w:r>
@@ -6499,6 +6568,7 @@
       <w:bookmarkStart w:id="90" w:name="ref-lancy1996"/>
       <w:bookmarkEnd w:id="89"/>
       <w:r>
+        <w:lastRenderedPageBreak/>
         <w:t xml:space="preserve">Lancy, D. F. (1996). </w:t>
       </w:r>
       <w:r>
@@ -6519,7 +6589,6 @@
       <w:bookmarkStart w:id="91" w:name="ref-lancy2010"/>
       <w:bookmarkEnd w:id="90"/>
       <w:r>
-        <w:lastRenderedPageBreak/>
         <w:t xml:space="preserve">Lancy, D. F. (2010). Learning ’from nobody’: The limited role of teaching in folk models of children’s development. </w:t>
       </w:r>
       <w:r>
@@ -6910,6 +6979,7 @@
       <w:bookmarkStart w:id="102" w:name="ref-liu2023"/>
       <w:bookmarkEnd w:id="101"/>
       <w:r>
+        <w:lastRenderedPageBreak/>
         <w:t xml:space="preserve">Liu, C., &amp; Stout, D. (2023). Inferring cultural reproduction from lithic data: A critical review. </w:t>
       </w:r>
       <w:r>
@@ -6948,7 +7018,6 @@
       <w:bookmarkStart w:id="103" w:name="ref-malafouris2012"/>
       <w:bookmarkEnd w:id="102"/>
       <w:r>
-        <w:lastRenderedPageBreak/>
         <w:t xml:space="preserve">Malafouris, L. (2012). Prosthetic gestures: how the tool shapes the mind. </w:t>
       </w:r>
       <w:r>
@@ -7351,6 +7420,7 @@
       <w:bookmarkStart w:id="115" w:name="ref-perequin2020"/>
       <w:bookmarkEnd w:id="114"/>
       <w:r>
+        <w:lastRenderedPageBreak/>
         <w:t xml:space="preserve">Perequin, P., &amp; Petrequin, A.-M. (2020). </w:t>
       </w:r>
       <w:r>
@@ -7391,7 +7461,6 @@
       <w:bookmarkStart w:id="117" w:name="ref-richards1939"/>
       <w:bookmarkEnd w:id="116"/>
       <w:r>
-        <w:lastRenderedPageBreak/>
         <w:t xml:space="preserve">Richards, A. I. (1939). </w:t>
       </w:r>
       <w:r>
@@ -7812,6 +7881,7 @@
       <w:bookmarkStart w:id="130" w:name="ref-tierneyExpandingTidyData2020"/>
       <w:bookmarkEnd w:id="129"/>
       <w:r>
+        <w:lastRenderedPageBreak/>
         <w:t xml:space="preserve">Tierney, N. J., &amp; Cook, D. H. (2020). </w:t>
       </w:r>
       <w:r>
@@ -7860,7 +7930,6 @@
       <w:bookmarkStart w:id="132" w:name="ref-wakano2007"/>
       <w:bookmarkEnd w:id="131"/>
       <w:r>
-        <w:lastRenderedPageBreak/>
         <w:t xml:space="preserve">Wakano, J. Y., &amp; Aoki, K. (2007). Do social learning and conformist bias coevolve? Henrich and boyd revisited. </w:t>
       </w:r>
       <w:r>

</xml_diff>

<commit_message>
finished the CCR revision.
</commit_message>
<xml_diff>
--- a/Manuscript/manuscript_word.docx
+++ b/Manuscript/manuscript_word.docx
@@ -1298,7 +1298,7 @@
         <w:t xml:space="preserve">crafts</w:t>
       </w:r>
     </w:p>
-    <w:bookmarkStart w:id="20" w:name="introduction"/>
+    <w:bookmarkStart w:id="22" w:name="introduction"/>
     <w:p>
       <w:pPr>
         <w:pStyle w:val="Heading1"/>
@@ -1307,6 +1307,15 @@
         <w:t xml:space="preserve">Introduction</w:t>
       </w:r>
     </w:p>
+    <w:bookmarkStart w:id="20" w:name="X1d2777caffc6e8b2467bbfad2383b9783666cc2"/>
+    <w:p>
+      <w:pPr>
+        <w:pStyle w:val="Heading2"/>
+      </w:pPr>
+      <w:r>
+        <w:t xml:space="preserve">Toolmaking skill acquisition: A cross-cultural perspective</w:t>
+      </w:r>
+    </w:p>
     <w:p>
       <w:pPr>
         <w:pStyle w:val="FirstParagraph"/>
@@ -1922,7 +1931,7 @@
         <w:t xml:space="preserve"> </w:t>
       </w:r>
       <w:r>
-        <w:t xml:space="preserve">only occupies 3.7% of all cases. There could be several reasons behind it. An obvious one is that ethnographers may systematically care more about communal activities and it’s challenging to follow and observe individuals, particularly when they conduct foraging activities outside the settlement</w:t>
+        <w:t xml:space="preserve">only occupies 3.7% of all cases. There could be several reasons behind it. An obvious one is that ethnographers may systematically care more about communal activities and it is challenging to follow and observe individuals, particularly when they conduct foraging activities outside the settlement</w:t>
       </w:r>
       <w:r>
         <w:t xml:space="preserve"> </w:t>
@@ -1948,32 +1957,158 @@
         <w:t xml:space="preserve">. Another potential source of bias could be the coding process, which I aim to improve in this project. I have developed a coding scheme that provides a more inclusive evaluation of the learning processes. Second, the unbalanced representation of hunter-gatherer societies versus all other subsistence types within non-industrial societies masks our understanding because toolmaking (by hand) is not unique to hunter-gatherers.</w:t>
       </w:r>
     </w:p>
+    <w:bookmarkEnd w:id="20"/>
+    <w:bookmarkStart w:id="21" w:name="study-aims"/>
+    <w:p>
+      <w:pPr>
+        <w:pStyle w:val="Heading2"/>
+      </w:pPr>
+      <w:r>
+        <w:t xml:space="preserve">Study aims</w:t>
+      </w:r>
+    </w:p>
+    <w:p>
+      <w:pPr>
+        <w:pStyle w:val="FirstParagraph"/>
+      </w:pPr>
+      <w:r>
+        <w:t xml:space="preserve">To understand the diversity and regularity in the process of human toolmaking skill acquisition, this project analyzed 170 non-industrial societies displaying varying subsistence strategies around the world using the eHRAF World Cultures database, with a particular focus on developmental contexts and transmission biases involved in the learning processes of toolmaking skills. This study is exploratory and descriptive in nature, focusing on systematically summarizing and presenting the available data without attempting to infer causal relationships or test predictive models. Descriptive studies are essential for establishing a foundational understanding of complex datasets, identifying patterns, and guiding future research directions by highlighting key trends and data limitations</w:t>
+      </w:r>
+      <w:r>
+        <w:t xml:space="preserve"> </w:t>
+      </w:r>
+      <w:r>
+        <w:t xml:space="preserve">(</w:t>
+      </w:r>
+      <w:hyperlink w:anchor="ref-gerring2012">
+        <w:r>
+          <w:rPr>
+            <w:rStyle w:val="Hyperlink"/>
+          </w:rPr>
+          <w:t xml:space="preserve">Gerring, 2012</w:t>
+        </w:r>
+      </w:hyperlink>
+      <w:r>
+        <w:t xml:space="preserve">)</w:t>
+      </w:r>
+      <w:r>
+        <w:t xml:space="preserve">. This study investigates the processes of toolmaking skill acquisition in non-industrial societies, focusing on fundamental aspects of learning: who, where, when, how, what, and why.</w:t>
+      </w:r>
+    </w:p>
     <w:p>
       <w:pPr>
         <w:pStyle w:val="BodyText"/>
       </w:pPr>
       <w:r>
-        <w:t xml:space="preserve">To understand the diversity and regularity in the process of human toolmaking skill acquisition, this project analyzed 170 non-industrial societies displaying varying subsistence strategies around the world using the eHRAF World Cultures database, with a particular focus on developmental contexts and transmission biases involved in the learning processes of toolmaking skills. This study is exploratory and descriptive in nature, focusing on systematically summarizing and presenting the available data without attempting to infer causal relationships or test predictive models. Descriptive studies are essential for establishing a foundational understanding of complex datasets, identifying patterns, and guiding future research directions by highlighting key trends and data limitations</w:t>
-      </w:r>
-      <w:r>
-        <w:t xml:space="preserve"> </w:t>
-      </w:r>
-      <w:r>
-        <w:t xml:space="preserve">(</w:t>
-      </w:r>
-      <w:hyperlink w:anchor="ref-gerring2012">
-        <w:r>
-          <w:rPr>
-            <w:rStyle w:val="Hyperlink"/>
-          </w:rPr>
-          <w:t xml:space="preserve">Gerring, 2012</w:t>
-        </w:r>
-      </w:hyperlink>
-      <w:r>
-        <w:t xml:space="preserve">)</w:t>
-      </w:r>
-      <w:r>
-        <w:t xml:space="preserve">.</w:t>
+        <w:t xml:space="preserve">For the</w:t>
+      </w:r>
+      <w:r>
+        <w:t xml:space="preserve"> </w:t>
+      </w:r>
+      <w:r>
+        <w:t xml:space="preserve">“</w:t>
+      </w:r>
+      <w:r>
+        <w:t xml:space="preserve">who</w:t>
+      </w:r>
+      <w:r>
+        <w:t xml:space="preserve">”</w:t>
+      </w:r>
+      <w:r>
+        <w:t xml:space="preserve"> </w:t>
+      </w:r>
+      <w:r>
+        <w:t xml:space="preserve">aspect, the author examined the transmission modes and concrete social relationships between the learner and the model. The</w:t>
+      </w:r>
+      <w:r>
+        <w:t xml:space="preserve"> </w:t>
+      </w:r>
+      <w:r>
+        <w:t xml:space="preserve">“</w:t>
+      </w:r>
+      <w:r>
+        <w:t xml:space="preserve">where</w:t>
+      </w:r>
+      <w:r>
+        <w:t xml:space="preserve">”</w:t>
+      </w:r>
+      <w:r>
+        <w:t xml:space="preserve"> </w:t>
+      </w:r>
+      <w:r>
+        <w:t xml:space="preserve">question addresses the spatial context of learning, such as whether it occurs indoors or outdoors. The</w:t>
+      </w:r>
+      <w:r>
+        <w:t xml:space="preserve"> </w:t>
+      </w:r>
+      <w:r>
+        <w:t xml:space="preserve">“</w:t>
+      </w:r>
+      <w:r>
+        <w:t xml:space="preserve">when</w:t>
+      </w:r>
+      <w:r>
+        <w:t xml:space="preserve">”</w:t>
+      </w:r>
+      <w:r>
+        <w:t xml:space="preserve"> </w:t>
+      </w:r>
+      <w:r>
+        <w:t xml:space="preserve">explores the ages of both the learner and the model. For the</w:t>
+      </w:r>
+      <w:r>
+        <w:t xml:space="preserve"> </w:t>
+      </w:r>
+      <w:r>
+        <w:t xml:space="preserve">“</w:t>
+      </w:r>
+      <w:r>
+        <w:t xml:space="preserve">how,</w:t>
+      </w:r>
+      <w:r>
+        <w:t xml:space="preserve">”</w:t>
+      </w:r>
+      <w:r>
+        <w:t xml:space="preserve"> </w:t>
+      </w:r>
+      <w:r>
+        <w:t xml:space="preserve">the author investigated the degree of social interaction involved in the learning process. The</w:t>
+      </w:r>
+      <w:r>
+        <w:t xml:space="preserve"> </w:t>
+      </w:r>
+      <w:r>
+        <w:t xml:space="preserve">“</w:t>
+      </w:r>
+      <w:r>
+        <w:t xml:space="preserve">what</w:t>
+      </w:r>
+      <w:r>
+        <w:t xml:space="preserve">”</w:t>
+      </w:r>
+      <w:r>
+        <w:t xml:space="preserve"> </w:t>
+      </w:r>
+      <w:r>
+        <w:t xml:space="preserve">focuses on the content of transmission, such as pottery-making, woodworking, or other craft activities. Lastly, the</w:t>
+      </w:r>
+      <w:r>
+        <w:t xml:space="preserve"> </w:t>
+      </w:r>
+      <w:r>
+        <w:t xml:space="preserve">“</w:t>
+      </w:r>
+      <w:r>
+        <w:t xml:space="preserve">why</w:t>
+      </w:r>
+      <w:r>
+        <w:t xml:space="preserve">”</w:t>
+      </w:r>
+      <w:r>
+        <w:t xml:space="preserve"> </w:t>
+      </w:r>
+      <w:r>
+        <w:t xml:space="preserve">examines the motivations behind a learner’s choice of model—whether it is based on the model’s recognized expertise, convenience, or familial ties.</w:t>
       </w:r>
     </w:p>
     <w:p>
@@ -1981,253 +2116,12 @@
         <w:pStyle w:val="BodyText"/>
       </w:pPr>
       <w:r>
-        <w:t xml:space="preserve">This study investigates the processes of toolmaking skill acquisition in non-industrial societies, focusing on fundamental aspects of learning: who, where, when, how, what, and why. For the</w:t>
-      </w:r>
-      <w:r>
-        <w:t xml:space="preserve"> </w:t>
-      </w:r>
-      <w:r>
-        <w:t xml:space="preserve">“</w:t>
-      </w:r>
-      <w:r>
-        <w:t xml:space="preserve">who</w:t>
-      </w:r>
-      <w:r>
-        <w:t xml:space="preserve">”</w:t>
-      </w:r>
-      <w:r>
-        <w:t xml:space="preserve"> </w:t>
-      </w:r>
-      <w:r>
-        <w:t xml:space="preserve">aspect, the author examined the transmission modes and concrete social relationships between the learner and the model. The</w:t>
-      </w:r>
-      <w:r>
-        <w:t xml:space="preserve"> </w:t>
-      </w:r>
-      <w:r>
-        <w:t xml:space="preserve">“</w:t>
-      </w:r>
-      <w:r>
-        <w:t xml:space="preserve">where</w:t>
-      </w:r>
-      <w:r>
-        <w:t xml:space="preserve">”</w:t>
-      </w:r>
-      <w:r>
-        <w:t xml:space="preserve"> </w:t>
-      </w:r>
-      <w:r>
-        <w:t xml:space="preserve">question addresses the spatial context of learning, such as whether it occurs indoors or outdoors. The</w:t>
-      </w:r>
-      <w:r>
-        <w:t xml:space="preserve"> </w:t>
-      </w:r>
-      <w:r>
-        <w:t xml:space="preserve">“</w:t>
-      </w:r>
-      <w:r>
-        <w:t xml:space="preserve">when</w:t>
-      </w:r>
-      <w:r>
-        <w:t xml:space="preserve">”</w:t>
-      </w:r>
-      <w:r>
-        <w:t xml:space="preserve"> </w:t>
-      </w:r>
-      <w:r>
-        <w:t xml:space="preserve">explores the ages of both the learner and the model. For the</w:t>
-      </w:r>
-      <w:r>
-        <w:t xml:space="preserve"> </w:t>
-      </w:r>
-      <w:r>
-        <w:t xml:space="preserve">“</w:t>
-      </w:r>
-      <w:r>
-        <w:t xml:space="preserve">how,</w:t>
-      </w:r>
-      <w:r>
-        <w:t xml:space="preserve">”</w:t>
-      </w:r>
-      <w:r>
-        <w:t xml:space="preserve"> </w:t>
-      </w:r>
-      <w:r>
-        <w:t xml:space="preserve">the author investigated the degree of social interaction involved in the learning process. The</w:t>
-      </w:r>
-      <w:r>
-        <w:t xml:space="preserve"> </w:t>
-      </w:r>
-      <w:r>
-        <w:t xml:space="preserve">“</w:t>
-      </w:r>
-      <w:r>
-        <w:t xml:space="preserve">what</w:t>
-      </w:r>
-      <w:r>
-        <w:t xml:space="preserve">”</w:t>
-      </w:r>
-      <w:r>
-        <w:t xml:space="preserve"> </w:t>
-      </w:r>
-      <w:r>
-        <w:t xml:space="preserve">focuses on the content of transmission, such as pottery-making, woodworking, or other craft activities. Lastly, the</w:t>
-      </w:r>
-      <w:r>
-        <w:t xml:space="preserve"> </w:t>
-      </w:r>
-      <w:r>
-        <w:t xml:space="preserve">“</w:t>
-      </w:r>
-      <w:r>
-        <w:t xml:space="preserve">why</w:t>
-      </w:r>
-      <w:r>
-        <w:t xml:space="preserve">”</w:t>
-      </w:r>
-      <w:r>
-        <w:t xml:space="preserve"> </w:t>
-      </w:r>
-      <w:r>
-        <w:t xml:space="preserve">examines the motivations behind a learner’s choice of model—whether it is based on the model’s recognized expertise, convenience, or familial ties.</w:t>
-      </w:r>
-    </w:p>
-    <w:p>
-      <w:pPr>
-        <w:pStyle w:val="BodyText"/>
-      </w:pPr>
-      <w:r>
-        <w:t xml:space="preserve">In addition to the broader analysis, this study also investigates how differential preservation of raw materials might affect our ability to infer toolmaking acquisition patterns from material culture remains. Following the primary analysis, I selected clay materials—one of the most common archaeological remains and the only inorganic material with more than 30 documented instances—and visualized these data alongside the main results in terms of the</w:t>
-      </w:r>
-      <w:r>
-        <w:t xml:space="preserve"> </w:t>
-      </w:r>
-      <w:r>
-        <w:t xml:space="preserve">“</w:t>
-      </w:r>
-      <w:r>
-        <w:t xml:space="preserve">who</w:t>
-      </w:r>
-      <w:r>
-        <w:t xml:space="preserve">”</w:t>
-      </w:r>
-      <w:r>
-        <w:t xml:space="preserve">,</w:t>
-      </w:r>
-      <w:r>
-        <w:t xml:space="preserve"> </w:t>
-      </w:r>
-      <w:r>
-        <w:t xml:space="preserve">“</w:t>
-      </w:r>
-      <w:r>
-        <w:t xml:space="preserve">when</w:t>
-      </w:r>
-      <w:r>
-        <w:t xml:space="preserve">”</w:t>
-      </w:r>
-      <w:r>
-        <w:t xml:space="preserve">,</w:t>
-      </w:r>
-      <w:r>
-        <w:t xml:space="preserve"> </w:t>
-      </w:r>
-      <w:r>
-        <w:t xml:space="preserve">“</w:t>
-      </w:r>
-      <w:r>
-        <w:t xml:space="preserve">how</w:t>
-      </w:r>
-      <w:r>
-        <w:t xml:space="preserve">”</w:t>
-      </w:r>
-      <w:r>
-        <w:t xml:space="preserve">, and</w:t>
-      </w:r>
-      <w:r>
-        <w:t xml:space="preserve"> </w:t>
-      </w:r>
-      <w:r>
-        <w:t xml:space="preserve">“</w:t>
-      </w:r>
-      <w:r>
-        <w:t xml:space="preserve">why</w:t>
-      </w:r>
-      <w:r>
-        <w:t xml:space="preserve">”</w:t>
-      </w:r>
-      <w:r>
-        <w:t xml:space="preserve"> </w:t>
-      </w:r>
-      <w:r>
-        <w:t xml:space="preserve">questions. The standalone</w:t>
-      </w:r>
-      <w:r>
-        <w:t xml:space="preserve"> </w:t>
-      </w:r>
-      <w:r>
-        <w:t xml:space="preserve">“</w:t>
-      </w:r>
-      <w:r>
-        <w:t xml:space="preserve">wh ere</w:t>
-      </w:r>
-      <w:r>
-        <w:t xml:space="preserve">”</w:t>
-      </w:r>
-      <w:r>
-        <w:t xml:space="preserve"> </w:t>
-      </w:r>
-      <w:r>
-        <w:t xml:space="preserve">analysis is excluded here for clay materials because of its high missing value. This approach helps address potential preservation bias while also mitigating overrepresentation issues present in the general dataset, as certain societies receive disproportionate ethnographic attention regarding craftsmanship and childhood learning. For example, Lancy’s</w:t>
-      </w:r>
-      <w:r>
-        <w:t xml:space="preserve"> </w:t>
-      </w:r>
-      <w:r>
-        <w:t xml:space="preserve">(</w:t>
-      </w:r>
-      <w:hyperlink w:anchor="ref-lancy1975">
-        <w:r>
-          <w:rPr>
-            <w:rStyle w:val="Hyperlink"/>
-          </w:rPr>
-          <w:t xml:space="preserve">1975</w:t>
-        </w:r>
-      </w:hyperlink>
-      <w:r>
-        <w:t xml:space="preserve">,</w:t>
-      </w:r>
-      <w:r>
-        <w:t xml:space="preserve"> </w:t>
-      </w:r>
-      <w:hyperlink w:anchor="ref-lancy1996">
-        <w:r>
-          <w:rPr>
-            <w:rStyle w:val="Hyperlink"/>
-          </w:rPr>
-          <w:t xml:space="preserve">1996</w:t>
-        </w:r>
-      </w:hyperlink>
-      <w:r>
-        <w:t xml:space="preserve">)</w:t>
-      </w:r>
-      <w:r>
-        <w:t xml:space="preserve"> </w:t>
-      </w:r>
-      <w:r>
-        <w:t xml:space="preserve">work on Kpelle horticulturalists have documented more than 15 different toolmaking skills in the dataset, whereas most socities only feature one or two skills. When we narrow down to a single skill category, each society is represented by only a single entry as stated in the coding scheme below. Therefore, this focused analysis of clay materials provides an important methodological control against these sampling biases.</w:t>
-      </w:r>
-    </w:p>
-    <w:p>
-      <w:pPr>
-        <w:pStyle w:val="BodyText"/>
-      </w:pPr>
-      <w:r>
         <w:t xml:space="preserve">In addition to addressing the six fundamental research questions, this project also undertakes a missing data pattern analysis to evaluate the completeness and reliability of the dataset. Furthermore, a qualitative analysis of the ethnographic texts was conducted to provide contextual depth and enrich the interpretation of the database. Together, these approaches offer a more comprehensive understanding of the data, enhancing both the analytical rigor and the interpretive framework of this study.</w:t>
       </w:r>
     </w:p>
-    <w:bookmarkEnd w:id="20"/>
-    <w:bookmarkStart w:id="30" w:name="methods-and-materials"/>
+    <w:bookmarkEnd w:id="21"/>
+    <w:bookmarkEnd w:id="22"/>
+    <w:bookmarkStart w:id="32" w:name="methods-and-materials"/>
     <w:p>
       <w:pPr>
         <w:pStyle w:val="Heading1"/>
@@ -2236,7 +2130,7 @@
         <w:t xml:space="preserve">Methods and materials</w:t>
       </w:r>
     </w:p>
-    <w:bookmarkStart w:id="25" w:name="searching-strategy"/>
+    <w:bookmarkStart w:id="26" w:name="searching-strategy"/>
     <w:p>
       <w:pPr>
         <w:pStyle w:val="Heading2"/>
@@ -2278,7 +2172,7 @@
         <w:t xml:space="preserve">”</w:t>
       </w:r>
       <w:r>
-        <w:t xml:space="preserve">. Under this OCM code, this project uses the following keywords for searching, including tool, make/made/making, produce/producing, manufacture/manufacturing, create/creating, construct/constructing, assemble/assembling, fabricate/fabricating, shape/shaping, forge/forging, form/forming. These keywords together yield 3060 paragraphs, among which approximately 30-40% are repetitive.</w:t>
+        <w:t xml:space="preserve">. Under this OCM code, this project uses the following keywords for searching, including tool, make/made/making, produce/producing, manufacture/manufacturing, create/creating, construct/constructing, assemble/assembling, fabricate/fabricating, shape/shaping, forge/forging, form/forming. These keywords together yield 3060 paragraphs. Approximately 30–40% of these were duplicate entries, as the search algorithm returned the same paragraph multiple times if it contained more than one keyword. All duplicates were removed before the screening process.</w:t>
       </w:r>
     </w:p>
     <w:p>
@@ -2304,18 +2198,7 @@
         <w:t xml:space="preserve"> </w:t>
       </w:r>
       <w:r>
-        <w:t xml:space="preserve">processes of skill transmission within these communities as a result of colonization and/or market integration. However, these cases may appear as contextual information in the appendix to provide more details of the technologies themselves. In the end, the eligible paragraphs and their associated contextual paragraphs were compiled as a 290-page and geographically organized appendix available as supplementary materials of this article (</w:t>
-      </w:r>
-      <w:hyperlink r:id="rId21">
-        <w:r>
-          <w:rPr>
-            <w:rStyle w:val="Hyperlink"/>
-          </w:rPr>
-          <w:t xml:space="preserve">https://github.com/Raylc/HRAF-2022/blob/main/Manuscript/Appendix.pdf</w:t>
-        </w:r>
-      </w:hyperlink>
-      <w:r>
-        <w:t xml:space="preserve">).</w:t>
+        <w:t xml:space="preserve">processes of skill transmission within these communities as a result of colonization and/or market integration. However, these cases may appear as contextual information in the appendix to provide more details of the technologies themselves. In the end, the eligible paragraphs and their associated contextual paragraphs were compiled as a 290-page and geographically organized appendix available as supplementary materials of this article to ensure full transparency of the source data.</w:t>
       </w:r>
     </w:p>
     <w:p>
@@ -2327,18 +2210,18 @@
           <wp:inline>
             <wp:extent cx="5334000" cy="3556000"/>
             <wp:effectExtent b="0" l="0" r="0" t="0"/>
-            <wp:docPr descr="The spatial distribution of non-industrial societies covered in this study (n=170). It should be noted that these coordinate data represent language ‘centroids’ from the open-access language documentation site glottolog.org instead of the real geographical locations of given communities. These language centroids essentially represent the center point of the area where an relevant language is spoken." title="" id="23" name="Picture"/>
+            <wp:docPr descr="The spatial distribution of non-industrial societies covered in this study (n=170). It should be noted that these coordinate data represent language ‘centroids’ from the open-access language documentation site glottolog.org instead of the real geographical locations of given communities. These language centroids essentially represent the center point of the area where a relevant language is spoken." title="" id="24" name="Picture"/>
             <a:graphic>
               <a:graphicData uri="http://schemas.openxmlformats.org/drawingml/2006/picture">
                 <pic:pic>
                   <pic:nvPicPr>
-                    <pic:cNvPr descr="../Figure/Map.pdf" id="24" name="Picture"/>
+                    <pic:cNvPr descr="../Figure/Map.pdf" id="25" name="Picture"/>
                     <pic:cNvPicPr>
                       <a:picLocks noChangeArrowheads="1" noChangeAspect="1"/>
                     </pic:cNvPicPr>
                   </pic:nvPicPr>
                   <pic:blipFill>
-                    <a:blip r:embed="rId22"/>
+                    <a:blip r:embed="rId23"/>
                     <a:stretch>
                       <a:fillRect/>
                     </a:stretch>
@@ -2388,11 +2271,11 @@
         <w:t xml:space="preserve"> </w:t>
       </w:r>
       <w:r>
-        <w:t xml:space="preserve">from the open-access language documentation site glottolog.org instead of the real geographical locations of given communities. These language centroids essentially represent the center point of the area where an relevant language is spoken.</w:t>
-      </w:r>
-    </w:p>
-    <w:bookmarkEnd w:id="25"/>
-    <w:bookmarkStart w:id="27" w:name="coding-scheme"/>
+        <w:t xml:space="preserve">from the open-access language documentation site glottolog.org instead of the real geographical locations of given communities. These language centroids essentially represent the center point of the area where a relevant language is spoken.</w:t>
+      </w:r>
+    </w:p>
+    <w:bookmarkEnd w:id="26"/>
+    <w:bookmarkStart w:id="28" w:name="coding-scheme"/>
     <w:p>
       <w:pPr>
         <w:pStyle w:val="Heading2"/>
@@ -2575,7 +2458,7 @@
       <w:r>
         <w:t xml:space="preserve">: This variable follows eHRAF’s classification system, including hunter-gatherer, primarily hunter-gatherer, horticulturalist, pastarolist, agro-pastarolist, intensive agriculturalist, and other subsistence combinations. The category of commercial economy is excluded. The definitions of these terms are available in the official eHRAF documentation here (</w:t>
       </w:r>
-      <w:hyperlink r:id="rId26">
+      <w:hyperlink r:id="rId27">
         <w:r>
           <w:rPr>
             <w:rStyle w:val="Hyperlink"/>
@@ -3310,7 +3193,39 @@
         <w:t xml:space="preserve">kin-based bias</w:t>
       </w:r>
       <w:r>
-        <w:t xml:space="preserve">: learning a cultural trait from people who are your kin members,</w:t>
+        <w:t xml:space="preserve">: learning a cultural trait from people who are your kin members. For example, among Ganda agriculturalists,</w:t>
+      </w:r>
+      <w:r>
+        <w:t xml:space="preserve"> </w:t>
+      </w:r>
+      <w:r>
+        <w:t xml:space="preserve">“</w:t>
+      </w:r>
+      <w:r>
+        <w:t xml:space="preserve">Specialists, such as smiths and potters, taught their sons their crafts</w:t>
+      </w:r>
+      <w:r>
+        <w:t xml:space="preserve"> </w:t>
+      </w:r>
+      <w:r>
+        <w:t xml:space="preserve">(</w:t>
+      </w:r>
+      <w:hyperlink w:anchor="ref-mair1934">
+        <w:r>
+          <w:rPr>
+            <w:rStyle w:val="Hyperlink"/>
+          </w:rPr>
+          <w:t xml:space="preserve">Mair, 1934</w:t>
+        </w:r>
+      </w:hyperlink>
+      <w:r>
+        <w:t xml:space="preserve">: 65)</w:t>
+      </w:r>
+      <w:r>
+        <w:t xml:space="preserve">.</w:t>
+      </w:r>
+      <w:r>
+        <w:t xml:space="preserve">”</w:t>
       </w:r>
       <w:r>
         <w:t xml:space="preserve"> </w:t>
@@ -3336,7 +3251,39 @@
         <w:t xml:space="preserve">success-based bias</w:t>
       </w:r>
       <w:r>
-        <w:t xml:space="preserve">: learning a cultural trait from people because they are successful in this technology,</w:t>
+        <w:t xml:space="preserve">: learning a cultural trait from people because they are successful in this technology. For example, for Berbers of Morocco,</w:t>
+      </w:r>
+      <w:r>
+        <w:t xml:space="preserve"> </w:t>
+      </w:r>
+      <w:r>
+        <w:t xml:space="preserve">“</w:t>
+      </w:r>
+      <w:r>
+        <w:t xml:space="preserve">a girl who is not expert invites a number of skilled weavers, who go to her house, eat, and instruct her</w:t>
+      </w:r>
+      <w:r>
+        <w:t xml:space="preserve"> </w:t>
+      </w:r>
+      <w:r>
+        <w:t xml:space="preserve">(</w:t>
+      </w:r>
+      <w:hyperlink w:anchor="ref-coon1931">
+        <w:r>
+          <w:rPr>
+            <w:rStyle w:val="Hyperlink"/>
+          </w:rPr>
+          <w:t xml:space="preserve">Coon, 1931</w:t>
+        </w:r>
+      </w:hyperlink>
+      <w:r>
+        <w:t xml:space="preserve">: 77)</w:t>
+      </w:r>
+      <w:r>
+        <w:t xml:space="preserve">.</w:t>
+      </w:r>
+      <w:r>
+        <w:t xml:space="preserve">”</w:t>
       </w:r>
       <w:r>
         <w:t xml:space="preserve"> </w:t>
@@ -3362,7 +3309,39 @@
         <w:t xml:space="preserve">prestige-based bias</w:t>
       </w:r>
       <w:r>
-        <w:t xml:space="preserve">: learning a cultural trait from people because of their high social status;</w:t>
+        <w:t xml:space="preserve">: learning a cultural trait from people because of their high social status. For example, in an ethnographic narrative of Mescalero Apache people, it was stated that</w:t>
+      </w:r>
+      <w:r>
+        <w:t xml:space="preserve"> </w:t>
+      </w:r>
+      <w:r>
+        <w:t xml:space="preserve">“</w:t>
+      </w:r>
+      <w:r>
+        <w:t xml:space="preserve">He was a chief when I came back from being a prisoner of war…Natsili was really a good leader in all things. He showed us how to hunt, to ride horses, to make saddles, bows and arrows, ropes, quirts, head bonnets, shields, and many other things</w:t>
+      </w:r>
+      <w:r>
+        <w:t xml:space="preserve"> </w:t>
+      </w:r>
+      <w:r>
+        <w:t xml:space="preserve">(</w:t>
+      </w:r>
+      <w:hyperlink w:anchor="ref-opler1969">
+        <w:r>
+          <w:rPr>
+            <w:rStyle w:val="Hyperlink"/>
+          </w:rPr>
+          <w:t xml:space="preserve">Opler, 1969</w:t>
+        </w:r>
+      </w:hyperlink>
+      <w:r>
+        <w:t xml:space="preserve">: 59, 61)</w:t>
+      </w:r>
+      <w:r>
+        <w:t xml:space="preserve">.</w:t>
+      </w:r>
+      <w:r>
+        <w:t xml:space="preserve">”</w:t>
       </w:r>
       <w:r>
         <w:t xml:space="preserve"> </w:t>
@@ -3385,10 +3364,42 @@
           <w:i/>
           <w:u w:val="single"/>
         </w:rPr>
-        <w:t xml:space="preserve">conformist bias</w:t>
-      </w:r>
-      <w:r>
-        <w:t xml:space="preserve">: learning a specific type of knowledge from other people because it is displayed by the majority of the local population;</w:t>
+        <w:t xml:space="preserve">familiarity-based bias</w:t>
+      </w:r>
+      <w:r>
+        <w:t xml:space="preserve">: learning from the people they interact with most frequently, simply because of that repeated exposure, particularly playmates. For example, among Tallensi people,</w:t>
+      </w:r>
+      <w:r>
+        <w:t xml:space="preserve"> </w:t>
+      </w:r>
+      <w:r>
+        <w:t xml:space="preserve">“</w:t>
+      </w:r>
+      <w:r>
+        <w:t xml:space="preserve">…whereas the young men and women plait sporadically a few things for themselves, their sweetheart, or a child, children do so continuously and absorbedly. From July to September one sees them sitting about or strolling about in small groups, plaiting reed decorations</w:t>
+      </w:r>
+      <w:r>
+        <w:t xml:space="preserve"> </w:t>
+      </w:r>
+      <w:r>
+        <w:t xml:space="preserve">(</w:t>
+      </w:r>
+      <w:hyperlink w:anchor="ref-fortes1938">
+        <w:r>
+          <w:rPr>
+            <w:rStyle w:val="Hyperlink"/>
+          </w:rPr>
+          <w:t xml:space="preserve">Fortes, 1938</w:t>
+        </w:r>
+      </w:hyperlink>
+      <w:r>
+        <w:t xml:space="preserve">: 60-61)</w:t>
+      </w:r>
+      <w:r>
+        <w:t xml:space="preserve">.</w:t>
+      </w:r>
+      <w:r>
+        <w:t xml:space="preserve">”</w:t>
       </w:r>
       <w:r>
         <w:t xml:space="preserve"> </w:t>
@@ -3414,7 +3425,45 @@
         <w:t xml:space="preserve">mixed</w:t>
       </w:r>
       <w:r>
-        <w:t xml:space="preserve">: different transmission biases occurred together in the learning process of a given technology. It should be noted that successful or prestigious toolmakers most likely also have close kin members, including offspring. When both identities (e.g., as a kin member and as an expert) of the model are explicitly mentioned, these instances are coded as mixed transmission bias.</w:t>
+        <w:t xml:space="preserve">: different transmission biases occurred together in the learning process of a given technology. For example, kin-based and success-based transmission biases co-exist in an instance of pottery skill transmission among Nuba people.</w:t>
+      </w:r>
+      <w:r>
+        <w:t xml:space="preserve"> </w:t>
+      </w:r>
+      <w:r>
+        <w:t xml:space="preserve">“</w:t>
+      </w:r>
+      <w:r>
+        <w:t xml:space="preserve">The factory occasionally turns into a school for potters. For (grown-up) women can come and watch the experts at work; they can help with the simpler tasks and will be instructed—free of charge—in the more difficult ones, till they have thoroughly mastered the technique and are ready to open a workshop of their own. Otherwise the craft is handed on from mother to daughter</w:t>
+      </w:r>
+      <w:r>
+        <w:t xml:space="preserve"> </w:t>
+      </w:r>
+      <w:r>
+        <w:t xml:space="preserve">(</w:t>
+      </w:r>
+      <w:hyperlink w:anchor="ref-nadel1947">
+        <w:r>
+          <w:rPr>
+            <w:rStyle w:val="Hyperlink"/>
+          </w:rPr>
+          <w:t xml:space="preserve">Nadel, 1947</w:t>
+        </w:r>
+      </w:hyperlink>
+      <w:r>
+        <w:t xml:space="preserve">: 71-72)</w:t>
+      </w:r>
+      <w:r>
+        <w:t xml:space="preserve">.</w:t>
+      </w:r>
+      <w:r>
+        <w:t xml:space="preserve">”</w:t>
+      </w:r>
+      <w:r>
+        <w:t xml:space="preserve"> </w:t>
+      </w:r>
+      <w:r>
+        <w:t xml:space="preserve">It should be noted that successful or prestigious toolmakers most likely also have close kin members, including offspring. When both identities (e.g., as a kin member and as an expert) of the model are explicitly mentioned, these instances are coded as transmission bias. Lastly, conformist bias, namely learning a specific type of knowledge from other people because it is displayed by the majority of the local population, is absent in our example.</w:t>
       </w:r>
     </w:p>
     <w:p>
@@ -3521,7 +3570,39 @@
         <w:t xml:space="preserve">individual learning</w:t>
       </w:r>
       <w:r>
-        <w:t xml:space="preserve">: Individual exhibits repeated attempts to learn a skill or develop new skills or knowledge on his or her own, including trial and error and individual practice;</w:t>
+        <w:t xml:space="preserve">: Individual exhibits repeated attempts to learn a skill or develop new skills or knowledge on his or her own, including trial and error and individual practice. For example, according to a Tiv mother:</w:t>
+      </w:r>
+      <w:r>
+        <w:t xml:space="preserve"> </w:t>
+      </w:r>
+      <w:r>
+        <w:t xml:space="preserve">“</w:t>
+      </w:r>
+      <w:r>
+        <w:t xml:space="preserve">I’ve given her some clay, and she’ll make a very small pot. But she’s got a lot of growing to do before she can really learn anything.</w:t>
+      </w:r>
+      <w:r>
+        <w:t xml:space="preserve"> </w:t>
+      </w:r>
+      <w:r>
+        <w:t xml:space="preserve">(</w:t>
+      </w:r>
+      <w:hyperlink w:anchor="ref-bohannan1958">
+        <w:r>
+          <w:rPr>
+            <w:rStyle w:val="Hyperlink"/>
+          </w:rPr>
+          <w:t xml:space="preserve">Bohannan, 1958</w:t>
+        </w:r>
+      </w:hyperlink>
+      <w:r>
+        <w:t xml:space="preserve">: 381)</w:t>
+      </w:r>
+      <w:r>
+        <w:t xml:space="preserve">.</w:t>
+      </w:r>
+      <w:r>
+        <w:t xml:space="preserve">”</w:t>
       </w:r>
       <w:r>
         <w:t xml:space="preserve"> </w:t>
@@ -3547,7 +3628,39 @@
         <w:t xml:space="preserve">observational learning</w:t>
       </w:r>
       <w:r>
-        <w:t xml:space="preserve">: learner directly observes the actions of models and attempts to replicate the observed actions, and no direct interaction between the model and learner is observed or mentioned;</w:t>
+        <w:t xml:space="preserve">: learner directly observes the actions of models and attempts to replicate the observed actions, and no direct interaction between the model and learner is observed or mentioned. For example, among Yoruba horticulturalists,</w:t>
+      </w:r>
+      <w:r>
+        <w:t xml:space="preserve"> </w:t>
+      </w:r>
+      <w:r>
+        <w:t xml:space="preserve">“</w:t>
+      </w:r>
+      <w:r>
+        <w:t xml:space="preserve">By watching his father he learns and by the time he reaches the age of sixteen he will have enough knowledge to perform most tasks and needs only a little practice</w:t>
+      </w:r>
+      <w:r>
+        <w:t xml:space="preserve"> </w:t>
+      </w:r>
+      <w:r>
+        <w:t xml:space="preserve">(</w:t>
+      </w:r>
+      <w:hyperlink w:anchor="ref-lloyd1953">
+        <w:r>
+          <w:rPr>
+            <w:rStyle w:val="Hyperlink"/>
+          </w:rPr>
+          <w:t xml:space="preserve">Lloyd, 1953</w:t>
+        </w:r>
+      </w:hyperlink>
+      <w:r>
+        <w:t xml:space="preserve">: 33)</w:t>
+      </w:r>
+      <w:r>
+        <w:t xml:space="preserve">.</w:t>
+      </w:r>
+      <w:r>
+        <w:t xml:space="preserve">”</w:t>
       </w:r>
       <w:r>
         <w:t xml:space="preserve"> </w:t>
@@ -3597,7 +3710,45 @@
         <w:t xml:space="preserve">”</w:t>
       </w:r>
       <w:r>
-        <w:t xml:space="preserve">). It should be noted that these three categories are not mutually exclusive. On the contrary, these three categories are inclusive of each other, where interactive learning is built on both observation and individual practice, and observational learning involves individual practice.</w:t>
+        <w:t xml:space="preserve">). For example, among Bhil agro-pastoralists,</w:t>
+      </w:r>
+      <w:r>
+        <w:t xml:space="preserve"> </w:t>
+      </w:r>
+      <w:r>
+        <w:t xml:space="preserve">“</w:t>
+      </w:r>
+      <w:r>
+        <w:t xml:space="preserve">Children are taught work techniques by being instructed to copy their elders, by verbal instructions, or in easy works by asking them to help, as in rope-making</w:t>
+      </w:r>
+      <w:r>
+        <w:t xml:space="preserve"> </w:t>
+      </w:r>
+      <w:r>
+        <w:t xml:space="preserve">(</w:t>
+      </w:r>
+      <w:hyperlink w:anchor="ref-naik1956">
+        <w:r>
+          <w:rPr>
+            <w:rStyle w:val="Hyperlink"/>
+          </w:rPr>
+          <w:t xml:space="preserve">Naik, 1956</w:t>
+        </w:r>
+      </w:hyperlink>
+      <w:r>
+        <w:t xml:space="preserve">: 119)</w:t>
+      </w:r>
+      <w:r>
+        <w:t xml:space="preserve">.</w:t>
+      </w:r>
+      <w:r>
+        <w:t xml:space="preserve">”</w:t>
+      </w:r>
+      <w:r>
+        <w:t xml:space="preserve"> </w:t>
+      </w:r>
+      <w:r>
+        <w:t xml:space="preserve">It should be noted that these three categories are not mutually exclusive. On the contrary, these three categories are inclusive of each other, where interactive learning is built on both observation and individual practice, and observational learning involves individual practice.</w:t>
       </w:r>
     </w:p>
     <w:p>
@@ -3776,8 +3927,144 @@
         <w:t xml:space="preserve">: This provides the relevant references, which can be linked to the relevant paragraph in the appendix.</w:t>
       </w:r>
     </w:p>
-    <w:bookmarkEnd w:id="27"/>
-    <w:bookmarkStart w:id="29" w:name="statistical-analysis-and-visualization"/>
+    <w:bookmarkEnd w:id="28"/>
+    <w:bookmarkStart w:id="29" w:name="X70be45731619b27f0f06cfc06314daa49096990"/>
+    <w:p>
+      <w:pPr>
+        <w:pStyle w:val="Heading2"/>
+      </w:pPr>
+      <w:r>
+        <w:t xml:space="preserve">Taphonomic Control: Clay-Specific Analysis</w:t>
+      </w:r>
+    </w:p>
+    <w:p>
+      <w:pPr>
+        <w:pStyle w:val="FirstParagraph"/>
+      </w:pPr>
+      <w:r>
+        <w:t xml:space="preserve">In addition to the broader analysis, this study also investigates how differential preservation of raw materials might affect our ability to infer toolmaking acquisition patterns from material culture remains. Following the primary analysis, I selected clay materials—one of the most common archaeological remains and the only inorganic material with more than 30 documented instances—and visualized these data alongside the main results in terms of the</w:t>
+      </w:r>
+      <w:r>
+        <w:t xml:space="preserve"> </w:t>
+      </w:r>
+      <w:r>
+        <w:t xml:space="preserve">“</w:t>
+      </w:r>
+      <w:r>
+        <w:t xml:space="preserve">who</w:t>
+      </w:r>
+      <w:r>
+        <w:t xml:space="preserve">”</w:t>
+      </w:r>
+      <w:r>
+        <w:t xml:space="preserve">,</w:t>
+      </w:r>
+      <w:r>
+        <w:t xml:space="preserve"> </w:t>
+      </w:r>
+      <w:r>
+        <w:t xml:space="preserve">“</w:t>
+      </w:r>
+      <w:r>
+        <w:t xml:space="preserve">when</w:t>
+      </w:r>
+      <w:r>
+        <w:t xml:space="preserve">”</w:t>
+      </w:r>
+      <w:r>
+        <w:t xml:space="preserve">,</w:t>
+      </w:r>
+      <w:r>
+        <w:t xml:space="preserve"> </w:t>
+      </w:r>
+      <w:r>
+        <w:t xml:space="preserve">“</w:t>
+      </w:r>
+      <w:r>
+        <w:t xml:space="preserve">how</w:t>
+      </w:r>
+      <w:r>
+        <w:t xml:space="preserve">”</w:t>
+      </w:r>
+      <w:r>
+        <w:t xml:space="preserve">, and</w:t>
+      </w:r>
+      <w:r>
+        <w:t xml:space="preserve"> </w:t>
+      </w:r>
+      <w:r>
+        <w:t xml:space="preserve">“</w:t>
+      </w:r>
+      <w:r>
+        <w:t xml:space="preserve">why</w:t>
+      </w:r>
+      <w:r>
+        <w:t xml:space="preserve">”</w:t>
+      </w:r>
+      <w:r>
+        <w:t xml:space="preserve"> </w:t>
+      </w:r>
+      <w:r>
+        <w:t xml:space="preserve">questions. The standalone</w:t>
+      </w:r>
+      <w:r>
+        <w:t xml:space="preserve"> </w:t>
+      </w:r>
+      <w:r>
+        <w:t xml:space="preserve">“</w:t>
+      </w:r>
+      <w:r>
+        <w:t xml:space="preserve">where</w:t>
+      </w:r>
+      <w:r>
+        <w:t xml:space="preserve">”</w:t>
+      </w:r>
+      <w:r>
+        <w:t xml:space="preserve"> </w:t>
+      </w:r>
+      <w:r>
+        <w:t xml:space="preserve">analysis is excluded here for clay materials because of its high missing value. This approach helps address potential preservation bias while also mitigating overrepresentation issues present in the general dataset, as certain societies receive disproportionate ethnographic attention regarding craftsmanship and childhood learning. For example, Lancy’s</w:t>
+      </w:r>
+      <w:r>
+        <w:t xml:space="preserve"> </w:t>
+      </w:r>
+      <w:r>
+        <w:t xml:space="preserve">(</w:t>
+      </w:r>
+      <w:hyperlink w:anchor="ref-lancy1975">
+        <w:r>
+          <w:rPr>
+            <w:rStyle w:val="Hyperlink"/>
+          </w:rPr>
+          <w:t xml:space="preserve">1975</w:t>
+        </w:r>
+      </w:hyperlink>
+      <w:r>
+        <w:t xml:space="preserve">,</w:t>
+      </w:r>
+      <w:r>
+        <w:t xml:space="preserve"> </w:t>
+      </w:r>
+      <w:hyperlink w:anchor="ref-lancy1996">
+        <w:r>
+          <w:rPr>
+            <w:rStyle w:val="Hyperlink"/>
+          </w:rPr>
+          <w:t xml:space="preserve">1996</w:t>
+        </w:r>
+      </w:hyperlink>
+      <w:r>
+        <w:t xml:space="preserve">)</w:t>
+      </w:r>
+      <w:r>
+        <w:t xml:space="preserve"> </w:t>
+      </w:r>
+      <w:r>
+        <w:t xml:space="preserve">work on Kpelle horticulturalists have documented more than 15 different toolmaking skills in the dataset, whereas most societies only feature one or two skills. When we narrow down to a single skill category, each society is represented by only a single entry as stated in the coding scheme below. Therefore, this focused analysis of clay materials provides an important methodological control against these sampling biases.</w:t>
+      </w:r>
+    </w:p>
+    <w:bookmarkEnd w:id="29"/>
+    <w:bookmarkStart w:id="31" w:name="statistical-analysis-and-visualization"/>
     <w:p>
       <w:pPr>
         <w:pStyle w:val="Heading2"/>
@@ -3846,7 +4133,7 @@
       <w:r>
         <w:t xml:space="preserve">, the dataset and the full analysis code have been uploaded to a dedicated GitHub repository (</w:t>
       </w:r>
-      <w:hyperlink r:id="rId28">
+      <w:hyperlink r:id="rId30">
         <w:r>
           <w:rPr>
             <w:rStyle w:val="Hyperlink"/>
@@ -3858,18 +4145,18 @@
         <w:t xml:space="preserve">).</w:t>
       </w:r>
     </w:p>
-    <w:bookmarkEnd w:id="29"/>
-    <w:bookmarkEnd w:id="30"/>
-    <w:bookmarkStart w:id="63" w:name="results"/>
+    <w:bookmarkEnd w:id="31"/>
+    <w:bookmarkEnd w:id="32"/>
+    <w:bookmarkStart w:id="65" w:name="results-and-discussion"/>
     <w:p>
       <w:pPr>
         <w:pStyle w:val="Heading1"/>
       </w:pPr>
       <w:r>
-        <w:t xml:space="preserve">Results</w:t>
-      </w:r>
-    </w:p>
-    <w:bookmarkStart w:id="55" w:name="descriptive-results"/>
+        <w:t xml:space="preserve">Results and discussion</w:t>
+      </w:r>
+    </w:p>
+    <w:bookmarkStart w:id="57" w:name="descriptive-results"/>
     <w:p>
       <w:pPr>
         <w:pStyle w:val="Heading2"/>
@@ -3878,13 +4165,39 @@
         <w:t xml:space="preserve">Descriptive results</w:t>
       </w:r>
     </w:p>
-    <w:bookmarkStart w:id="34" w:name="what"/>
+    <w:p>
+      <w:pPr>
+        <w:pStyle w:val="FirstParagraph"/>
+      </w:pPr>
+      <w:r>
+        <w:t xml:space="preserve">This section is organized by the six guiding research questions. Each subsection first presents the descriptive quantitative findings and then provides a brief, initial interpretation directly related to the data. This structure is intended to frame the main patterns that are then explored in greater contextual detail in the subsequent</w:t>
+      </w:r>
+      <w:r>
+        <w:t xml:space="preserve"> </w:t>
+      </w:r>
+      <w:r>
+        <w:t xml:space="preserve">“</w:t>
+      </w:r>
+      <w:r>
+        <w:t xml:space="preserve">Qualitative insights</w:t>
+      </w:r>
+      <w:r>
+        <w:t xml:space="preserve">”</w:t>
+      </w:r>
+      <w:r>
+        <w:t xml:space="preserve"> </w:t>
+      </w:r>
+      <w:r>
+        <w:t xml:space="preserve">section.</w:t>
+      </w:r>
+    </w:p>
+    <w:bookmarkStart w:id="36" w:name="Xc469506e86fa1845cd07e06ef9d674ae8652f22"/>
     <w:p>
       <w:pPr>
         <w:pStyle w:val="Heading3"/>
       </w:pPr>
       <w:r>
-        <w:t xml:space="preserve">What</w:t>
+        <w:t xml:space="preserve">Content of transmission: What skills are learned?</w:t>
       </w:r>
     </w:p>
     <w:p>
@@ -4001,18 +4314,18 @@
           <wp:inline>
             <wp:extent cx="3810000" cy="2540000"/>
             <wp:effectExtent b="0" l="0" r="0" t="0"/>
-            <wp:docPr descr="The frequency of toolmaking skills (A) as well as main raw materials involved (B) as documented in ethnographic texts." title="" id="32" name="Picture"/>
+            <wp:docPr descr="The frequency of toolmaking skills (A) as well as main raw materials involved (B) as documented in ethnographic texts." title="" id="34" name="Picture"/>
             <a:graphic>
               <a:graphicData uri="http://schemas.openxmlformats.org/drawingml/2006/picture">
                 <pic:pic>
                   <pic:nvPicPr>
-                    <pic:cNvPr descr="../Figure/what.jpg" id="33" name="Picture"/>
+                    <pic:cNvPr descr="../Figure/what.jpg" id="35" name="Picture"/>
                     <pic:cNvPicPr>
                       <a:picLocks noChangeArrowheads="1" noChangeAspect="1"/>
                     </pic:cNvPicPr>
                   </pic:nvPicPr>
                   <pic:blipFill>
-                    <a:blip r:embed="rId31"/>
+                    <a:blip r:embed="rId33"/>
                     <a:stretch>
                       <a:fillRect/>
                     </a:stretch>
@@ -4047,23 +4360,20 @@
         <w:t xml:space="preserve">The frequency of toolmaking skills (A) as well as main raw materials involved (B) as documented in ethnographic texts.</w:t>
       </w:r>
     </w:p>
-    <w:bookmarkEnd w:id="34"/>
-    <w:bookmarkStart w:id="38" w:name="who"/>
+    <w:bookmarkEnd w:id="36"/>
+    <w:bookmarkStart w:id="40" w:name="X543451d78bc66183da97d23f1a3351156a90c51"/>
     <w:p>
       <w:pPr>
         <w:pStyle w:val="Heading3"/>
       </w:pPr>
       <w:r>
-        <w:t xml:space="preserve">Who</w:t>
+        <w:t xml:space="preserve">Agents of transmission: Who transmits skills?</w:t>
       </w:r>
     </w:p>
     <w:p>
       <w:pPr>
         <w:pStyle w:val="FirstParagraph"/>
       </w:pPr>
-      <w:r>
-        <w:t xml:space="preserve">Here the author visualized the general distribution of different modes of cultural transmission (</w:t>
-      </w:r>
       <w:r>
         <w:rPr>
           <w:bCs/>
@@ -4075,7 +4385,7 @@
         <w:t xml:space="preserve"> </w:t>
       </w:r>
       <w:r>
-        <w:t xml:space="preserve">@ref(fig:who)A). The results indicate that vertical transmission, where skills are passed from parent to child, is the most frequently documented mode (n = 162). This is followed by vertical/oblique transmission (n = 112), where learning occurs both from parents and other adults within the community. Purely oblique transmission—learning from non-parental adults—accounts for 59 instances. Horizontal transmission, involving learning from peers, appears less frequently (n = 10), and mixed modes combining horizontal and oblique transmission are even rarer (e.g., horizontal/oblique: n = 6; oblique/horizontal: n = 1). Additionally, some cases report a combination of all modes (n = 11). Notably, 118 instances lack specific information on transmission mode, highlighting gaps in ethnographic reporting. As for the clay-specific analysis shown in</w:t>
+        <w:t xml:space="preserve">@ref(fig:who)A shows the distribution of different modes of cultural transmission. The results indicate that vertical transmission, where skills are passed from parent to child, is the most frequently documented mode (n = 162). This is followed by vertical/oblique transmission (n = 112), where learning occurs both from parents and other adults within the community. Purely oblique transmission—learning from non-parental adults—accounts for 59 instances. Horizontal transmission, involving learning from peers, appears less frequently (n = 10), and mixed modes combining horizontal and oblique transmission are even rarer (e.g., horizontal/oblique: n = 6; oblique/horizontal: n = 1). Additionally, some cases report a combination of all modes (n = 11). Notably, 118 instances lack specific information on transmission mode, highlighting gaps in ethnographic reporting. As for the clay-specific analysis shown in</w:t>
       </w:r>
       <w:r>
         <w:t xml:space="preserve"> </w:t>
@@ -4401,18 +4711,18 @@
           <wp:inline>
             <wp:extent cx="3810000" cy="2540000"/>
             <wp:effectExtent b="0" l="0" r="0" t="0"/>
-            <wp:docPr descr="Transmission modes of toolmaking skills documented in ethnographic texts." title="" id="36" name="Picture"/>
+            <wp:docPr descr="Transmission modes of toolmaking skills documented in ethnographic texts." title="" id="38" name="Picture"/>
             <a:graphic>
               <a:graphicData uri="http://schemas.openxmlformats.org/drawingml/2006/picture">
                 <pic:pic>
                   <pic:nvPicPr>
-                    <pic:cNvPr descr="../Figure/who.jpg" id="37" name="Picture"/>
+                    <pic:cNvPr descr="../Figure/who.jpg" id="39" name="Picture"/>
                     <pic:cNvPicPr>
                       <a:picLocks noChangeArrowheads="1" noChangeAspect="1"/>
                     </pic:cNvPicPr>
                   </pic:nvPicPr>
                   <pic:blipFill>
-                    <a:blip r:embed="rId35"/>
+                    <a:blip r:embed="rId37"/>
                     <a:stretch>
                       <a:fillRect/>
                     </a:stretch>
@@ -4447,14 +4757,14 @@
         <w:t xml:space="preserve">Transmission modes of toolmaking skills documented in ethnographic texts.</w:t>
       </w:r>
     </w:p>
-    <w:bookmarkEnd w:id="38"/>
-    <w:bookmarkStart w:id="42" w:name="where"/>
+    <w:bookmarkEnd w:id="40"/>
+    <w:bookmarkStart w:id="44" w:name="X8917c6fbcfa0ca2622a51347ffcf5f19c52c044"/>
     <w:p>
       <w:pPr>
         <w:pStyle w:val="Heading3"/>
       </w:pPr>
       <w:r>
-        <w:t xml:space="preserve">Where</w:t>
+        <w:t xml:space="preserve">Spatial context: Where does learning occur?</w:t>
       </w:r>
     </w:p>
     <w:p>
@@ -4514,18 +4824,18 @@
           <wp:inline>
             <wp:extent cx="3810000" cy="2540000"/>
             <wp:effectExtent b="0" l="0" r="0" t="0"/>
-            <wp:docPr descr="Location of toolmaking skill acquisition documented in ethnographic texts. A displays the frequency of learning locations. B is a treemap demonstrating the connections between craft categories and location locations." title="" id="40" name="Picture"/>
+            <wp:docPr descr="Location of toolmaking skill acquisition documented in ethnographic texts. A displays the frequency of learning locations. B is a treemap demonstrating the connections between craft categories and location locations." title="" id="42" name="Picture"/>
             <a:graphic>
               <a:graphicData uri="http://schemas.openxmlformats.org/drawingml/2006/picture">
                 <pic:pic>
                   <pic:nvPicPr>
-                    <pic:cNvPr descr="../Figure/where.jpg" id="41" name="Picture"/>
+                    <pic:cNvPr descr="../Figure/where.jpg" id="43" name="Picture"/>
                     <pic:cNvPicPr>
                       <a:picLocks noChangeArrowheads="1" noChangeAspect="1"/>
                     </pic:cNvPicPr>
                   </pic:nvPicPr>
                   <pic:blipFill>
-                    <a:blip r:embed="rId39"/>
+                    <a:blip r:embed="rId41"/>
                     <a:stretch>
                       <a:fillRect/>
                     </a:stretch>
@@ -4560,14 +4870,14 @@
         <w:t xml:space="preserve">Location of toolmaking skill acquisition documented in ethnographic texts. A displays the frequency of learning locations. B is a treemap demonstrating the connections between craft categories and location locations.</w:t>
       </w:r>
     </w:p>
-    <w:bookmarkEnd w:id="42"/>
-    <w:bookmarkStart w:id="46" w:name="when"/>
+    <w:bookmarkEnd w:id="44"/>
+    <w:bookmarkStart w:id="48" w:name="X6de5c6a43fdee907760b72d5644bf97cb1f3c6b"/>
     <w:p>
       <w:pPr>
         <w:pStyle w:val="Heading3"/>
       </w:pPr>
       <w:r>
-        <w:t xml:space="preserve">When</w:t>
+        <w:t xml:space="preserve">Developmental timing: When are skills acquired?</w:t>
       </w:r>
     </w:p>
     <w:p>
@@ -4684,18 +4994,18 @@
           <wp:inline>
             <wp:extent cx="3810000" cy="2540000"/>
             <wp:effectExtent b="0" l="0" r="0" t="0"/>
-            <wp:docPr descr="Developmental contexts of toolmaking skill acquisition documented in ethnographic texts." title="" id="44" name="Picture"/>
+            <wp:docPr descr="Developmental contexts of toolmaking skill acquisition documented in ethnographic texts." title="" id="46" name="Picture"/>
             <a:graphic>
               <a:graphicData uri="http://schemas.openxmlformats.org/drawingml/2006/picture">
                 <pic:pic>
                   <pic:nvPicPr>
-                    <pic:cNvPr descr="../Figure/when.jpg" id="45" name="Picture"/>
+                    <pic:cNvPr descr="../Figure/when.jpg" id="47" name="Picture"/>
                     <pic:cNvPicPr>
                       <a:picLocks noChangeArrowheads="1" noChangeAspect="1"/>
                     </pic:cNvPicPr>
                   </pic:nvPicPr>
                   <pic:blipFill>
-                    <a:blip r:embed="rId43"/>
+                    <a:blip r:embed="rId45"/>
                     <a:stretch>
                       <a:fillRect/>
                     </a:stretch>
@@ -4730,14 +5040,14 @@
         <w:t xml:space="preserve">Developmental contexts of toolmaking skill acquisition documented in ethnographic texts.</w:t>
       </w:r>
     </w:p>
-    <w:bookmarkEnd w:id="46"/>
-    <w:bookmarkStart w:id="50" w:name="how"/>
+    <w:bookmarkEnd w:id="48"/>
+    <w:bookmarkStart w:id="52" w:name="X699348dc892c4caecf5ee637132b6563daae854"/>
     <w:p>
       <w:pPr>
         <w:pStyle w:val="Heading3"/>
       </w:pPr>
       <w:r>
-        <w:t xml:space="preserve">How</w:t>
+        <w:t xml:space="preserve">Learning processes: How are skills learned?</w:t>
       </w:r>
     </w:p>
     <w:p>
@@ -4776,7 +5086,7 @@
         <w:pStyle w:val="BodyText"/>
       </w:pPr>
       <w:r>
-        <w:t xml:space="preserve">These results indicate that the transmission of tool-making knowledge in non-industrial societies relies heavily on social interaction, be it verbal or gestural, with observation serving as a secondary but significant learning method. The relatively low frequency of individual learning confirms the observer’s bias towards social activities as opposed to following individuals as mentioned in the introduction, which by no means suggests that individual trial-and-error learning is not important in the acquisition of toolmaking skills. Rather, given the inclusive nature between the three categories in this coding scheme, this result suggests that practice is integral to the learning process but pure individual practice without social interaction is rarely documented.</w:t>
+        <w:t xml:space="preserve">These results indicate that the transmission of tool-making knowledge in non-industrial societies relies heavily on social interaction, be it verbal or gestural, with observation serving as a secondary but significant learning method. The relatively low frequency of individual learning may reflect the observer’s bias towards social activities as opposed to following individuals as mentioned in the introduction, which by no means suggests that individual trial-and-error learning is not important in the acquisition of toolmaking skills. Rather, given the inclusive nature between the three categories in this coding scheme, this result suggests that practice is integral to the learning process but pure individual practice without social interaction is rarely doc</w:t>
       </w:r>
     </w:p>
     <w:p>
@@ -4788,18 +5098,18 @@
           <wp:inline>
             <wp:extent cx="3810000" cy="2540000"/>
             <wp:effectExtent b="0" l="0" r="0" t="0"/>
-            <wp:docPr descr="Learning processes of toolmaking skill acquisition documented in ethnographic texts." title="" id="48" name="Picture"/>
+            <wp:docPr descr="Learning processes of toolmaking skill acquisition documented in ethnographic texts." title="" id="50" name="Picture"/>
             <a:graphic>
               <a:graphicData uri="http://schemas.openxmlformats.org/drawingml/2006/picture">
                 <pic:pic>
                   <pic:nvPicPr>
-                    <pic:cNvPr descr="../Figure/how.jpg" id="49" name="Picture"/>
+                    <pic:cNvPr descr="../Figure/how.jpg" id="51" name="Picture"/>
                     <pic:cNvPicPr>
                       <a:picLocks noChangeArrowheads="1" noChangeAspect="1"/>
                     </pic:cNvPicPr>
                   </pic:nvPicPr>
                   <pic:blipFill>
-                    <a:blip r:embed="rId47"/>
+                    <a:blip r:embed="rId49"/>
                     <a:stretch>
                       <a:fillRect/>
                     </a:stretch>
@@ -4834,14 +5144,14 @@
         <w:t xml:space="preserve">Learning processes of toolmaking skill acquisition documented in ethnographic texts.</w:t>
       </w:r>
     </w:p>
-    <w:bookmarkEnd w:id="50"/>
-    <w:bookmarkStart w:id="54" w:name="why"/>
+    <w:bookmarkEnd w:id="52"/>
+    <w:bookmarkStart w:id="56" w:name="X2a87ba4d06d0d7a4ed686922c08d21c8fab5c81"/>
     <w:p>
       <w:pPr>
         <w:pStyle w:val="Heading3"/>
       </w:pPr>
       <w:r>
-        <w:t xml:space="preserve">Why</w:t>
+        <w:t xml:space="preserve">Transmission biases: Why are models chosen?</w:t>
       </w:r>
     </w:p>
     <w:p>
@@ -5108,18 +5418,18 @@
           <wp:inline>
             <wp:extent cx="3810000" cy="2540000"/>
             <wp:effectExtent b="0" l="0" r="0" t="0"/>
-            <wp:docPr descr="Transmission biases of toolmaking skill acquisition documented in ethnographic texts." title="" id="52" name="Picture"/>
+            <wp:docPr descr="Transmission biases of toolmaking skill acquisition documented in ethnographic texts." title="" id="54" name="Picture"/>
             <a:graphic>
               <a:graphicData uri="http://schemas.openxmlformats.org/drawingml/2006/picture">
                 <pic:pic>
                   <pic:nvPicPr>
-                    <pic:cNvPr descr="../Figure/why.jpg" id="53" name="Picture"/>
+                    <pic:cNvPr descr="../Figure/why.jpg" id="55" name="Picture"/>
                     <pic:cNvPicPr>
                       <a:picLocks noChangeArrowheads="1" noChangeAspect="1"/>
                     </pic:cNvPicPr>
                   </pic:nvPicPr>
                   <pic:blipFill>
-                    <a:blip r:embed="rId51"/>
+                    <a:blip r:embed="rId53"/>
                     <a:stretch>
                       <a:fillRect/>
                     </a:stretch>
@@ -5154,9 +5464,9 @@
         <w:t xml:space="preserve">Transmission biases of toolmaking skill acquisition documented in ethnographic texts.</w:t>
       </w:r>
     </w:p>
-    <w:bookmarkEnd w:id="54"/>
-    <w:bookmarkEnd w:id="55"/>
-    <w:bookmarkStart w:id="62" w:name="missing-pattern-analysis"/>
+    <w:bookmarkEnd w:id="56"/>
+    <w:bookmarkEnd w:id="57"/>
+    <w:bookmarkStart w:id="64" w:name="missing-pattern-analysis"/>
     <w:p>
       <w:pPr>
         <w:pStyle w:val="Heading2"/>
@@ -5208,18 +5518,18 @@
           <wp:inline>
             <wp:extent cx="3810000" cy="2540000"/>
             <wp:effectExtent b="0" l="0" r="0" t="0"/>
-            <wp:docPr descr="Missing data heatmap. Darker segments represent missing data, while lighter segments indicate available data." title="" id="57" name="Picture"/>
+            <wp:docPr descr="Missing data heatmap. Darker segments represent missing data, while lighter segments indicate available data." title="" id="59" name="Picture"/>
             <a:graphic>
               <a:graphicData uri="http://schemas.openxmlformats.org/drawingml/2006/picture">
                 <pic:pic>
                   <pic:nvPicPr>
-                    <pic:cNvPr descr="../Figure/missing.jpg" id="58" name="Picture"/>
+                    <pic:cNvPr descr="../Figure/missing.jpg" id="60" name="Picture"/>
                     <pic:cNvPicPr>
                       <a:picLocks noChangeArrowheads="1" noChangeAspect="1"/>
                     </pic:cNvPicPr>
                   </pic:nvPicPr>
                   <pic:blipFill>
-                    <a:blip r:embed="rId56"/>
+                    <a:blip r:embed="rId58"/>
                     <a:stretch>
                       <a:fillRect/>
                     </a:stretch>
@@ -5284,18 +5594,18 @@
           <wp:inline>
             <wp:extent cx="5334000" cy="4445000"/>
             <wp:effectExtent b="0" l="0" r="0" t="0"/>
-            <wp:docPr descr="The UpSet plot displaying the co-occurrence of missing variables across observations. Ten variables with the highest percentage of missing values are visualized here." title="" id="60" name="Picture"/>
+            <wp:docPr descr="The UpSet plot displaying the co-occurrence of missing variables across observations. Ten variables with the highest percentage of missing values are visualized here." title="" id="62" name="Picture"/>
             <a:graphic>
               <a:graphicData uri="http://schemas.openxmlformats.org/drawingml/2006/picture">
                 <pic:pic>
                   <pic:nvPicPr>
-                    <pic:cNvPr descr="../Figure/upset.jpg" id="61" name="Picture"/>
+                    <pic:cNvPr descr="../Figure/upset.jpg" id="63" name="Picture"/>
                     <pic:cNvPicPr>
                       <a:picLocks noChangeArrowheads="1" noChangeAspect="1"/>
                     </pic:cNvPicPr>
                   </pic:nvPicPr>
                   <pic:blipFill>
-                    <a:blip r:embed="rId59"/>
+                    <a:blip r:embed="rId61"/>
                     <a:stretch>
                       <a:fillRect/>
                     </a:stretch>
@@ -5330,9 +5640,9 @@
         <w:t xml:space="preserve">The UpSet plot displaying the co-occurrence of missing variables across observations. Ten variables with the highest percentage of missing values are visualized here.</w:t>
       </w:r>
     </w:p>
-    <w:bookmarkEnd w:id="62"/>
-    <w:bookmarkEnd w:id="63"/>
-    <w:bookmarkStart w:id="70" w:name="qualitative-insights"/>
+    <w:bookmarkEnd w:id="64"/>
+    <w:bookmarkEnd w:id="65"/>
+    <w:bookmarkStart w:id="72" w:name="qualitative-insights"/>
     <w:p>
       <w:pPr>
         <w:pStyle w:val="Heading1"/>
@@ -5346,10 +5656,10 @@
         <w:pStyle w:val="FirstParagraph"/>
       </w:pPr>
       <w:r>
-        <w:t xml:space="preserve">While the quantitative results provide a broad overview of the distribution and frequency of documented technologies and raw materials, they do not fully capture the complexity of how these technologies were learned, transmitted, and practiced. During the coding of ethnographic data, unexpected patterns and nuanced insights began to emerge, revealing aspects of technological knowledge and skill that were not initially targeted by pre-designed questions. These qualitative findings offer a deeper contextual understanding that complements the quantitative analysis, highlighting the importance of flexible, data-driven interpretation in uncovering the social dynamics of technology use and production. More specifically, these qualitative data will provide complimentary insights to four of our six basic questions, including, when, where, how, and why.</w:t>
-      </w:r>
-    </w:p>
-    <w:bookmarkStart w:id="64" w:name="Xab680f2e3b59ca14e9c530f8702ac52ec5a027a"/>
+        <w:t xml:space="preserve">While the quantitative results provide a broad overview of the distribution and frequency of documented technologies and raw materials, they do not fully capture the complexity of how these technologies were learned, transmitted, and practiced. During the coding of ethnographic data, unexpected patterns and nuanced insights began to emerge, revealing aspects of technological knowledge and skill that were not initially targeted by pre-designed questions. These qualitative findings offer a deeper contextual understanding that complements the quantitative analysis, highlighting the importance of flexible, data-driven interpretation in uncovering the social dynamics of technology use and production. More specifically, these qualitative data will provide complimentary insights to four of our six basic questions, including when, where, how, and why.</w:t>
+      </w:r>
+    </w:p>
+    <w:bookmarkStart w:id="66" w:name="Xab680f2e3b59ca14e9c530f8702ac52ec5a027a"/>
     <w:p>
       <w:pPr>
         <w:pStyle w:val="Heading2"/>
@@ -5939,8 +6249,8 @@
         <w:t xml:space="preserve">”</w:t>
       </w:r>
     </w:p>
-    <w:bookmarkEnd w:id="64"/>
-    <w:bookmarkStart w:id="65" w:name="task-dependent-learning-locations"/>
+    <w:bookmarkEnd w:id="66"/>
+    <w:bookmarkStart w:id="67" w:name="task-dependent-learning-locations"/>
     <w:p>
       <w:pPr>
         <w:pStyle w:val="Heading2"/>
@@ -6051,8 +6361,8 @@
         <w:t xml:space="preserve">. Archaeologists must therefore consider the spatial organization of artifact assemblages to identify stages of skill acquisition and social learning. Overlooking this spatial variability could lead to incomplete interpretations of how technical knowledge was transmitted.</w:t>
       </w:r>
     </w:p>
-    <w:bookmarkEnd w:id="65"/>
-    <w:bookmarkStart w:id="66" w:name="X3596ee9a06aa0a9504c0adb6a1f54c4cea75a49"/>
+    <w:bookmarkEnd w:id="67"/>
+    <w:bookmarkStart w:id="68" w:name="X3596ee9a06aa0a9504c0adb6a1f54c4cea75a49"/>
     <w:p>
       <w:pPr>
         <w:pStyle w:val="Heading2"/>
@@ -6615,8 +6925,8 @@
         <w:t xml:space="preserve">challenges assumptions about the role of explicit reasoning in technological advancement and highlights the importance of contextual, experience-based learning in sustaining complex cultural traditions. It should be noted that the author does not try to make an argument here that causal reasoning is completely absent in the minds of craftsmen in non-industrial societies. Instead, the transmission of tacit knowledge like toolmaking skills seldom revolves around the specification of causal mechanisms behind it.</w:t>
       </w:r>
     </w:p>
-    <w:bookmarkEnd w:id="66"/>
-    <w:bookmarkStart w:id="67" w:name="Xd256b43c153d5642832c1f71dfddbcec8d09b0e"/>
+    <w:bookmarkEnd w:id="68"/>
+    <w:bookmarkStart w:id="69" w:name="Xd256b43c153d5642832c1f71dfddbcec8d09b0e"/>
     <w:p>
       <w:pPr>
         <w:pStyle w:val="Heading2"/>
@@ -7034,8 +7344,8 @@
         <w:t xml:space="preserve">, and their producers can be either adults or children.</w:t>
       </w:r>
     </w:p>
-    <w:bookmarkEnd w:id="67"/>
-    <w:bookmarkStart w:id="68" w:name="skill-training-for-community-integration"/>
+    <w:bookmarkEnd w:id="69"/>
+    <w:bookmarkStart w:id="70" w:name="skill-training-for-community-integration"/>
     <w:p>
       <w:pPr>
         <w:pStyle w:val="Heading2"/>
@@ -7196,8 +7506,8 @@
         <w:t xml:space="preserve">which was originally developed to theorize industrialized contexts but have broader relevance to the non-industrialized societies we described here. In these communities of practice, learning is inherently social and occurs through active participation in shared cultural practices, where engaging in toolmaking allows individuals, particularly younger members, to become integrated into the social fabric of their community. Through observation, imitation, and guided practice, learners not only acquire technical skills but also internalize social norms, values, and identities associated with craftsmanship. This participation fosters a sense of belonging and reinforces communal bonds, demonstrating that toolmaking serves both practical and social functions. Thus, tool production becomes a medium through which individuals transition from peripheral participation to full membership within their cultural group, highlighting the dual role of skill transmission in sustaining both material needs and social cohesion.</w:t>
       </w:r>
     </w:p>
-    <w:bookmarkEnd w:id="68"/>
-    <w:bookmarkStart w:id="69" w:name="distribution-of-expertise"/>
+    <w:bookmarkEnd w:id="70"/>
+    <w:bookmarkStart w:id="71" w:name="distribution-of-expertise"/>
     <w:p>
       <w:pPr>
         <w:pStyle w:val="Heading2"/>
@@ -7501,9 +7811,9 @@
         <w:t xml:space="preserve">question.</w:t>
       </w:r>
     </w:p>
-    <w:bookmarkEnd w:id="69"/>
-    <w:bookmarkEnd w:id="70"/>
-    <w:bookmarkStart w:id="71" w:name="conclusion"/>
+    <w:bookmarkEnd w:id="71"/>
+    <w:bookmarkEnd w:id="72"/>
+    <w:bookmarkStart w:id="73" w:name="conclusion"/>
     <w:p>
       <w:pPr>
         <w:pStyle w:val="Heading1"/>
@@ -7547,7 +7857,7 @@
         <w:t xml:space="preserve">Who</w:t>
       </w:r>
       <w:r>
-        <w:t xml:space="preserve">: People learn most toolmaking skills from their close kin members, particularly parents. Same-gender extended family members like grandparents and uncles/aunts are also heavily involved in this process.</w:t>
+        <w:t xml:space="preserve">: People learn most toolmaking skills from their close kin members, particularly parents. Extended family members like grandparents and uncles/aunts are also heavily involved in this process.</w:t>
       </w:r>
     </w:p>
     <w:p>
@@ -7646,7 +7956,27 @@
         <w:t xml:space="preserve"> </w:t>
       </w:r>
       <w:r>
-        <w:t xml:space="preserve">by refining prior assumptions when fine-grained and contextualized empirical data are lacking, such as favoring kin-based transmission over random copying when formulating initial hypotheses on transmission bias.</w:t>
+        <w:t xml:space="preserve">by refining prior assumptions when fine-grained and contextualized empirical data are lacking, such as favoring kin-based transmission over random copying when formulating initial hypotheses on transmission bias. Moreover, these findings can guide the design of future experimental archaeology research by providing a baseline for more realistic social learning scenarios</w:t>
+      </w:r>
+      <w:r>
+        <w:t xml:space="preserve"> </w:t>
+      </w:r>
+      <w:r>
+        <w:t xml:space="preserve">(</w:t>
+      </w:r>
+      <w:hyperlink w:anchor="ref-liu2024">
+        <w:r>
+          <w:rPr>
+            <w:rStyle w:val="Hyperlink"/>
+          </w:rPr>
+          <w:t xml:space="preserve">Liu, 2024</w:t>
+        </w:r>
+      </w:hyperlink>
+      <w:r>
+        <w:t xml:space="preserve">)</w:t>
+      </w:r>
+      <w:r>
+        <w:t xml:space="preserve">. For example, experimental conditions can be designed to reflect kin-based social structures instead of pairings of strangers. Researchers can also incorporate the interactive teaching and error correction that this study shows are central to skill acquisition.</w:t>
       </w:r>
     </w:p>
     <w:p>
@@ -7695,8 +8025,8 @@
         <w:t xml:space="preserve">.</w:t>
       </w:r>
     </w:p>
-    <w:bookmarkEnd w:id="71"/>
-    <w:bookmarkStart w:id="72" w:name="acknowledgment"/>
+    <w:bookmarkEnd w:id="73"/>
+    <w:bookmarkStart w:id="74" w:name="acknowledgment"/>
     <w:p>
       <w:pPr>
         <w:pStyle w:val="Heading1"/>
@@ -7710,11 +8040,11 @@
         <w:pStyle w:val="FirstParagraph"/>
       </w:pPr>
       <w:r>
-        <w:t xml:space="preserve">This work was assisted in part by skills learned at the 2022 NSF HRAF Summer Institute for Cross Cultural Anthropological Research (NSF BCS Grant #2020156 to HRAF). I would like to thank Carol Ember, Fiana Jordan, and Sean Roberts for their suggestions on the research design of this project. I am also grateful to Dietrich Stout, Craig Hadley, and Claudio Tennie for their constructive comments on an earlier draft of this article.</w:t>
-      </w:r>
-    </w:p>
-    <w:bookmarkEnd w:id="72"/>
-    <w:bookmarkStart w:id="283" w:name="references"/>
+        <w:t xml:space="preserve">This work was assisted in part by skills learned at the 2022 NSF HRAF Summer Institute for Cross Cultural Anthropological Research (NSF BCS Grant #2020156 to HRAF). I would like to thank Carol Ember, Fiona Jordan, and Sean Roberts for their suggestions on the research design of this project. I am also grateful to Dietrich Stout, Craig Hadley, and Claudio Tennie for their constructive comments on an earlier draft of this article.</w:t>
+      </w:r>
+    </w:p>
+    <w:bookmarkEnd w:id="74"/>
+    <w:bookmarkStart w:id="295" w:name="references"/>
     <w:p>
       <w:pPr>
         <w:pStyle w:val="Heading1"/>
@@ -7723,8 +8053,8 @@
         <w:t xml:space="preserve">References</w:t>
       </w:r>
     </w:p>
-    <w:bookmarkStart w:id="282" w:name="refs"/>
-    <w:bookmarkStart w:id="73" w:name="ref-adair1944"/>
+    <w:bookmarkStart w:id="294" w:name="refs"/>
+    <w:bookmarkStart w:id="75" w:name="ref-adair1944"/>
     <w:p>
       <w:pPr>
         <w:pStyle w:val="Bibliography"/>
@@ -7746,8 +8076,8 @@
         <w:t xml:space="preserve">. University of Oklahoma Press.</w:t>
       </w:r>
     </w:p>
-    <w:bookmarkEnd w:id="73"/>
-    <w:bookmarkStart w:id="74" w:name="ref-aschwanden1982"/>
+    <w:bookmarkEnd w:id="75"/>
+    <w:bookmarkStart w:id="76" w:name="ref-aschwanden1982"/>
     <w:p>
       <w:pPr>
         <w:pStyle w:val="Bibliography"/>
@@ -7769,8 +8099,8 @@
         <w:t xml:space="preserve">. Mambo Press.</w:t>
       </w:r>
     </w:p>
-    <w:bookmarkEnd w:id="74"/>
-    <w:bookmarkStart w:id="76" w:name="ref-assaf2019"/>
+    <w:bookmarkEnd w:id="76"/>
+    <w:bookmarkStart w:id="78" w:name="ref-assaf2019"/>
     <w:p>
       <w:pPr>
         <w:pStyle w:val="Bibliography"/>
@@ -7807,7 +8137,7 @@
       <w:r>
         <w:t xml:space="preserve"> </w:t>
       </w:r>
-      <w:hyperlink r:id="rId75">
+      <w:hyperlink r:id="rId77">
         <w:r>
           <w:rPr>
             <w:rStyle w:val="Hyperlink"/>
@@ -7816,8 +8146,8 @@
         </w:r>
       </w:hyperlink>
     </w:p>
-    <w:bookmarkEnd w:id="76"/>
-    <w:bookmarkStart w:id="78" w:name="ref-assaf2016"/>
+    <w:bookmarkEnd w:id="78"/>
+    <w:bookmarkStart w:id="80" w:name="ref-assaf2016"/>
     <w:p>
       <w:pPr>
         <w:pStyle w:val="Bibliography"/>
@@ -7854,7 +8184,7 @@
       <w:r>
         <w:t xml:space="preserve"> </w:t>
       </w:r>
-      <w:hyperlink r:id="rId77">
+      <w:hyperlink r:id="rId79">
         <w:r>
           <w:rPr>
             <w:rStyle w:val="Hyperlink"/>
@@ -7863,8 +8193,8 @@
         </w:r>
       </w:hyperlink>
     </w:p>
-    <w:bookmarkEnd w:id="78"/>
-    <w:bookmarkStart w:id="80" w:name="ref-austen1945"/>
+    <w:bookmarkEnd w:id="80"/>
+    <w:bookmarkStart w:id="82" w:name="ref-austen1945"/>
     <w:p>
       <w:pPr>
         <w:pStyle w:val="Bibliography"/>
@@ -7901,7 +8231,7 @@
       <w:r>
         <w:t xml:space="preserve"> </w:t>
       </w:r>
-      <w:hyperlink r:id="rId79">
+      <w:hyperlink r:id="rId81">
         <w:r>
           <w:rPr>
             <w:rStyle w:val="Hyperlink"/>
@@ -7910,8 +8240,8 @@
         </w:r>
       </w:hyperlink>
     </w:p>
-    <w:bookmarkEnd w:id="80"/>
-    <w:bookmarkStart w:id="81" w:name="ref-barton1938"/>
+    <w:bookmarkEnd w:id="82"/>
+    <w:bookmarkStart w:id="83" w:name="ref-barton1938"/>
     <w:p>
       <w:pPr>
         <w:pStyle w:val="Bibliography"/>
@@ -7933,8 +8263,8 @@
         <w:t xml:space="preserve">. George Routledge &amp; Sons.</w:t>
       </w:r>
     </w:p>
-    <w:bookmarkEnd w:id="81"/>
-    <w:bookmarkStart w:id="83" w:name="ref-becker2024"/>
+    <w:bookmarkEnd w:id="83"/>
+    <w:bookmarkStart w:id="85" w:name="ref-becker2024"/>
     <w:p>
       <w:pPr>
         <w:pStyle w:val="Bibliography"/>
@@ -8008,7 +8338,7 @@
       <w:r>
         <w:t xml:space="preserve"> </w:t>
       </w:r>
-      <w:hyperlink r:id="rId82">
+      <w:hyperlink r:id="rId84">
         <w:r>
           <w:rPr>
             <w:rStyle w:val="Hyperlink"/>
@@ -8017,8 +8347,8 @@
         </w:r>
       </w:hyperlink>
     </w:p>
-    <w:bookmarkEnd w:id="83"/>
-    <w:bookmarkStart w:id="85" w:name="ref-bira2023"/>
+    <w:bookmarkEnd w:id="85"/>
+    <w:bookmarkStart w:id="87" w:name="ref-bira2023"/>
     <w:p>
       <w:pPr>
         <w:pStyle w:val="Bibliography"/>
@@ -8055,7 +8385,7 @@
       <w:r>
         <w:t xml:space="preserve"> </w:t>
       </w:r>
-      <w:hyperlink r:id="rId84">
+      <w:hyperlink r:id="rId86">
         <w:r>
           <w:rPr>
             <w:rStyle w:val="Hyperlink"/>
@@ -8064,8 +8394,8 @@
         </w:r>
       </w:hyperlink>
     </w:p>
-    <w:bookmarkEnd w:id="85"/>
-    <w:bookmarkStart w:id="87" w:name="ref-birch2021"/>
+    <w:bookmarkEnd w:id="87"/>
+    <w:bookmarkStart w:id="89" w:name="ref-birch2021"/>
     <w:p>
       <w:pPr>
         <w:pStyle w:val="Bibliography"/>
@@ -8102,7 +8432,7 @@
       <w:r>
         <w:t xml:space="preserve"> </w:t>
       </w:r>
-      <w:hyperlink r:id="rId86">
+      <w:hyperlink r:id="rId88">
         <w:r>
           <w:rPr>
             <w:rStyle w:val="Hyperlink"/>
@@ -8111,8 +8441,8 @@
         </w:r>
       </w:hyperlink>
     </w:p>
-    <w:bookmarkEnd w:id="87"/>
-    <w:bookmarkStart w:id="89" w:name="ref-bird2019"/>
+    <w:bookmarkEnd w:id="89"/>
+    <w:bookmarkStart w:id="91" w:name="ref-bird2019"/>
     <w:p>
       <w:pPr>
         <w:pStyle w:val="Bibliography"/>
@@ -8149,7 +8479,7 @@
       <w:r>
         <w:t xml:space="preserve"> </w:t>
       </w:r>
-      <w:hyperlink r:id="rId88">
+      <w:hyperlink r:id="rId90">
         <w:r>
           <w:rPr>
             <w:rStyle w:val="Hyperlink"/>
@@ -8158,8 +8488,8 @@
         </w:r>
       </w:hyperlink>
     </w:p>
-    <w:bookmarkEnd w:id="89"/>
-    <w:bookmarkStart w:id="91" w:name="ref-bird2002"/>
+    <w:bookmarkEnd w:id="91"/>
+    <w:bookmarkStart w:id="93" w:name="ref-bird2002"/>
     <w:p>
       <w:pPr>
         <w:pStyle w:val="Bibliography"/>
@@ -8196,7 +8526,7 @@
       <w:r>
         <w:t xml:space="preserve"> </w:t>
       </w:r>
-      <w:hyperlink r:id="rId90">
+      <w:hyperlink r:id="rId92">
         <w:r>
           <w:rPr>
             <w:rStyle w:val="Hyperlink"/>
@@ -8205,8 +8535,8 @@
         </w:r>
       </w:hyperlink>
     </w:p>
-    <w:bookmarkEnd w:id="91"/>
-    <w:bookmarkStart w:id="92" w:name="ref-birket-smith1938"/>
+    <w:bookmarkEnd w:id="93"/>
+    <w:bookmarkStart w:id="94" w:name="ref-birket-smith1938"/>
     <w:p>
       <w:pPr>
         <w:pStyle w:val="Bibliography"/>
@@ -8228,8 +8558,8 @@
         <w:t xml:space="preserve">. Levin &amp; Munksgaard( E. Munksgaard).</w:t>
       </w:r>
     </w:p>
-    <w:bookmarkEnd w:id="92"/>
-    <w:bookmarkStart w:id="93" w:name="ref-blackman1982"/>
+    <w:bookmarkEnd w:id="94"/>
+    <w:bookmarkStart w:id="95" w:name="ref-blackman1982"/>
     <w:p>
       <w:pPr>
         <w:pStyle w:val="Bibliography"/>
@@ -8251,8 +8581,8 @@
         <w:t xml:space="preserve">. University of Washington Press.</w:t>
       </w:r>
     </w:p>
-    <w:bookmarkEnd w:id="93"/>
-    <w:bookmarkStart w:id="95" w:name="ref-bliegebird2002"/>
+    <w:bookmarkEnd w:id="95"/>
+    <w:bookmarkStart w:id="97" w:name="ref-bliegebird2002"/>
     <w:p>
       <w:pPr>
         <w:pStyle w:val="Bibliography"/>
@@ -8289,7 +8619,7 @@
       <w:r>
         <w:t xml:space="preserve"> </w:t>
       </w:r>
-      <w:hyperlink r:id="rId94">
+      <w:hyperlink r:id="rId96">
         <w:r>
           <w:rPr>
             <w:rStyle w:val="Hyperlink"/>
@@ -8298,8 +8628,8 @@
         </w:r>
       </w:hyperlink>
     </w:p>
-    <w:bookmarkEnd w:id="95"/>
-    <w:bookmarkStart w:id="97" w:name="ref-bock2002"/>
+    <w:bookmarkEnd w:id="97"/>
+    <w:bookmarkStart w:id="99" w:name="ref-bock2002"/>
     <w:p>
       <w:pPr>
         <w:pStyle w:val="Bibliography"/>
@@ -8336,7 +8666,7 @@
       <w:r>
         <w:t xml:space="preserve"> </w:t>
       </w:r>
-      <w:hyperlink r:id="rId96">
+      <w:hyperlink r:id="rId98">
         <w:r>
           <w:rPr>
             <w:rStyle w:val="Hyperlink"/>
@@ -8345,8 +8675,8 @@
         </w:r>
       </w:hyperlink>
     </w:p>
-    <w:bookmarkEnd w:id="97"/>
-    <w:bookmarkStart w:id="98" w:name="ref-bohannan1958"/>
+    <w:bookmarkEnd w:id="99"/>
+    <w:bookmarkStart w:id="100" w:name="ref-bohannan1958"/>
     <w:p>
       <w:pPr>
         <w:pStyle w:val="Bibliography"/>
@@ -8368,8 +8698,8 @@
         <w:t xml:space="preserve">. Human Relations Area Files.</w:t>
       </w:r>
     </w:p>
-    <w:bookmarkEnd w:id="98"/>
-    <w:bookmarkStart w:id="100" w:name="ref-boyette2017"/>
+    <w:bookmarkEnd w:id="100"/>
+    <w:bookmarkStart w:id="102" w:name="ref-boyette2017"/>
     <w:p>
       <w:pPr>
         <w:pStyle w:val="Bibliography"/>
@@ -8406,7 +8736,7 @@
       <w:r>
         <w:t xml:space="preserve"> </w:t>
       </w:r>
-      <w:hyperlink r:id="rId99">
+      <w:hyperlink r:id="rId101">
         <w:r>
           <w:rPr>
             <w:rStyle w:val="Hyperlink"/>
@@ -8415,8 +8745,8 @@
         </w:r>
       </w:hyperlink>
     </w:p>
-    <w:bookmarkEnd w:id="100"/>
-    <w:bookmarkStart w:id="102" w:name="ref-boyette2018"/>
+    <w:bookmarkEnd w:id="102"/>
+    <w:bookmarkStart w:id="104" w:name="ref-boyette2018"/>
     <w:p>
       <w:pPr>
         <w:pStyle w:val="Bibliography"/>
@@ -8453,7 +8783,7 @@
       <w:r>
         <w:t xml:space="preserve"> </w:t>
       </w:r>
-      <w:hyperlink r:id="rId101">
+      <w:hyperlink r:id="rId103">
         <w:r>
           <w:rPr>
             <w:rStyle w:val="Hyperlink"/>
@@ -8462,8 +8792,8 @@
         </w:r>
       </w:hyperlink>
     </w:p>
-    <w:bookmarkEnd w:id="102"/>
-    <w:bookmarkStart w:id="104" w:name="ref-buckley2023"/>
+    <w:bookmarkEnd w:id="104"/>
+    <w:bookmarkStart w:id="106" w:name="ref-buckley2023"/>
     <w:p>
       <w:pPr>
         <w:pStyle w:val="Bibliography"/>
@@ -8566,7 +8896,7 @@
       <w:r>
         <w:t xml:space="preserve"> </w:t>
       </w:r>
-      <w:hyperlink r:id="rId103">
+      <w:hyperlink r:id="rId105">
         <w:r>
           <w:rPr>
             <w:rStyle w:val="Hyperlink"/>
@@ -8575,8 +8905,8 @@
         </w:r>
       </w:hyperlink>
     </w:p>
-    <w:bookmarkEnd w:id="104"/>
-    <w:bookmarkStart w:id="105" w:name="ref-burling1963"/>
+    <w:bookmarkEnd w:id="106"/>
+    <w:bookmarkStart w:id="107" w:name="ref-burling1963"/>
     <w:p>
       <w:pPr>
         <w:pStyle w:val="Bibliography"/>
@@ -8598,8 +8928,8 @@
         <w:t xml:space="preserve">. University of Pennsylvania Press.</w:t>
       </w:r>
     </w:p>
-    <w:bookmarkEnd w:id="105"/>
-    <w:bookmarkStart w:id="107" w:name="ref-castañeda2018"/>
+    <w:bookmarkEnd w:id="107"/>
+    <w:bookmarkStart w:id="109" w:name="ref-castañeda2018"/>
     <w:p>
       <w:pPr>
         <w:pStyle w:val="Bibliography"/>
@@ -8639,7 +8969,7 @@
       <w:r>
         <w:t xml:space="preserve"> </w:t>
       </w:r>
-      <w:hyperlink r:id="rId106">
+      <w:hyperlink r:id="rId108">
         <w:r>
           <w:rPr>
             <w:rStyle w:val="Hyperlink"/>
@@ -8648,8 +8978,8 @@
         </w:r>
       </w:hyperlink>
     </w:p>
-    <w:bookmarkEnd w:id="107"/>
-    <w:bookmarkStart w:id="109" w:name="ref-chellappoo2021"/>
+    <w:bookmarkEnd w:id="109"/>
+    <w:bookmarkStart w:id="111" w:name="ref-chellappoo2021"/>
     <w:p>
       <w:pPr>
         <w:pStyle w:val="Bibliography"/>
@@ -8686,7 +9016,7 @@
       <w:r>
         <w:t xml:space="preserve"> </w:t>
       </w:r>
-      <w:hyperlink r:id="rId108">
+      <w:hyperlink r:id="rId110">
         <w:r>
           <w:rPr>
             <w:rStyle w:val="Hyperlink"/>
@@ -8695,8 +9025,8 @@
         </w:r>
       </w:hyperlink>
     </w:p>
-    <w:bookmarkEnd w:id="109"/>
-    <w:bookmarkStart w:id="111" w:name="ref-chudek2012"/>
+    <w:bookmarkEnd w:id="111"/>
+    <w:bookmarkStart w:id="113" w:name="ref-chudek2012"/>
     <w:p>
       <w:pPr>
         <w:pStyle w:val="Bibliography"/>
@@ -8733,7 +9063,7 @@
       <w:r>
         <w:t xml:space="preserve"> </w:t>
       </w:r>
-      <w:hyperlink r:id="rId110">
+      <w:hyperlink r:id="rId112">
         <w:r>
           <w:rPr>
             <w:rStyle w:val="Hyperlink"/>
@@ -8742,8 +9072,8 @@
         </w:r>
       </w:hyperlink>
     </w:p>
-    <w:bookmarkEnd w:id="111"/>
-    <w:bookmarkStart w:id="112" w:name="ref-cook1968"/>
+    <w:bookmarkEnd w:id="113"/>
+    <w:bookmarkStart w:id="114" w:name="ref-cook1968"/>
     <w:p>
       <w:pPr>
         <w:pStyle w:val="Bibliography"/>
@@ -8852,13 +9182,36 @@
         <w:t xml:space="preserve">[Doctoral dissertation]. University of Pittsburgh.</w:t>
       </w:r>
     </w:p>
-    <w:bookmarkEnd w:id="112"/>
-    <w:bookmarkStart w:id="114" w:name="ref-crown2007"/>
+    <w:bookmarkEnd w:id="114"/>
+    <w:bookmarkStart w:id="115" w:name="ref-coon1931"/>
     <w:p>
       <w:pPr>
         <w:pStyle w:val="Bibliography"/>
       </w:pPr>
       <w:r>
+        <w:t xml:space="preserve">Coon, C. S. (1931).</w:t>
+      </w:r>
+      <w:r>
+        <w:t xml:space="preserve"> </w:t>
+      </w:r>
+      <w:r>
+        <w:rPr>
+          <w:iCs/>
+          <w:i/>
+        </w:rPr>
+        <w:t xml:space="preserve">Tribes of the Rif</w:t>
+      </w:r>
+      <w:r>
+        <w:t xml:space="preserve">. Peabody museum of Harvard university.</w:t>
+      </w:r>
+    </w:p>
+    <w:bookmarkEnd w:id="115"/>
+    <w:bookmarkStart w:id="117" w:name="ref-crown2007"/>
+    <w:p>
+      <w:pPr>
+        <w:pStyle w:val="Bibliography"/>
+      </w:pPr>
+      <w:r>
         <w:t xml:space="preserve">Crown, P. L. (2007). Life Histories of Pots and Potters: Situating the Individual in Archaeology.</w:t>
       </w:r>
       <w:r>
@@ -8890,7 +9243,7 @@
       <w:r>
         <w:t xml:space="preserve"> </w:t>
       </w:r>
-      <w:hyperlink r:id="rId113">
+      <w:hyperlink r:id="rId116">
         <w:r>
           <w:rPr>
             <w:rStyle w:val="Hyperlink"/>
@@ -8899,8 +9252,8 @@
         </w:r>
       </w:hyperlink>
     </w:p>
-    <w:bookmarkEnd w:id="114"/>
-    <w:bookmarkStart w:id="116" w:name="ref-dallos2021"/>
+    <w:bookmarkEnd w:id="117"/>
+    <w:bookmarkStart w:id="119" w:name="ref-dallos2021"/>
     <w:p>
       <w:pPr>
         <w:pStyle w:val="Bibliography"/>
@@ -8937,7 +9290,7 @@
       <w:r>
         <w:t xml:space="preserve"> </w:t>
       </w:r>
-      <w:hyperlink r:id="rId115">
+      <w:hyperlink r:id="rId118">
         <w:r>
           <w:rPr>
             <w:rStyle w:val="Hyperlink"/>
@@ -8946,8 +9299,8 @@
         </w:r>
       </w:hyperlink>
     </w:p>
-    <w:bookmarkEnd w:id="116"/>
-    <w:bookmarkStart w:id="118" w:name="ref-deacon1934"/>
+    <w:bookmarkEnd w:id="119"/>
+    <w:bookmarkStart w:id="121" w:name="ref-deacon1934"/>
     <w:p>
       <w:pPr>
         <w:pStyle w:val="Bibliography"/>
@@ -8971,7 +9324,7 @@
       <w:r>
         <w:t xml:space="preserve"> </w:t>
       </w:r>
-      <w:hyperlink r:id="rId117">
+      <w:hyperlink r:id="rId120">
         <w:r>
           <w:rPr>
             <w:rStyle w:val="Hyperlink"/>
@@ -8980,8 +9333,8 @@
         </w:r>
       </w:hyperlink>
     </w:p>
-    <w:bookmarkEnd w:id="118"/>
-    <w:bookmarkStart w:id="120" w:name="ref-derex2019"/>
+    <w:bookmarkEnd w:id="121"/>
+    <w:bookmarkStart w:id="123" w:name="ref-derex2019"/>
     <w:p>
       <w:pPr>
         <w:pStyle w:val="Bibliography"/>
@@ -9018,7 +9371,7 @@
       <w:r>
         <w:t xml:space="preserve"> </w:t>
       </w:r>
-      <w:hyperlink r:id="rId119">
+      <w:hyperlink r:id="rId122">
         <w:r>
           <w:rPr>
             <w:rStyle w:val="Hyperlink"/>
@@ -9027,8 +9380,8 @@
         </w:r>
       </w:hyperlink>
     </w:p>
-    <w:bookmarkEnd w:id="120"/>
-    <w:bookmarkStart w:id="122" w:name="ref-derex2023"/>
+    <w:bookmarkEnd w:id="123"/>
+    <w:bookmarkStart w:id="125" w:name="ref-derex2023"/>
     <w:p>
       <w:pPr>
         <w:pStyle w:val="Bibliography"/>
@@ -9155,7 +9508,7 @@
       <w:r>
         <w:t xml:space="preserve"> </w:t>
       </w:r>
-      <w:hyperlink r:id="rId121">
+      <w:hyperlink r:id="rId124">
         <w:r>
           <w:rPr>
             <w:rStyle w:val="Hyperlink"/>
@@ -9164,8 +9517,8 @@
         </w:r>
       </w:hyperlink>
     </w:p>
-    <w:bookmarkEnd w:id="122"/>
-    <w:bookmarkStart w:id="124" w:name="ref-desmond2022"/>
+    <w:bookmarkEnd w:id="125"/>
+    <w:bookmarkStart w:id="127" w:name="ref-desmond2022"/>
     <w:p>
       <w:pPr>
         <w:pStyle w:val="Bibliography"/>
@@ -9202,7 +9555,7 @@
       <w:r>
         <w:t xml:space="preserve"> </w:t>
       </w:r>
-      <w:hyperlink r:id="rId123">
+      <w:hyperlink r:id="rId126">
         <w:r>
           <w:rPr>
             <w:rStyle w:val="Hyperlink"/>
@@ -9211,8 +9564,8 @@
         </w:r>
       </w:hyperlink>
     </w:p>
-    <w:bookmarkEnd w:id="124"/>
-    <w:bookmarkStart w:id="126" w:name="ref-dunmore2023"/>
+    <w:bookmarkEnd w:id="127"/>
+    <w:bookmarkStart w:id="129" w:name="ref-dunmore2023"/>
     <w:p>
       <w:pPr>
         <w:pStyle w:val="Bibliography"/>
@@ -9279,7 +9632,7 @@
       <w:r>
         <w:t xml:space="preserve"> </w:t>
       </w:r>
-      <w:hyperlink r:id="rId125">
+      <w:hyperlink r:id="rId128">
         <w:r>
           <w:rPr>
             <w:rStyle w:val="Hyperlink"/>
@@ -9288,8 +9641,8 @@
         </w:r>
       </w:hyperlink>
     </w:p>
-    <w:bookmarkEnd w:id="126"/>
-    <w:bookmarkStart w:id="127" w:name="ref-ewers1958"/>
+    <w:bookmarkEnd w:id="129"/>
+    <w:bookmarkStart w:id="130" w:name="ref-ewers1958"/>
     <w:p>
       <w:pPr>
         <w:pStyle w:val="Bibliography"/>
@@ -9311,8 +9664,8 @@
         <w:t xml:space="preserve">. University of Oklahoma Press.</w:t>
       </w:r>
     </w:p>
-    <w:bookmarkEnd w:id="127"/>
-    <w:bookmarkStart w:id="128" w:name="ref-flannery1953"/>
+    <w:bookmarkEnd w:id="130"/>
+    <w:bookmarkStart w:id="131" w:name="ref-flannery1953"/>
     <w:p>
       <w:pPr>
         <w:pStyle w:val="Bibliography"/>
@@ -9334,8 +9687,8 @@
         <w:t xml:space="preserve">. Catholic University of America Press.</w:t>
       </w:r>
     </w:p>
-    <w:bookmarkEnd w:id="128"/>
-    <w:bookmarkStart w:id="130" w:name="ref-fortes1938"/>
+    <w:bookmarkEnd w:id="131"/>
+    <w:bookmarkStart w:id="133" w:name="ref-fortes1938"/>
     <w:p>
       <w:pPr>
         <w:pStyle w:val="Bibliography"/>
@@ -9359,7 +9712,7 @@
       <w:r>
         <w:t xml:space="preserve"> </w:t>
       </w:r>
-      <w:hyperlink r:id="rId129">
+      <w:hyperlink r:id="rId132">
         <w:r>
           <w:rPr>
             <w:rStyle w:val="Hyperlink"/>
@@ -9368,8 +9721,8 @@
         </w:r>
       </w:hyperlink>
     </w:p>
-    <w:bookmarkEnd w:id="130"/>
-    <w:bookmarkStart w:id="132" w:name="ref-garfield2016"/>
+    <w:bookmarkEnd w:id="133"/>
+    <w:bookmarkStart w:id="135" w:name="ref-garfield2016"/>
     <w:p>
       <w:pPr>
         <w:pStyle w:val="Bibliography"/>
@@ -9608,7 +9961,7 @@
       <w:r>
         <w:t xml:space="preserve"> </w:t>
       </w:r>
-      <w:hyperlink r:id="rId131">
+      <w:hyperlink r:id="rId134">
         <w:r>
           <w:rPr>
             <w:rStyle w:val="Hyperlink"/>
@@ -9617,8 +9970,8 @@
         </w:r>
       </w:hyperlink>
     </w:p>
-    <w:bookmarkEnd w:id="132"/>
-    <w:bookmarkStart w:id="134" w:name="ref-gerring2012"/>
+    <w:bookmarkEnd w:id="135"/>
+    <w:bookmarkStart w:id="137" w:name="ref-gerring2012"/>
     <w:p>
       <w:pPr>
         <w:pStyle w:val="Bibliography"/>
@@ -9655,7 +10008,7 @@
       <w:r>
         <w:t xml:space="preserve"> </w:t>
       </w:r>
-      <w:hyperlink r:id="rId133">
+      <w:hyperlink r:id="rId136">
         <w:r>
           <w:rPr>
             <w:rStyle w:val="Hyperlink"/>
@@ -9664,8 +10017,8 @@
         </w:r>
       </w:hyperlink>
     </w:p>
-    <w:bookmarkEnd w:id="134"/>
-    <w:bookmarkStart w:id="136" w:name="ref-ghetti2012"/>
+    <w:bookmarkEnd w:id="137"/>
+    <w:bookmarkStart w:id="139" w:name="ref-ghetti2012"/>
     <w:p>
       <w:pPr>
         <w:pStyle w:val="Bibliography"/>
@@ -9702,7 +10055,7 @@
       <w:r>
         <w:t xml:space="preserve"> </w:t>
       </w:r>
-      <w:hyperlink r:id="rId135">
+      <w:hyperlink r:id="rId138">
         <w:r>
           <w:rPr>
             <w:rStyle w:val="Hyperlink"/>
@@ -9711,8 +10064,8 @@
         </w:r>
       </w:hyperlink>
     </w:p>
-    <w:bookmarkEnd w:id="136"/>
-    <w:bookmarkStart w:id="138" w:name="ref-gilligan2024"/>
+    <w:bookmarkEnd w:id="139"/>
+    <w:bookmarkStart w:id="141" w:name="ref-gilligan2024"/>
     <w:p>
       <w:pPr>
         <w:pStyle w:val="Bibliography"/>
@@ -9749,7 +10102,7 @@
       <w:r>
         <w:t xml:space="preserve"> </w:t>
       </w:r>
-      <w:hyperlink r:id="rId137">
+      <w:hyperlink r:id="rId140">
         <w:r>
           <w:rPr>
             <w:rStyle w:val="Hyperlink"/>
@@ -9758,8 +10111,8 @@
         </w:r>
       </w:hyperlink>
     </w:p>
-    <w:bookmarkEnd w:id="138"/>
-    <w:bookmarkStart w:id="140" w:name="ref-goodenough1951"/>
+    <w:bookmarkEnd w:id="141"/>
+    <w:bookmarkStart w:id="143" w:name="ref-goodenough1951"/>
     <w:p>
       <w:pPr>
         <w:pStyle w:val="Bibliography"/>
@@ -9783,7 +10136,7 @@
       <w:r>
         <w:t xml:space="preserve"> </w:t>
       </w:r>
-      <w:hyperlink r:id="rId139">
+      <w:hyperlink r:id="rId142">
         <w:r>
           <w:rPr>
             <w:rStyle w:val="Hyperlink"/>
@@ -9792,8 +10145,8 @@
         </w:r>
       </w:hyperlink>
     </w:p>
-    <w:bookmarkEnd w:id="140"/>
-    <w:bookmarkStart w:id="142" w:name="ref-greenfield2003"/>
+    <w:bookmarkEnd w:id="143"/>
+    <w:bookmarkStart w:id="145" w:name="ref-greenfield2003"/>
     <w:p>
       <w:pPr>
         <w:pStyle w:val="Bibliography"/>
@@ -9830,7 +10183,7 @@
       <w:r>
         <w:t xml:space="preserve"> </w:t>
       </w:r>
-      <w:hyperlink r:id="rId141">
+      <w:hyperlink r:id="rId144">
         <w:r>
           <w:rPr>
             <w:rStyle w:val="Hyperlink"/>
@@ -9839,8 +10192,8 @@
         </w:r>
       </w:hyperlink>
     </w:p>
-    <w:bookmarkEnd w:id="142"/>
-    <w:bookmarkStart w:id="144" w:name="ref-gurven2006"/>
+    <w:bookmarkEnd w:id="145"/>
+    <w:bookmarkStart w:id="147" w:name="ref-gurven2006"/>
     <w:p>
       <w:pPr>
         <w:pStyle w:val="Bibliography"/>
@@ -9877,7 +10230,7 @@
       <w:r>
         <w:t xml:space="preserve"> </w:t>
       </w:r>
-      <w:hyperlink r:id="rId143">
+      <w:hyperlink r:id="rId146">
         <w:r>
           <w:rPr>
             <w:rStyle w:val="Hyperlink"/>
@@ -9886,8 +10239,8 @@
         </w:r>
       </w:hyperlink>
     </w:p>
-    <w:bookmarkEnd w:id="144"/>
-    <w:bookmarkStart w:id="145" w:name="ref-gusinde1931"/>
+    <w:bookmarkEnd w:id="147"/>
+    <w:bookmarkStart w:id="148" w:name="ref-gusinde1931"/>
     <w:p>
       <w:pPr>
         <w:pStyle w:val="Bibliography"/>
@@ -9909,8 +10262,8 @@
         <w:t xml:space="preserve">. Verlag der Internationalen Zeitschrift.</w:t>
       </w:r>
     </w:p>
-    <w:bookmarkEnd w:id="145"/>
-    <w:bookmarkStart w:id="147" w:name="ref-hamdani2001"/>
+    <w:bookmarkEnd w:id="148"/>
+    <w:bookmarkStart w:id="150" w:name="ref-hamdani2001"/>
     <w:p>
       <w:pPr>
         <w:pStyle w:val="Bibliography"/>
@@ -9947,7 +10300,7 @@
       <w:r>
         <w:t xml:space="preserve"> </w:t>
       </w:r>
-      <w:hyperlink r:id="rId146">
+      <w:hyperlink r:id="rId149">
         <w:r>
           <w:rPr>
             <w:rStyle w:val="Hyperlink"/>
@@ -9956,8 +10309,8 @@
         </w:r>
       </w:hyperlink>
     </w:p>
-    <w:bookmarkEnd w:id="147"/>
-    <w:bookmarkStart w:id="148" w:name="ref-harner1973"/>
+    <w:bookmarkEnd w:id="150"/>
+    <w:bookmarkStart w:id="151" w:name="ref-harner1973"/>
     <w:p>
       <w:pPr>
         <w:pStyle w:val="Bibliography"/>
@@ -9979,8 +10332,8 @@
         <w:t xml:space="preserve">. Doubleday Natural History Press.</w:t>
       </w:r>
     </w:p>
-    <w:bookmarkEnd w:id="148"/>
-    <w:bookmarkStart w:id="150" w:name="ref-harris2021"/>
+    <w:bookmarkEnd w:id="151"/>
+    <w:bookmarkStart w:id="153" w:name="ref-harris2021"/>
     <w:p>
       <w:pPr>
         <w:pStyle w:val="Bibliography"/>
@@ -10017,7 +10370,7 @@
       <w:r>
         <w:t xml:space="preserve"> </w:t>
       </w:r>
-      <w:hyperlink r:id="rId149">
+      <w:hyperlink r:id="rId152">
         <w:r>
           <w:rPr>
             <w:rStyle w:val="Hyperlink"/>
@@ -10026,8 +10379,8 @@
         </w:r>
       </w:hyperlink>
     </w:p>
-    <w:bookmarkEnd w:id="150"/>
-    <w:bookmarkStart w:id="152" w:name="ref-heinrichmora2025"/>
+    <w:bookmarkEnd w:id="153"/>
+    <w:bookmarkStart w:id="155" w:name="ref-heinrichmora2025"/>
     <w:p>
       <w:pPr>
         <w:pStyle w:val="Bibliography"/>
@@ -10064,7 +10417,7 @@
       <w:r>
         <w:t xml:space="preserve"> </w:t>
       </w:r>
-      <w:hyperlink r:id="rId151">
+      <w:hyperlink r:id="rId154">
         <w:r>
           <w:rPr>
             <w:rStyle w:val="Hyperlink"/>
@@ -10073,8 +10426,8 @@
         </w:r>
       </w:hyperlink>
     </w:p>
-    <w:bookmarkEnd w:id="152"/>
-    <w:bookmarkStart w:id="153" w:name="ref-henrich2020"/>
+    <w:bookmarkEnd w:id="155"/>
+    <w:bookmarkStart w:id="156" w:name="ref-henrich2020"/>
     <w:p>
       <w:pPr>
         <w:pStyle w:val="Bibliography"/>
@@ -10096,8 +10449,8 @@
         <w:t xml:space="preserve">. Farrar, Straus; Giroux.</w:t>
       </w:r>
     </w:p>
-    <w:bookmarkEnd w:id="153"/>
-    <w:bookmarkStart w:id="155" w:name="ref-henrich1998"/>
+    <w:bookmarkEnd w:id="156"/>
+    <w:bookmarkStart w:id="158" w:name="ref-henrich1998"/>
     <w:p>
       <w:pPr>
         <w:pStyle w:val="Bibliography"/>
@@ -10134,7 +10487,7 @@
       <w:r>
         <w:t xml:space="preserve"> </w:t>
       </w:r>
-      <w:hyperlink r:id="rId154">
+      <w:hyperlink r:id="rId157">
         <w:r>
           <w:rPr>
             <w:rStyle w:val="Hyperlink"/>
@@ -10143,8 +10496,8 @@
         </w:r>
       </w:hyperlink>
     </w:p>
-    <w:bookmarkEnd w:id="155"/>
-    <w:bookmarkStart w:id="157" w:name="ref-hewlett2024"/>
+    <w:bookmarkEnd w:id="158"/>
+    <w:bookmarkStart w:id="160" w:name="ref-hewlett2024"/>
     <w:p>
       <w:pPr>
         <w:pStyle w:val="Bibliography"/>
@@ -10181,7 +10534,7 @@
       <w:r>
         <w:t xml:space="preserve"> </w:t>
       </w:r>
-      <w:hyperlink r:id="rId156">
+      <w:hyperlink r:id="rId159">
         <w:r>
           <w:rPr>
             <w:rStyle w:val="Hyperlink"/>
@@ -10190,8 +10543,8 @@
         </w:r>
       </w:hyperlink>
     </w:p>
-    <w:bookmarkEnd w:id="157"/>
-    <w:bookmarkStart w:id="159" w:name="ref-hewlett2016"/>
+    <w:bookmarkEnd w:id="160"/>
+    <w:bookmarkStart w:id="162" w:name="ref-hewlett2016"/>
     <w:p>
       <w:pPr>
         <w:pStyle w:val="Bibliography"/>
@@ -10231,7 +10584,7 @@
       <w:r>
         <w:t xml:space="preserve"> </w:t>
       </w:r>
-      <w:hyperlink r:id="rId158">
+      <w:hyperlink r:id="rId161">
         <w:r>
           <w:rPr>
             <w:rStyle w:val="Hyperlink"/>
@@ -10240,8 +10593,8 @@
         </w:r>
       </w:hyperlink>
     </w:p>
-    <w:bookmarkEnd w:id="159"/>
-    <w:bookmarkStart w:id="161" w:name="ref-hirschfeld_enfant_1999"/>
+    <w:bookmarkEnd w:id="162"/>
+    <w:bookmarkStart w:id="164" w:name="ref-hirschfeld_enfant_1999"/>
     <w:p>
       <w:pPr>
         <w:pStyle w:val="Bibliography"/>
@@ -10278,7 +10631,7 @@
       <w:r>
         <w:t xml:space="preserve"> </w:t>
       </w:r>
-      <w:hyperlink r:id="rId160">
+      <w:hyperlink r:id="rId163">
         <w:r>
           <w:rPr>
             <w:rStyle w:val="Hyperlink"/>
@@ -10287,8 +10640,8 @@
         </w:r>
       </w:hyperlink>
     </w:p>
-    <w:bookmarkEnd w:id="161"/>
-    <w:bookmarkStart w:id="163" w:name="ref-hirschfeld_why_2002"/>
+    <w:bookmarkEnd w:id="164"/>
+    <w:bookmarkStart w:id="166" w:name="ref-hirschfeld_why_2002"/>
     <w:p>
       <w:pPr>
         <w:pStyle w:val="Bibliography"/>
@@ -10325,7 +10678,7 @@
       <w:r>
         <w:t xml:space="preserve"> </w:t>
       </w:r>
-      <w:hyperlink r:id="rId162">
+      <w:hyperlink r:id="rId165">
         <w:r>
           <w:rPr>
             <w:rStyle w:val="Hyperlink"/>
@@ -10334,8 +10687,8 @@
         </w:r>
       </w:hyperlink>
     </w:p>
-    <w:bookmarkEnd w:id="163"/>
-    <w:bookmarkStart w:id="165" w:name="ref-högberg2024"/>
+    <w:bookmarkEnd w:id="166"/>
+    <w:bookmarkStart w:id="168" w:name="ref-högberg2024"/>
     <w:p>
       <w:pPr>
         <w:pStyle w:val="Bibliography"/>
@@ -10372,7 +10725,7 @@
       <w:r>
         <w:t xml:space="preserve"> </w:t>
       </w:r>
-      <w:hyperlink r:id="rId164">
+      <w:hyperlink r:id="rId167">
         <w:r>
           <w:rPr>
             <w:rStyle w:val="Hyperlink"/>
@@ -10381,8 +10734,8 @@
         </w:r>
       </w:hyperlink>
     </w:p>
-    <w:bookmarkEnd w:id="165"/>
-    <w:bookmarkStart w:id="167" w:name="ref-honigmann1949"/>
+    <w:bookmarkEnd w:id="168"/>
+    <w:bookmarkStart w:id="170" w:name="ref-honigmann1949"/>
     <w:p>
       <w:pPr>
         <w:pStyle w:val="Bibliography"/>
@@ -10406,7 +10759,7 @@
       <w:r>
         <w:t xml:space="preserve"> </w:t>
       </w:r>
-      <w:hyperlink r:id="rId166">
+      <w:hyperlink r:id="rId169">
         <w:r>
           <w:rPr>
             <w:rStyle w:val="Hyperlink"/>
@@ -10415,8 +10768,8 @@
         </w:r>
       </w:hyperlink>
     </w:p>
-    <w:bookmarkEnd w:id="167"/>
-    <w:bookmarkStart w:id="168" w:name="ref-hugh-jones1979"/>
+    <w:bookmarkEnd w:id="170"/>
+    <w:bookmarkStart w:id="171" w:name="ref-hugh-jones1979"/>
     <w:p>
       <w:pPr>
         <w:pStyle w:val="Bibliography"/>
@@ -10438,8 +10791,8 @@
         <w:t xml:space="preserve">. Cambridge University Press.</w:t>
       </w:r>
     </w:p>
-    <w:bookmarkEnd w:id="168"/>
-    <w:bookmarkStart w:id="169" w:name="ref-hulstaert1938"/>
+    <w:bookmarkEnd w:id="171"/>
+    <w:bookmarkStart w:id="172" w:name="ref-hulstaert1938"/>
     <w:p>
       <w:pPr>
         <w:pStyle w:val="Bibliography"/>
@@ -10461,8 +10814,8 @@
         <w:t xml:space="preserve">. Librairie Falk fils.</w:t>
       </w:r>
     </w:p>
-    <w:bookmarkEnd w:id="169"/>
-    <w:bookmarkStart w:id="171" w:name="ref-jiménez2019"/>
+    <w:bookmarkEnd w:id="172"/>
+    <w:bookmarkStart w:id="174" w:name="ref-jiménez2019"/>
     <w:p>
       <w:pPr>
         <w:pStyle w:val="Bibliography"/>
@@ -10499,7 +10852,7 @@
       <w:r>
         <w:t xml:space="preserve"> </w:t>
       </w:r>
-      <w:hyperlink r:id="rId170">
+      <w:hyperlink r:id="rId173">
         <w:r>
           <w:rPr>
             <w:rStyle w:val="Hyperlink"/>
@@ -10508,8 +10861,8 @@
         </w:r>
       </w:hyperlink>
     </w:p>
-    <w:bookmarkEnd w:id="171"/>
-    <w:bookmarkStart w:id="172" w:name="ref-jochelson1910"/>
+    <w:bookmarkEnd w:id="174"/>
+    <w:bookmarkStart w:id="175" w:name="ref-jochelson1910"/>
     <w:p>
       <w:pPr>
         <w:pStyle w:val="Bibliography"/>
@@ -10531,8 +10884,8 @@
         <w:t xml:space="preserve">. E.J. Brill &amp; G. E. Stechert.</w:t>
       </w:r>
     </w:p>
-    <w:bookmarkEnd w:id="172"/>
-    <w:bookmarkStart w:id="174" w:name="ref-jones2002"/>
+    <w:bookmarkEnd w:id="175"/>
+    <w:bookmarkStart w:id="177" w:name="ref-jones2002"/>
     <w:p>
       <w:pPr>
         <w:pStyle w:val="Bibliography"/>
@@ -10569,7 +10922,7 @@
       <w:r>
         <w:t xml:space="preserve"> </w:t>
       </w:r>
-      <w:hyperlink r:id="rId173">
+      <w:hyperlink r:id="rId176">
         <w:r>
           <w:rPr>
             <w:rStyle w:val="Hyperlink"/>
@@ -10578,8 +10931,8 @@
         </w:r>
       </w:hyperlink>
     </w:p>
-    <w:bookmarkEnd w:id="174"/>
-    <w:bookmarkStart w:id="176" w:name="ref-kaplan2003"/>
+    <w:bookmarkEnd w:id="177"/>
+    <w:bookmarkStart w:id="179" w:name="ref-kaplan2003"/>
     <w:p>
       <w:pPr>
         <w:pStyle w:val="Bibliography"/>
@@ -10616,7 +10969,7 @@
       <w:r>
         <w:t xml:space="preserve"> </w:t>
       </w:r>
-      <w:hyperlink r:id="rId175">
+      <w:hyperlink r:id="rId178">
         <w:r>
           <w:rPr>
             <w:rStyle w:val="Hyperlink"/>
@@ -10625,8 +10978,8 @@
         </w:r>
       </w:hyperlink>
     </w:p>
-    <w:bookmarkEnd w:id="176"/>
-    <w:bookmarkStart w:id="178" w:name="ref-karakostis2021"/>
+    <w:bookmarkEnd w:id="179"/>
+    <w:bookmarkStart w:id="181" w:name="ref-karakostis2021"/>
     <w:p>
       <w:pPr>
         <w:pStyle w:val="Bibliography"/>
@@ -10663,7 +11016,7 @@
       <w:r>
         <w:t xml:space="preserve"> </w:t>
       </w:r>
-      <w:hyperlink r:id="rId177">
+      <w:hyperlink r:id="rId180">
         <w:r>
           <w:rPr>
             <w:rStyle w:val="Hyperlink"/>
@@ -10672,8 +11025,8 @@
         </w:r>
       </w:hyperlink>
     </w:p>
-    <w:bookmarkEnd w:id="178"/>
-    <w:bookmarkStart w:id="180" w:name="ref-kendal2018"/>
+    <w:bookmarkEnd w:id="181"/>
+    <w:bookmarkStart w:id="183" w:name="ref-kendal2018"/>
     <w:p>
       <w:pPr>
         <w:pStyle w:val="Bibliography"/>
@@ -10710,7 +11063,7 @@
       <w:r>
         <w:t xml:space="preserve"> </w:t>
       </w:r>
-      <w:hyperlink r:id="rId179">
+      <w:hyperlink r:id="rId182">
         <w:r>
           <w:rPr>
             <w:rStyle w:val="Hyperlink"/>
@@ -10719,8 +11072,8 @@
         </w:r>
       </w:hyperlink>
     </w:p>
-    <w:bookmarkEnd w:id="180"/>
-    <w:bookmarkStart w:id="182" w:name="ref-kilgore2025"/>
+    <w:bookmarkEnd w:id="183"/>
+    <w:bookmarkStart w:id="185" w:name="ref-kilgore2025"/>
     <w:p>
       <w:pPr>
         <w:pStyle w:val="Bibliography"/>
@@ -10744,7 +11097,7 @@
       <w:r>
         <w:t xml:space="preserve"> </w:t>
       </w:r>
-      <w:hyperlink r:id="rId181">
+      <w:hyperlink r:id="rId184">
         <w:r>
           <w:rPr>
             <w:rStyle w:val="Hyperlink"/>
@@ -10753,8 +11106,8 @@
         </w:r>
       </w:hyperlink>
     </w:p>
-    <w:bookmarkEnd w:id="182"/>
-    <w:bookmarkStart w:id="184" w:name="ref-kivell2023"/>
+    <w:bookmarkEnd w:id="185"/>
+    <w:bookmarkStart w:id="187" w:name="ref-kivell2023"/>
     <w:p>
       <w:pPr>
         <w:pStyle w:val="Bibliography"/>
@@ -10791,7 +11144,7 @@
       <w:r>
         <w:t xml:space="preserve"> </w:t>
       </w:r>
-      <w:hyperlink r:id="rId183">
+      <w:hyperlink r:id="rId186">
         <w:r>
           <w:rPr>
             <w:rStyle w:val="Hyperlink"/>
@@ -10800,8 +11153,8 @@
         </w:r>
       </w:hyperlink>
     </w:p>
-    <w:bookmarkEnd w:id="184"/>
-    <w:bookmarkStart w:id="186" w:name="ref-kline2017"/>
+    <w:bookmarkEnd w:id="187"/>
+    <w:bookmarkStart w:id="189" w:name="ref-kline2017"/>
     <w:p>
       <w:pPr>
         <w:pStyle w:val="Bibliography"/>
@@ -10838,7 +11191,7 @@
       <w:r>
         <w:t xml:space="preserve"> </w:t>
       </w:r>
-      <w:hyperlink r:id="rId185">
+      <w:hyperlink r:id="rId188">
         <w:r>
           <w:rPr>
             <w:rStyle w:val="Hyperlink"/>
@@ -10847,8 +11200,8 @@
         </w:r>
       </w:hyperlink>
     </w:p>
-    <w:bookmarkEnd w:id="186"/>
-    <w:bookmarkStart w:id="188" w:name="ref-knight2017"/>
+    <w:bookmarkEnd w:id="189"/>
+    <w:bookmarkStart w:id="191" w:name="ref-knight2017"/>
     <w:p>
       <w:pPr>
         <w:pStyle w:val="Bibliography"/>
@@ -10885,7 +11238,7 @@
       <w:r>
         <w:t xml:space="preserve"> </w:t>
       </w:r>
-      <w:hyperlink r:id="rId187">
+      <w:hyperlink r:id="rId190">
         <w:r>
           <w:rPr>
             <w:rStyle w:val="Hyperlink"/>
@@ -10894,8 +11247,8 @@
         </w:r>
       </w:hyperlink>
     </w:p>
-    <w:bookmarkEnd w:id="188"/>
-    <w:bookmarkStart w:id="190" w:name="ref-lambrecht1958"/>
+    <w:bookmarkEnd w:id="191"/>
+    <w:bookmarkStart w:id="193" w:name="ref-lambrecht1958"/>
     <w:p>
       <w:pPr>
         <w:pStyle w:val="Bibliography"/>
@@ -10932,7 +11285,7 @@
       <w:r>
         <w:t xml:space="preserve"> </w:t>
       </w:r>
-      <w:hyperlink r:id="rId189">
+      <w:hyperlink r:id="rId192">
         <w:r>
           <w:rPr>
             <w:rStyle w:val="Hyperlink"/>
@@ -10941,8 +11294,8 @@
         </w:r>
       </w:hyperlink>
     </w:p>
-    <w:bookmarkEnd w:id="190"/>
-    <w:bookmarkStart w:id="192" w:name="ref-lancy1975"/>
+    <w:bookmarkEnd w:id="193"/>
+    <w:bookmarkStart w:id="195" w:name="ref-lancy1975"/>
     <w:p>
       <w:pPr>
         <w:pStyle w:val="Bibliography"/>
@@ -10997,7 +11350,7 @@
       <w:r>
         <w:t xml:space="preserve"> </w:t>
       </w:r>
-      <w:hyperlink r:id="rId191">
+      <w:hyperlink r:id="rId194">
         <w:r>
           <w:rPr>
             <w:rStyle w:val="Hyperlink"/>
@@ -11006,8 +11359,8 @@
         </w:r>
       </w:hyperlink>
     </w:p>
-    <w:bookmarkEnd w:id="192"/>
-    <w:bookmarkStart w:id="193" w:name="ref-lancy1996"/>
+    <w:bookmarkEnd w:id="195"/>
+    <w:bookmarkStart w:id="196" w:name="ref-lancy1996"/>
     <w:p>
       <w:pPr>
         <w:pStyle w:val="Bibliography"/>
@@ -11029,8 +11382,8 @@
         <w:t xml:space="preserve">. Guilford Press.</w:t>
       </w:r>
     </w:p>
-    <w:bookmarkEnd w:id="193"/>
-    <w:bookmarkStart w:id="195" w:name="ref-lancy2010"/>
+    <w:bookmarkEnd w:id="196"/>
+    <w:bookmarkStart w:id="198" w:name="ref-lancy2010"/>
     <w:p>
       <w:pPr>
         <w:pStyle w:val="Bibliography"/>
@@ -11067,7 +11420,7 @@
       <w:r>
         <w:t xml:space="preserve"> </w:t>
       </w:r>
-      <w:hyperlink r:id="rId194">
+      <w:hyperlink r:id="rId197">
         <w:r>
           <w:rPr>
             <w:rStyle w:val="Hyperlink"/>
@@ -11076,8 +11429,8 @@
         </w:r>
       </w:hyperlink>
     </w:p>
-    <w:bookmarkEnd w:id="195"/>
-    <w:bookmarkStart w:id="197" w:name="ref-lancy2017"/>
+    <w:bookmarkEnd w:id="198"/>
+    <w:bookmarkStart w:id="200" w:name="ref-lancy2017"/>
     <w:p>
       <w:pPr>
         <w:pStyle w:val="Bibliography"/>
@@ -11114,7 +11467,7 @@
       <w:r>
         <w:t xml:space="preserve"> </w:t>
       </w:r>
-      <w:hyperlink r:id="rId196">
+      <w:hyperlink r:id="rId199">
         <w:r>
           <w:rPr>
             <w:rStyle w:val="Hyperlink"/>
@@ -11123,8 +11476,8 @@
         </w:r>
       </w:hyperlink>
     </w:p>
-    <w:bookmarkEnd w:id="197"/>
-    <w:bookmarkStart w:id="199" w:name="ref-langley2020"/>
+    <w:bookmarkEnd w:id="200"/>
+    <w:bookmarkStart w:id="202" w:name="ref-langley2020"/>
     <w:p>
       <w:pPr>
         <w:pStyle w:val="Bibliography"/>
@@ -11161,7 +11514,7 @@
       <w:r>
         <w:t xml:space="preserve"> </w:t>
       </w:r>
-      <w:hyperlink r:id="rId198">
+      <w:hyperlink r:id="rId201">
         <w:r>
           <w:rPr>
             <w:rStyle w:val="Hyperlink"/>
@@ -11170,8 +11523,8 @@
         </w:r>
       </w:hyperlink>
     </w:p>
-    <w:bookmarkEnd w:id="199"/>
-    <w:bookmarkStart w:id="201" w:name="ref-lew-levy2024"/>
+    <w:bookmarkEnd w:id="202"/>
+    <w:bookmarkStart w:id="204" w:name="ref-lew-levy2024"/>
     <w:p>
       <w:pPr>
         <w:pStyle w:val="Bibliography"/>
@@ -11195,7 +11548,7 @@
       <w:r>
         <w:t xml:space="preserve"> </w:t>
       </w:r>
-      <w:hyperlink r:id="rId200">
+      <w:hyperlink r:id="rId203">
         <w:r>
           <w:rPr>
             <w:rStyle w:val="Hyperlink"/>
@@ -11204,8 +11557,8 @@
         </w:r>
       </w:hyperlink>
     </w:p>
-    <w:bookmarkEnd w:id="201"/>
-    <w:bookmarkStart w:id="203" w:name="ref-lew-levy2022"/>
+    <w:bookmarkEnd w:id="204"/>
+    <w:bookmarkStart w:id="206" w:name="ref-lew-levy2022"/>
     <w:p>
       <w:pPr>
         <w:pStyle w:val="Bibliography"/>
@@ -11308,7 +11661,7 @@
       <w:r>
         <w:t xml:space="preserve"> </w:t>
       </w:r>
-      <w:hyperlink r:id="rId202">
+      <w:hyperlink r:id="rId205">
         <w:r>
           <w:rPr>
             <w:rStyle w:val="Hyperlink"/>
@@ -11317,8 +11670,8 @@
         </w:r>
       </w:hyperlink>
     </w:p>
-    <w:bookmarkEnd w:id="203"/>
-    <w:bookmarkStart w:id="205" w:name="ref-lew-levy2023"/>
+    <w:bookmarkEnd w:id="206"/>
+    <w:bookmarkStart w:id="208" w:name="ref-lew-levy2023"/>
     <w:p>
       <w:pPr>
         <w:pStyle w:val="Bibliography"/>
@@ -11355,7 +11708,7 @@
       <w:r>
         <w:t xml:space="preserve"> </w:t>
       </w:r>
-      <w:hyperlink r:id="rId204">
+      <w:hyperlink r:id="rId207">
         <w:r>
           <w:rPr>
             <w:rStyle w:val="Hyperlink"/>
@@ -11364,8 +11717,8 @@
         </w:r>
       </w:hyperlink>
     </w:p>
-    <w:bookmarkEnd w:id="205"/>
-    <w:bookmarkStart w:id="207" w:name="ref-lew-levyWhoTeachesChildren2020a"/>
+    <w:bookmarkEnd w:id="208"/>
+    <w:bookmarkStart w:id="210" w:name="ref-lew-levyWhoTeachesChildren2020a"/>
     <w:p>
       <w:pPr>
         <w:pStyle w:val="Bibliography"/>
@@ -11471,7 +11824,7 @@
       <w:r>
         <w:t xml:space="preserve"> </w:t>
       </w:r>
-      <w:hyperlink r:id="rId206">
+      <w:hyperlink r:id="rId209">
         <w:r>
           <w:rPr>
             <w:rStyle w:val="Hyperlink"/>
@@ -11480,8 +11833,8 @@
         </w:r>
       </w:hyperlink>
     </w:p>
-    <w:bookmarkEnd w:id="207"/>
-    <w:bookmarkStart w:id="209" w:name="ref-lew-levy2018"/>
+    <w:bookmarkEnd w:id="210"/>
+    <w:bookmarkStart w:id="212" w:name="ref-lew-levy2018"/>
     <w:p>
       <w:pPr>
         <w:pStyle w:val="Bibliography"/>
@@ -11518,7 +11871,7 @@
       <w:r>
         <w:t xml:space="preserve"> </w:t>
       </w:r>
-      <w:hyperlink r:id="rId208">
+      <w:hyperlink r:id="rId211">
         <w:r>
           <w:rPr>
             <w:rStyle w:val="Hyperlink"/>
@@ -11527,8 +11880,8 @@
         </w:r>
       </w:hyperlink>
     </w:p>
-    <w:bookmarkEnd w:id="209"/>
-    <w:bookmarkStart w:id="211" w:name="ref-lew-levy2020"/>
+    <w:bookmarkEnd w:id="212"/>
+    <w:bookmarkStart w:id="214" w:name="ref-lew-levy2020"/>
     <w:p>
       <w:pPr>
         <w:pStyle w:val="Bibliography"/>
@@ -11568,7 +11921,7 @@
       <w:r>
         <w:t xml:space="preserve"> </w:t>
       </w:r>
-      <w:hyperlink r:id="rId210">
+      <w:hyperlink r:id="rId213">
         <w:r>
           <w:rPr>
             <w:rStyle w:val="Hyperlink"/>
@@ -11577,8 +11930,8 @@
         </w:r>
       </w:hyperlink>
     </w:p>
-    <w:bookmarkEnd w:id="211"/>
-    <w:bookmarkStart w:id="213" w:name="ref-lew-levy2017"/>
+    <w:bookmarkEnd w:id="214"/>
+    <w:bookmarkStart w:id="216" w:name="ref-lew-levy2017"/>
     <w:p>
       <w:pPr>
         <w:pStyle w:val="Bibliography"/>
@@ -11615,7 +11968,7 @@
       <w:r>
         <w:t xml:space="preserve"> </w:t>
       </w:r>
-      <w:hyperlink r:id="rId212">
+      <w:hyperlink r:id="rId215">
         <w:r>
           <w:rPr>
             <w:rStyle w:val="Hyperlink"/>
@@ -11624,8 +11977,8 @@
         </w:r>
       </w:hyperlink>
     </w:p>
-    <w:bookmarkEnd w:id="213"/>
-    <w:bookmarkStart w:id="214" w:name="ref-little1951"/>
+    <w:bookmarkEnd w:id="216"/>
+    <w:bookmarkStart w:id="217" w:name="ref-little1951"/>
     <w:p>
       <w:pPr>
         <w:pStyle w:val="Bibliography"/>
@@ -11650,13 +12003,60 @@
         <w:t xml:space="preserve">(First Edition). Routledge &amp; Kegan Paul, Limited.</w:t>
       </w:r>
     </w:p>
-    <w:bookmarkEnd w:id="214"/>
-    <w:bookmarkStart w:id="216" w:name="ref-liu2023"/>
+    <w:bookmarkEnd w:id="217"/>
+    <w:bookmarkStart w:id="219" w:name="ref-liu2024"/>
     <w:p>
       <w:pPr>
         <w:pStyle w:val="Bibliography"/>
       </w:pPr>
       <w:r>
+        <w:t xml:space="preserve">Liu, C. (2024). Variation Matters: Expanding the Scope of Experimental Archaeology.</w:t>
+      </w:r>
+      <w:r>
+        <w:t xml:space="preserve"> </w:t>
+      </w:r>
+      <w:r>
+        <w:rPr>
+          <w:iCs/>
+          <w:i/>
+        </w:rPr>
+        <w:t xml:space="preserve">Advances in Archaeological Practice</w:t>
+      </w:r>
+      <w:r>
+        <w:t xml:space="preserve">,</w:t>
+      </w:r>
+      <w:r>
+        <w:t xml:space="preserve"> </w:t>
+      </w:r>
+      <w:r>
+        <w:rPr>
+          <w:iCs/>
+          <w:i/>
+        </w:rPr>
+        <w:t xml:space="preserve">12</w:t>
+      </w:r>
+      <w:r>
+        <w:t xml:space="preserve">(4), 375–389.</w:t>
+      </w:r>
+      <w:r>
+        <w:t xml:space="preserve"> </w:t>
+      </w:r>
+      <w:hyperlink r:id="rId218">
+        <w:r>
+          <w:rPr>
+            <w:rStyle w:val="Hyperlink"/>
+          </w:rPr>
+          <w:t xml:space="preserve">https://doi.org/10.1017/aap.2024.30</w:t>
+        </w:r>
+      </w:hyperlink>
+    </w:p>
+    <w:bookmarkEnd w:id="219"/>
+    <w:bookmarkStart w:id="221" w:name="ref-liu2023"/>
+    <w:p>
+      <w:pPr>
+        <w:pStyle w:val="Bibliography"/>
+      </w:pPr>
+      <w:r>
         <w:t xml:space="preserve">Liu, C., &amp; Stout, D. (2023). Inferring cultural reproduction from lithic data: A critical review.</w:t>
       </w:r>
       <w:r>
@@ -11688,7 +12088,7 @@
       <w:r>
         <w:t xml:space="preserve"> </w:t>
       </w:r>
-      <w:hyperlink r:id="rId215">
+      <w:hyperlink r:id="rId220">
         <w:r>
           <w:rPr>
             <w:rStyle w:val="Hyperlink"/>
@@ -11697,13 +12097,94 @@
         </w:r>
       </w:hyperlink>
     </w:p>
-    <w:bookmarkEnd w:id="216"/>
-    <w:bookmarkStart w:id="218" w:name="ref-malafouris2012"/>
+    <w:bookmarkEnd w:id="221"/>
+    <w:bookmarkStart w:id="223" w:name="ref-lloyd1953"/>
     <w:p>
       <w:pPr>
         <w:pStyle w:val="Bibliography"/>
       </w:pPr>
       <w:r>
+        <w:t xml:space="preserve">Lloyd, P. (1953). Craft organization in yoruba towns.</w:t>
+      </w:r>
+      <w:r>
+        <w:t xml:space="preserve"> </w:t>
+      </w:r>
+      <w:r>
+        <w:rPr>
+          <w:iCs/>
+          <w:i/>
+        </w:rPr>
+        <w:t xml:space="preserve">Africa</w:t>
+      </w:r>
+      <w:r>
+        <w:t xml:space="preserve">,</w:t>
+      </w:r>
+      <w:r>
+        <w:t xml:space="preserve"> </w:t>
+      </w:r>
+      <w:r>
+        <w:rPr>
+          <w:iCs/>
+          <w:i/>
+        </w:rPr>
+        <w:t xml:space="preserve">23</w:t>
+      </w:r>
+      <w:r>
+        <w:t xml:space="preserve">(1), 3044.</w:t>
+      </w:r>
+      <w:r>
+        <w:t xml:space="preserve"> </w:t>
+      </w:r>
+      <w:hyperlink r:id="rId222">
+        <w:r>
+          <w:rPr>
+            <w:rStyle w:val="Hyperlink"/>
+          </w:rPr>
+          <w:t xml:space="preserve">https://www.cambridge.org/core/journals/africa/article/craft-organization-in-yoruba-towns1/91C914583A17E012C0C11CA586C9951D</w:t>
+        </w:r>
+      </w:hyperlink>
+    </w:p>
+    <w:bookmarkEnd w:id="223"/>
+    <w:bookmarkStart w:id="225" w:name="ref-mair1934"/>
+    <w:p>
+      <w:pPr>
+        <w:pStyle w:val="Bibliography"/>
+      </w:pPr>
+      <w:r>
+        <w:t xml:space="preserve">Mair, L. P. (1934).</w:t>
+      </w:r>
+      <w:r>
+        <w:t xml:space="preserve"> </w:t>
+      </w:r>
+      <w:r>
+        <w:rPr>
+          <w:iCs/>
+          <w:i/>
+        </w:rPr>
+        <w:t xml:space="preserve">An African people in the twentieth century</w:t>
+      </w:r>
+      <w:r>
+        <w:t xml:space="preserve">. George Routledge &amp; Sons.</w:t>
+      </w:r>
+      <w:r>
+        <w:t xml:space="preserve"> </w:t>
+      </w:r>
+      <w:hyperlink r:id="rId224">
+        <w:r>
+          <w:rPr>
+            <w:rStyle w:val="Hyperlink"/>
+          </w:rPr>
+          <w:t xml:space="preserve">http://archive.org/details/africanpeopleint0000mair</w:t>
+        </w:r>
+      </w:hyperlink>
+    </w:p>
+    <w:bookmarkEnd w:id="225"/>
+    <w:bookmarkStart w:id="227" w:name="ref-malafouris2012"/>
+    <w:p>
+      <w:pPr>
+        <w:pStyle w:val="Bibliography"/>
+      </w:pPr>
+      <w:r>
         <w:t xml:space="preserve">Malafouris, L. (2012). Prosthetic gestures: how the tool shapes the mind.</w:t>
       </w:r>
       <w:r>
@@ -11735,7 +12216,7 @@
       <w:r>
         <w:t xml:space="preserve"> </w:t>
       </w:r>
-      <w:hyperlink r:id="rId217">
+      <w:hyperlink r:id="rId226">
         <w:r>
           <w:rPr>
             <w:rStyle w:val="Hyperlink"/>
@@ -11744,8 +12225,8 @@
         </w:r>
       </w:hyperlink>
     </w:p>
-    <w:bookmarkEnd w:id="218"/>
-    <w:bookmarkStart w:id="220" w:name="ref-malafouris2021"/>
+    <w:bookmarkEnd w:id="227"/>
+    <w:bookmarkStart w:id="229" w:name="ref-malafouris2021"/>
     <w:p>
       <w:pPr>
         <w:pStyle w:val="Bibliography"/>
@@ -11782,7 +12263,7 @@
       <w:r>
         <w:t xml:space="preserve"> </w:t>
       </w:r>
-      <w:hyperlink r:id="rId219">
+      <w:hyperlink r:id="rId228">
         <w:r>
           <w:rPr>
             <w:rStyle w:val="Hyperlink"/>
@@ -11791,8 +12272,8 @@
         </w:r>
       </w:hyperlink>
     </w:p>
-    <w:bookmarkEnd w:id="220"/>
-    <w:bookmarkStart w:id="222" w:name="ref-marwick2017"/>
+    <w:bookmarkEnd w:id="229"/>
+    <w:bookmarkStart w:id="231" w:name="ref-marwick2017"/>
     <w:p>
       <w:pPr>
         <w:pStyle w:val="Bibliography"/>
@@ -11829,7 +12310,7 @@
       <w:r>
         <w:t xml:space="preserve"> </w:t>
       </w:r>
-      <w:hyperlink r:id="rId221">
+      <w:hyperlink r:id="rId230">
         <w:r>
           <w:rPr>
             <w:rStyle w:val="Hyperlink"/>
@@ -11838,8 +12319,8 @@
         </w:r>
       </w:hyperlink>
     </w:p>
-    <w:bookmarkEnd w:id="222"/>
-    <w:bookmarkStart w:id="224" w:name="ref-marzke2013"/>
+    <w:bookmarkEnd w:id="231"/>
+    <w:bookmarkStart w:id="233" w:name="ref-marzke2013"/>
     <w:p>
       <w:pPr>
         <w:pStyle w:val="Bibliography"/>
@@ -11876,7 +12357,7 @@
       <w:r>
         <w:t xml:space="preserve"> </w:t>
       </w:r>
-      <w:hyperlink r:id="rId223">
+      <w:hyperlink r:id="rId232">
         <w:r>
           <w:rPr>
             <w:rStyle w:val="Hyperlink"/>
@@ -11885,8 +12366,8 @@
         </w:r>
       </w:hyperlink>
     </w:p>
-    <w:bookmarkEnd w:id="224"/>
-    <w:bookmarkStart w:id="226" w:name="ref-maynard2024"/>
+    <w:bookmarkEnd w:id="233"/>
+    <w:bookmarkStart w:id="235" w:name="ref-maynard2024"/>
     <w:p>
       <w:pPr>
         <w:pStyle w:val="Bibliography"/>
@@ -11923,7 +12404,7 @@
       <w:r>
         <w:t xml:space="preserve"> </w:t>
       </w:r>
-      <w:hyperlink r:id="rId225">
+      <w:hyperlink r:id="rId234">
         <w:r>
           <w:rPr>
             <w:rStyle w:val="Hyperlink"/>
@@ -11932,8 +12413,8 @@
         </w:r>
       </w:hyperlink>
     </w:p>
-    <w:bookmarkEnd w:id="226"/>
-    <w:bookmarkStart w:id="228" w:name="ref-mcguigan2012"/>
+    <w:bookmarkEnd w:id="235"/>
+    <w:bookmarkStart w:id="237" w:name="ref-mcguigan2012"/>
     <w:p>
       <w:pPr>
         <w:pStyle w:val="Bibliography"/>
@@ -11970,7 +12451,7 @@
       <w:r>
         <w:t xml:space="preserve"> </w:t>
       </w:r>
-      <w:hyperlink r:id="rId227">
+      <w:hyperlink r:id="rId236">
         <w:r>
           <w:rPr>
             <w:rStyle w:val="Hyperlink"/>
@@ -11979,8 +12460,8 @@
         </w:r>
       </w:hyperlink>
     </w:p>
-    <w:bookmarkEnd w:id="228"/>
-    <w:bookmarkStart w:id="229" w:name="ref-mead1964"/>
+    <w:bookmarkEnd w:id="237"/>
+    <w:bookmarkStart w:id="238" w:name="ref-mead1964"/>
     <w:p>
       <w:pPr>
         <w:pStyle w:val="Bibliography"/>
@@ -12002,8 +12483,8 @@
         <w:t xml:space="preserve">. Yale University Press.</w:t>
       </w:r>
     </w:p>
-    <w:bookmarkEnd w:id="229"/>
-    <w:bookmarkStart w:id="230" w:name="ref-nadel1947"/>
+    <w:bookmarkEnd w:id="238"/>
+    <w:bookmarkStart w:id="239" w:name="ref-nadel1947"/>
     <w:p>
       <w:pPr>
         <w:pStyle w:val="Bibliography"/>
@@ -12025,13 +12506,47 @@
         <w:t xml:space="preserve">. Oxford University Press.</w:t>
       </w:r>
     </w:p>
-    <w:bookmarkEnd w:id="230"/>
-    <w:bookmarkStart w:id="231" w:name="ref-nash1970"/>
+    <w:bookmarkEnd w:id="239"/>
+    <w:bookmarkStart w:id="241" w:name="ref-naik1956"/>
     <w:p>
       <w:pPr>
         <w:pStyle w:val="Bibliography"/>
       </w:pPr>
       <w:r>
+        <w:t xml:space="preserve">Naik, T. B. (1956).</w:t>
+      </w:r>
+      <w:r>
+        <w:t xml:space="preserve"> </w:t>
+      </w:r>
+      <w:r>
+        <w:rPr>
+          <w:iCs/>
+          <w:i/>
+        </w:rPr>
+        <w:t xml:space="preserve">The Bhils: A Study</w:t>
+      </w:r>
+      <w:r>
+        <w:t xml:space="preserve">. Bharatiya Adimjati Sevak Sangh.</w:t>
+      </w:r>
+      <w:r>
+        <w:t xml:space="preserve"> </w:t>
+      </w:r>
+      <w:hyperlink r:id="rId240">
+        <w:r>
+          <w:rPr>
+            <w:rStyle w:val="Hyperlink"/>
+          </w:rPr>
+          <w:t xml:space="preserve">http://archive.org/details/dli.ernet.51866</w:t>
+        </w:r>
+      </w:hyperlink>
+    </w:p>
+    <w:bookmarkEnd w:id="241"/>
+    <w:bookmarkStart w:id="242" w:name="ref-nash1970"/>
+    <w:p>
+      <w:pPr>
+        <w:pStyle w:val="Bibliography"/>
+      </w:pPr>
+      <w:r>
         <w:t xml:space="preserve">Nash, J. C. (1970).</w:t>
       </w:r>
       <w:r>
@@ -12048,13 +12563,36 @@
         <w:t xml:space="preserve">. Yale University Press.</w:t>
       </w:r>
     </w:p>
-    <w:bookmarkEnd w:id="231"/>
-    <w:bookmarkStart w:id="233" w:name="ref-osiurak2021"/>
+    <w:bookmarkEnd w:id="242"/>
+    <w:bookmarkStart w:id="243" w:name="ref-opler1969"/>
     <w:p>
       <w:pPr>
         <w:pStyle w:val="Bibliography"/>
       </w:pPr>
       <w:r>
+        <w:t xml:space="preserve">Opler, M. E. (1969).</w:t>
+      </w:r>
+      <w:r>
+        <w:t xml:space="preserve"> </w:t>
+      </w:r>
+      <w:r>
+        <w:rPr>
+          <w:iCs/>
+          <w:i/>
+        </w:rPr>
+        <w:t xml:space="preserve">Apache odyssey: A journey between two worlds</w:t>
+      </w:r>
+      <w:r>
+        <w:t xml:space="preserve">. Holt, Rinehart; Winston.</w:t>
+      </w:r>
+    </w:p>
+    <w:bookmarkEnd w:id="243"/>
+    <w:bookmarkStart w:id="245" w:name="ref-osiurak2021"/>
+    <w:p>
+      <w:pPr>
+        <w:pStyle w:val="Bibliography"/>
+      </w:pPr>
+      <w:r>
         <w:t xml:space="preserve">Osiurak, F., Lasserre, S., Arbanti, J., Brogniart, J., Bluet, A., Navarro, J., &amp; Reynaud, E. (2021). Technical reasoning is important for cumulative technological culture.</w:t>
       </w:r>
       <w:r>
@@ -12086,7 +12624,7 @@
       <w:r>
         <w:t xml:space="preserve"> </w:t>
       </w:r>
-      <w:hyperlink r:id="rId232">
+      <w:hyperlink r:id="rId244">
         <w:r>
           <w:rPr>
             <w:rStyle w:val="Hyperlink"/>
@@ -12095,8 +12633,8 @@
         </w:r>
       </w:hyperlink>
     </w:p>
-    <w:bookmarkEnd w:id="233"/>
-    <w:bookmarkStart w:id="235" w:name="ref-osiurak2020"/>
+    <w:bookmarkEnd w:id="245"/>
+    <w:bookmarkStart w:id="247" w:name="ref-osiurak2020"/>
     <w:p>
       <w:pPr>
         <w:pStyle w:val="Bibliography"/>
@@ -12133,7 +12671,7 @@
       <w:r>
         <w:t xml:space="preserve"> </w:t>
       </w:r>
-      <w:hyperlink r:id="rId234">
+      <w:hyperlink r:id="rId246">
         <w:r>
           <w:rPr>
             <w:rStyle w:val="Hyperlink"/>
@@ -12142,8 +12680,8 @@
         </w:r>
       </w:hyperlink>
     </w:p>
-    <w:bookmarkEnd w:id="235"/>
-    <w:bookmarkStart w:id="237" w:name="ref-osterhaus2021"/>
+    <w:bookmarkEnd w:id="247"/>
+    <w:bookmarkStart w:id="249" w:name="ref-osterhaus2021"/>
     <w:p>
       <w:pPr>
         <w:pStyle w:val="Bibliography"/>
@@ -12180,7 +12718,7 @@
       <w:r>
         <w:t xml:space="preserve"> </w:t>
       </w:r>
-      <w:hyperlink r:id="rId236">
+      <w:hyperlink r:id="rId248">
         <w:r>
           <w:rPr>
             <w:rStyle w:val="Hyperlink"/>
@@ -12189,8 +12727,8 @@
         </w:r>
       </w:hyperlink>
     </w:p>
-    <w:bookmarkEnd w:id="237"/>
-    <w:bookmarkStart w:id="238" w:name="ref-perequin2020"/>
+    <w:bookmarkEnd w:id="249"/>
+    <w:bookmarkStart w:id="250" w:name="ref-perequin2020"/>
     <w:p>
       <w:pPr>
         <w:pStyle w:val="Bibliography"/>
@@ -12212,8 +12750,8 @@
         <w:t xml:space="preserve">. Oxbow Books.</w:t>
       </w:r>
     </w:p>
-    <w:bookmarkEnd w:id="238"/>
-    <w:bookmarkStart w:id="239" w:name="ref-pospisil1958"/>
+    <w:bookmarkEnd w:id="250"/>
+    <w:bookmarkStart w:id="251" w:name="ref-pospisil1958"/>
     <w:p>
       <w:pPr>
         <w:pStyle w:val="Bibliography"/>
@@ -12235,8 +12773,8 @@
         <w:t xml:space="preserve">. Yale University Press.</w:t>
       </w:r>
     </w:p>
-    <w:bookmarkEnd w:id="239"/>
-    <w:bookmarkStart w:id="241" w:name="ref-richards1939"/>
+    <w:bookmarkEnd w:id="251"/>
+    <w:bookmarkStart w:id="253" w:name="ref-richards1939"/>
     <w:p>
       <w:pPr>
         <w:pStyle w:val="Bibliography"/>
@@ -12260,7 +12798,7 @@
       <w:r>
         <w:t xml:space="preserve"> </w:t>
       </w:r>
-      <w:hyperlink r:id="rId240">
+      <w:hyperlink r:id="rId252">
         <w:r>
           <w:rPr>
             <w:rStyle w:val="Hyperlink"/>
@@ -12269,8 +12807,8 @@
         </w:r>
       </w:hyperlink>
     </w:p>
-    <w:bookmarkEnd w:id="241"/>
-    <w:bookmarkStart w:id="243" w:name="ref-riede2023"/>
+    <w:bookmarkEnd w:id="253"/>
+    <w:bookmarkStart w:id="255" w:name="ref-riede2023"/>
     <w:p>
       <w:pPr>
         <w:pStyle w:val="Bibliography"/>
@@ -12310,7 +12848,7 @@
       <w:r>
         <w:t xml:space="preserve"> </w:t>
       </w:r>
-      <w:hyperlink r:id="rId242">
+      <w:hyperlink r:id="rId254">
         <w:r>
           <w:rPr>
             <w:rStyle w:val="Hyperlink"/>
@@ -12319,8 +12857,8 @@
         </w:r>
       </w:hyperlink>
     </w:p>
-    <w:bookmarkEnd w:id="243"/>
-    <w:bookmarkStart w:id="245" w:name="ref-schniter2023"/>
+    <w:bookmarkEnd w:id="255"/>
+    <w:bookmarkStart w:id="257" w:name="ref-schniter2023"/>
     <w:p>
       <w:pPr>
         <w:pStyle w:val="Bibliography"/>
@@ -12357,7 +12895,7 @@
       <w:r>
         <w:t xml:space="preserve"> </w:t>
       </w:r>
-      <w:hyperlink r:id="rId244">
+      <w:hyperlink r:id="rId256">
         <w:r>
           <w:rPr>
             <w:rStyle w:val="Hyperlink"/>
@@ -12366,8 +12904,8 @@
         </w:r>
       </w:hyperlink>
     </w:p>
-    <w:bookmarkEnd w:id="245"/>
-    <w:bookmarkStart w:id="246" w:name="ref-scoditti1989"/>
+    <w:bookmarkEnd w:id="257"/>
+    <w:bookmarkStart w:id="258" w:name="ref-scoditti1989"/>
     <w:p>
       <w:pPr>
         <w:pStyle w:val="Bibliography"/>
@@ -12389,8 +12927,8 @@
         <w:t xml:space="preserve">. Walter de Gruyter.</w:t>
       </w:r>
     </w:p>
-    <w:bookmarkEnd w:id="246"/>
-    <w:bookmarkStart w:id="247" w:name="ref-smith1940"/>
+    <w:bookmarkEnd w:id="258"/>
+    <w:bookmarkStart w:id="259" w:name="ref-smith1940"/>
     <w:p>
       <w:pPr>
         <w:pStyle w:val="Bibliography"/>
@@ -12412,8 +12950,8 @@
         <w:t xml:space="preserve">. Columbia University Press.</w:t>
       </w:r>
     </w:p>
-    <w:bookmarkEnd w:id="247"/>
-    <w:bookmarkStart w:id="249" w:name="ref-sterelny_veiled_2021"/>
+    <w:bookmarkEnd w:id="259"/>
+    <w:bookmarkStart w:id="261" w:name="ref-sterelny_veiled_2021"/>
     <w:p>
       <w:pPr>
         <w:pStyle w:val="Bibliography"/>
@@ -12450,7 +12988,7 @@
       <w:r>
         <w:t xml:space="preserve"> </w:t>
       </w:r>
-      <w:hyperlink r:id="rId248">
+      <w:hyperlink r:id="rId260">
         <w:r>
           <w:rPr>
             <w:rStyle w:val="Hyperlink"/>
@@ -12459,8 +12997,8 @@
         </w:r>
       </w:hyperlink>
     </w:p>
-    <w:bookmarkEnd w:id="249"/>
-    <w:bookmarkStart w:id="251" w:name="ref-stout2002"/>
+    <w:bookmarkEnd w:id="261"/>
+    <w:bookmarkStart w:id="263" w:name="ref-stout2002"/>
     <w:p>
       <w:pPr>
         <w:pStyle w:val="Bibliography"/>
@@ -12497,7 +13035,7 @@
       <w:r>
         <w:t xml:space="preserve"> </w:t>
       </w:r>
-      <w:hyperlink r:id="rId250">
+      <w:hyperlink r:id="rId262">
         <w:r>
           <w:rPr>
             <w:rStyle w:val="Hyperlink"/>
@@ -12506,8 +13044,8 @@
         </w:r>
       </w:hyperlink>
     </w:p>
-    <w:bookmarkEnd w:id="251"/>
-    <w:bookmarkStart w:id="253" w:name="ref-stoutCognitiveScienceTechnology2021"/>
+    <w:bookmarkEnd w:id="263"/>
+    <w:bookmarkStart w:id="265" w:name="ref-stoutCognitiveScienceTechnology2021"/>
     <w:p>
       <w:pPr>
         <w:pStyle w:val="Bibliography"/>
@@ -12544,7 +13082,7 @@
       <w:r>
         <w:t xml:space="preserve"> </w:t>
       </w:r>
-      <w:hyperlink r:id="rId252">
+      <w:hyperlink r:id="rId264">
         <w:r>
           <w:rPr>
             <w:rStyle w:val="Hyperlink"/>
@@ -12553,8 +13091,8 @@
         </w:r>
       </w:hyperlink>
     </w:p>
-    <w:bookmarkEnd w:id="253"/>
-    <w:bookmarkStart w:id="255" w:name="ref-stout2007"/>
+    <w:bookmarkEnd w:id="265"/>
+    <w:bookmarkStart w:id="267" w:name="ref-stout2007"/>
     <w:p>
       <w:pPr>
         <w:pStyle w:val="Bibliography"/>
@@ -12591,7 +13129,7 @@
       <w:r>
         <w:t xml:space="preserve"> </w:t>
       </w:r>
-      <w:hyperlink r:id="rId254">
+      <w:hyperlink r:id="rId266">
         <w:r>
           <w:rPr>
             <w:rStyle w:val="Hyperlink"/>
@@ -12600,8 +13138,8 @@
         </w:r>
       </w:hyperlink>
     </w:p>
-    <w:bookmarkEnd w:id="255"/>
-    <w:bookmarkStart w:id="257" w:name="ref-stout2023"/>
+    <w:bookmarkEnd w:id="267"/>
+    <w:bookmarkStart w:id="269" w:name="ref-stout2023"/>
     <w:p>
       <w:pPr>
         <w:pStyle w:val="Bibliography"/>
@@ -12707,7 +13245,7 @@
       <w:r>
         <w:t xml:space="preserve"> </w:t>
       </w:r>
-      <w:hyperlink r:id="rId256">
+      <w:hyperlink r:id="rId268">
         <w:r>
           <w:rPr>
             <w:rStyle w:val="Hyperlink"/>
@@ -12716,8 +13254,8 @@
         </w:r>
       </w:hyperlink>
     </w:p>
-    <w:bookmarkEnd w:id="257"/>
-    <w:bookmarkStart w:id="259" w:name="ref-stout2015"/>
+    <w:bookmarkEnd w:id="269"/>
+    <w:bookmarkStart w:id="271" w:name="ref-stout2015"/>
     <w:p>
       <w:pPr>
         <w:pStyle w:val="Bibliography"/>
@@ -12754,7 +13292,7 @@
       <w:r>
         <w:t xml:space="preserve"> </w:t>
       </w:r>
-      <w:hyperlink r:id="rId258">
+      <w:hyperlink r:id="rId270">
         <w:r>
           <w:rPr>
             <w:rStyle w:val="Hyperlink"/>
@@ -12763,8 +13301,8 @@
         </w:r>
       </w:hyperlink>
     </w:p>
-    <w:bookmarkEnd w:id="259"/>
-    <w:bookmarkStart w:id="261" w:name="ref-teit1956"/>
+    <w:bookmarkEnd w:id="271"/>
+    <w:bookmarkStart w:id="273" w:name="ref-teit1956"/>
     <w:p>
       <w:pPr>
         <w:pStyle w:val="Bibliography"/>
@@ -12801,7 +13339,7 @@
       <w:r>
         <w:t xml:space="preserve"> </w:t>
       </w:r>
-      <w:hyperlink r:id="rId260">
+      <w:hyperlink r:id="rId272">
         <w:r>
           <w:rPr>
             <w:rStyle w:val="Hyperlink"/>
@@ -12810,8 +13348,8 @@
         </w:r>
       </w:hyperlink>
     </w:p>
-    <w:bookmarkEnd w:id="261"/>
-    <w:bookmarkStart w:id="262" w:name="ref-theodoratus1971"/>
+    <w:bookmarkEnd w:id="273"/>
+    <w:bookmarkStart w:id="274" w:name="ref-theodoratus1971"/>
     <w:p>
       <w:pPr>
         <w:pStyle w:val="Bibliography"/>
@@ -12836,8 +13374,8 @@
         <w:t xml:space="preserve">[PhD thesis].</w:t>
       </w:r>
     </w:p>
-    <w:bookmarkEnd w:id="262"/>
-    <w:bookmarkStart w:id="264" w:name="ref-tierneyExpandingTidyData2020"/>
+    <w:bookmarkEnd w:id="274"/>
+    <w:bookmarkStart w:id="276" w:name="ref-tierneyExpandingTidyData2020"/>
     <w:p>
       <w:pPr>
         <w:pStyle w:val="Bibliography"/>
@@ -12861,7 +13399,7 @@
       <w:r>
         <w:t xml:space="preserve"> </w:t>
       </w:r>
-      <w:hyperlink r:id="rId263">
+      <w:hyperlink r:id="rId275">
         <w:r>
           <w:rPr>
             <w:rStyle w:val="Hyperlink"/>
@@ -12870,8 +13408,8 @@
         </w:r>
       </w:hyperlink>
     </w:p>
-    <w:bookmarkEnd w:id="264"/>
-    <w:bookmarkStart w:id="265" w:name="ref-turnbull1965"/>
+    <w:bookmarkEnd w:id="276"/>
+    <w:bookmarkStart w:id="277" w:name="ref-turnbull1965"/>
     <w:p>
       <w:pPr>
         <w:pStyle w:val="Bibliography"/>
@@ -12896,8 +13434,8 @@
         <w:t xml:space="preserve">(First Edition). The Natural History Press.</w:t>
       </w:r>
     </w:p>
-    <w:bookmarkEnd w:id="265"/>
-    <w:bookmarkStart w:id="267" w:name="ref-wakano2007"/>
+    <w:bookmarkEnd w:id="277"/>
+    <w:bookmarkStart w:id="279" w:name="ref-wakano2007"/>
     <w:p>
       <w:pPr>
         <w:pStyle w:val="Bibliography"/>
@@ -12934,7 +13472,7 @@
       <w:r>
         <w:t xml:space="preserve"> </w:t>
       </w:r>
-      <w:hyperlink r:id="rId266">
+      <w:hyperlink r:id="rId278">
         <w:r>
           <w:rPr>
             <w:rStyle w:val="Hyperlink"/>
@@ -12943,8 +13481,8 @@
         </w:r>
       </w:hyperlink>
     </w:p>
-    <w:bookmarkEnd w:id="267"/>
-    <w:bookmarkStart w:id="269" w:name="ref-watson-franke1986"/>
+    <w:bookmarkEnd w:id="279"/>
+    <w:bookmarkStart w:id="281" w:name="ref-watson-franke1986"/>
     <w:p>
       <w:pPr>
         <w:pStyle w:val="Bibliography"/>
@@ -12981,7 +13519,7 @@
       <w:r>
         <w:t xml:space="preserve"> </w:t>
       </w:r>
-      <w:hyperlink r:id="rId268">
+      <w:hyperlink r:id="rId280">
         <w:r>
           <w:rPr>
             <w:rStyle w:val="Hyperlink"/>
@@ -12990,8 +13528,8 @@
         </w:r>
       </w:hyperlink>
     </w:p>
-    <w:bookmarkEnd w:id="269"/>
-    <w:bookmarkStart w:id="271" w:name="ref-weiner1976"/>
+    <w:bookmarkEnd w:id="281"/>
+    <w:bookmarkStart w:id="283" w:name="ref-weiner1976"/>
     <w:p>
       <w:pPr>
         <w:pStyle w:val="Bibliography"/>
@@ -13015,7 +13553,7 @@
       <w:r>
         <w:t xml:space="preserve"> </w:t>
       </w:r>
-      <w:hyperlink r:id="rId270">
+      <w:hyperlink r:id="rId282">
         <w:r>
           <w:rPr>
             <w:rStyle w:val="Hyperlink"/>
@@ -13024,8 +13562,8 @@
         </w:r>
       </w:hyperlink>
     </w:p>
-    <w:bookmarkEnd w:id="271"/>
-    <w:bookmarkStart w:id="272" w:name="ref-wenger1998"/>
+    <w:bookmarkEnd w:id="283"/>
+    <w:bookmarkStart w:id="284" w:name="ref-wenger1998"/>
     <w:p>
       <w:pPr>
         <w:pStyle w:val="Bibliography"/>
@@ -13047,8 +13585,8 @@
         <w:t xml:space="preserve">. Cambridge University Press.</w:t>
       </w:r>
     </w:p>
-    <w:bookmarkEnd w:id="272"/>
-    <w:bookmarkStart w:id="274" w:name="ref-wengrow2015"/>
+    <w:bookmarkEnd w:id="284"/>
+    <w:bookmarkStart w:id="286" w:name="ref-wengrow2015"/>
     <w:p>
       <w:pPr>
         <w:pStyle w:val="Bibliography"/>
@@ -13100,7 +13638,7 @@
       <w:r>
         <w:t xml:space="preserve"> </w:t>
       </w:r>
-      <w:hyperlink r:id="rId273">
+      <w:hyperlink r:id="rId285">
         <w:r>
           <w:rPr>
             <w:rStyle w:val="Hyperlink"/>
@@ -13109,8 +13647,8 @@
         </w:r>
       </w:hyperlink>
     </w:p>
-    <w:bookmarkEnd w:id="274"/>
-    <w:bookmarkStart w:id="276" w:name="ref-wilbert1976"/>
+    <w:bookmarkEnd w:id="286"/>
+    <w:bookmarkStart w:id="288" w:name="ref-wilbert1976"/>
     <w:p>
       <w:pPr>
         <w:pStyle w:val="Bibliography"/>
@@ -13212,7 +13750,7 @@
       <w:r>
         <w:t xml:space="preserve"> </w:t>
       </w:r>
-      <w:hyperlink r:id="rId275">
+      <w:hyperlink r:id="rId287">
         <w:r>
           <w:rPr>
             <w:rStyle w:val="Hyperlink"/>
@@ -13221,8 +13759,8 @@
         </w:r>
       </w:hyperlink>
     </w:p>
-    <w:bookmarkEnd w:id="276"/>
-    <w:bookmarkStart w:id="278" w:name="ref-wilbert1977"/>
+    <w:bookmarkEnd w:id="288"/>
+    <w:bookmarkStart w:id="290" w:name="ref-wilbert1977"/>
     <w:p>
       <w:pPr>
         <w:pStyle w:val="Bibliography"/>
@@ -13375,7 +13913,7 @@
       <w:r>
         <w:t xml:space="preserve"> </w:t>
       </w:r>
-      <w:hyperlink r:id="rId277">
+      <w:hyperlink r:id="rId289">
         <w:r>
           <w:rPr>
             <w:rStyle w:val="Hyperlink"/>
@@ -13384,8 +13922,8 @@
         </w:r>
       </w:hyperlink>
     </w:p>
-    <w:bookmarkEnd w:id="278"/>
-    <w:bookmarkStart w:id="279" w:name="ref-wilkinson1920"/>
+    <w:bookmarkEnd w:id="290"/>
+    <w:bookmarkStart w:id="291" w:name="ref-wilkinson1920"/>
     <w:p>
       <w:pPr>
         <w:pStyle w:val="Bibliography"/>
@@ -13410,8 +13948,8 @@
         <w:t xml:space="preserve">(Second edition). Kelly &amp; Walsh.</w:t>
       </w:r>
     </w:p>
-    <w:bookmarkEnd w:id="279"/>
-    <w:bookmarkStart w:id="281" w:name="ref-wilson2018"/>
+    <w:bookmarkEnd w:id="291"/>
+    <w:bookmarkStart w:id="293" w:name="ref-wilson2018"/>
     <w:p>
       <w:pPr>
         <w:pStyle w:val="Bibliography"/>
@@ -13448,7 +13986,7 @@
       <w:r>
         <w:t xml:space="preserve"> </w:t>
       </w:r>
-      <w:hyperlink r:id="rId280">
+      <w:hyperlink r:id="rId292">
         <w:r>
           <w:rPr>
             <w:rStyle w:val="Hyperlink"/>
@@ -13457,9 +13995,9 @@
         </w:r>
       </w:hyperlink>
     </w:p>
-    <w:bookmarkEnd w:id="281"/>
-    <w:bookmarkEnd w:id="282"/>
-    <w:bookmarkEnd w:id="283"/>
+    <w:bookmarkEnd w:id="293"/>
+    <w:bookmarkEnd w:id="294"/>
+    <w:bookmarkEnd w:id="295"/>
     <w:sectPr/>
   </w:body>
 </w:document>

</xml_diff>